<commit_message>
release: xuat lai DOCX/PDF/PPTX tu final_report.md da rut gon
- final_report.pdf: 25 trang A4 (truoc 26) — nam trong khoang muc tieu 15-25.
- Sinh tu Markdown bang 'py src\export_docs.py all'; so lieu lay tu artifact.
</commit_message>
<xml_diff>
--- a/release/final_report.docx
+++ b/release/final_report.docx
@@ -286,7 +286,7 @@
               <w:pStyle w:val="Compact"/>
             </w:pPr>
             <w:r>
-              <w:t xml:space="preserve">Đã chạy thật: 366 test pass, 0 fail; server</w:t>
+              <w:t xml:space="preserve">Đã chạy thật: 385 test pass, 0 fail; server</w:t>
             </w:r>
             <w:r>
               <w:t xml:space="preserve"> </w:t>
@@ -16782,7 +16782,7 @@
         <w:t xml:space="preserve"> </w:t>
       </w:r>
       <w:r>
-        <w:t xml:space="preserve">một benchmark đánh giá cả năm. Mọi kết luận về 2018 chỉ áp dụng cho</w:t>
+        <w:t xml:space="preserve">một benchmark đánh giá cả năm — mọi kết luận về 2018 chỉ áp dụng cho</w:t>
       </w:r>
       <w:r>
         <w:t xml:space="preserve"> </w:t>
@@ -17402,43 +17402,19 @@
         <w:t xml:space="preserve"> </w:t>
       </w:r>
       <w:r>
-        <w:t xml:space="preserve">trong khi mỗi ngày lễ một kiểu (State Fair khác hẳn ngày lễ liên bang). Ở</w:t>
-      </w:r>
-      <w:r>
-        <w:t xml:space="preserve"> </w:t>
-      </w:r>
-      <w:r>
-        <w:rPr>
-          <w:b/>
-          <w:bCs/>
-        </w:rPr>
-        <w:t xml:space="preserve">State Fair</w:t>
-      </w:r>
-      <w:r>
-        <w:rPr>
-          <w:b/>
-          <w:bCs/>
-        </w:rPr>
-        <w:t xml:space="preserve"> </w:t>
-      </w:r>
-      <w:r>
-        <w:rPr>
-          <w:b/>
-          <w:bCs/>
-        </w:rPr>
-        <w:t xml:space="preserve">(2018-08-23)</w:t>
-      </w:r>
-      <w:r>
-        <w:t xml:space="preserve"> </w:t>
-      </w:r>
-      <w:r>
-        <w:t xml:space="preserve">baseline tốt hơn Ridge rất nhiều (258,48 so với 985,11) — chỉ một trong 7 ngày, nhưng</w:t>
-      </w:r>
-      <w:r>
-        <w:t xml:space="preserve"> </w:t>
-      </w:r>
-      <w:r>
-        <w:t xml:space="preserve">đủ để thấy mô hình xử lý ngày lễ</w:t>
+        <w:t xml:space="preserve">trong khi mỗi ngày lễ một kiểu (State Fair khác hẳn ngày lễ liên bang) — ở State Fair</w:t>
+      </w:r>
+      <w:r>
+        <w:t xml:space="preserve"> </w:t>
+      </w:r>
+      <w:r>
+        <w:t xml:space="preserve">(2018-08-23) baseline tốt hơn Ridge rất nhiều (258,48 so với 985,11), đủ để thấy mô hình xử lý</w:t>
+      </w:r>
+      <w:r>
+        <w:t xml:space="preserve"> </w:t>
+      </w:r>
+      <w:r>
+        <w:t xml:space="preserve">ngày lễ</w:t>
       </w:r>
       <w:r>
         <w:t xml:space="preserve"> </w:t>
@@ -22744,7 +22720,7 @@
     </w:p>
     <w:bookmarkEnd w:id="94"/>
     <w:bookmarkEnd w:id="95"/>
-    <w:bookmarkStart w:id="108" w:name="X923ed692b556b25f23fa302ee5f7131fde6843e"/>
+    <w:bookmarkStart w:id="109" w:name="X923ed692b556b25f23fa302ee5f7131fde6843e"/>
     <w:p>
       <w:pPr>
         <w:pStyle w:val="Heading1"/>
@@ -23958,7 +23934,7 @@
         <w:t xml:space="preserve">GET /api/model-info</w:t>
       </w:r>
       <w:r>
-        <w:t xml:space="preserve">. Có test</w:t>
+        <w:t xml:space="preserve">. Test</w:t>
       </w:r>
       <w:r>
         <w:t xml:space="preserve"> </w:t>
@@ -23973,13 +23949,13 @@
         <w:t xml:space="preserve"> </w:t>
       </w:r>
       <w:r>
-        <w:t xml:space="preserve">quét từng file frontend và đối chiếu với giá trị</w:t>
-      </w:r>
-      <w:r>
-        <w:t xml:space="preserve"> </w:t>
-      </w:r>
-      <w:r>
-        <w:t xml:space="preserve">trong artifact để bảo đảm điều này không thoát.</w:t>
+        <w:t xml:space="preserve">quét từng file frontend và đối chiếu với</w:t>
+      </w:r>
+      <w:r>
+        <w:t xml:space="preserve"> </w:t>
+      </w:r>
+      <w:r>
+        <w:t xml:space="preserve">artifact để bảo đảm điều này không thoát.</w:t>
       </w:r>
     </w:p>
     <w:bookmarkEnd w:id="98"/>
@@ -24659,7 +24635,7 @@
       </w:r>
     </w:p>
     <w:bookmarkEnd w:id="99"/>
-    <w:bookmarkStart w:id="106" w:name="X229873d7c73bd506cfbc5de39da92f46e030625"/>
+    <w:bookmarkStart w:id="107" w:name="X229873d7c73bd506cfbc5de39da92f46e030625"/>
     <w:p>
       <w:pPr>
         <w:pStyle w:val="Heading2"/>
@@ -24689,21 +24665,13 @@
         <w:t xml:space="preserve"> </w:t>
       </w:r>
       <w:r>
-        <w:t xml:space="preserve">trả giá trị âm. Lưu lượng xe không thể âm.</w:t>
-      </w:r>
-      <w:r>
-        <w:t xml:space="preserve"> </w:t>
-      </w:r>
-      <w:r>
-        <w:t xml:space="preserve">Câu hỏi phương pháp: tầng phục vụ có được phép cắt dự báo âm về 0 không?</w:t>
-      </w:r>
-    </w:p>
-    <w:p>
-      <w:pPr>
-        <w:pStyle w:val="BodyText"/>
-      </w:pPr>
-      <w:r>
-        <w:t xml:space="preserve">Đây là quyết định dễ sinh</w:t>
+        <w:t xml:space="preserve">trả giá trị âm. Lưu lượng xe không thể âm — nhưng đây là</w:t>
+      </w:r>
+      <w:r>
+        <w:t xml:space="preserve"> </w:t>
+      </w:r>
+      <w:r>
+        <w:t xml:space="preserve">quyết định dễ sinh</w:t>
       </w:r>
       <w:r>
         <w:t xml:space="preserve"> </w:t>
@@ -24716,32 +24684,43 @@
         <w:t xml:space="preserve">test-informed postprocessing</w:t>
       </w:r>
       <w:r>
-        <w:t xml:space="preserve">: nếu ta nhìn FINAL TEST 2018 thấy</w:t>
-      </w:r>
-      <w:r>
-        <w:t xml:space="preserve"> </w:t>
-      </w:r>
-      <w:r>
-        <w:t xml:space="preserve">"cắt đi, MAE đẹp hơn" rồi mới quyết định cắt, thì kết luận 2018 mất ý nghĩa. Nhóm xử lý</w:t>
-      </w:r>
-      <w:r>
-        <w:t xml:space="preserve"> </w:t>
-      </w:r>
-      <w:r>
-        <w:t xml:space="preserve">bằng cách</w:t>
-      </w:r>
-      <w:r>
-        <w:t xml:space="preserve"> </w:t>
-      </w:r>
-      <w:r>
-        <w:rPr>
-          <w:b/>
-          <w:bCs/>
-        </w:rPr>
-        <w:t xml:space="preserve">tách quyết định khỏi đo lường</w:t>
-      </w:r>
-      <w:r>
-        <w:t xml:space="preserve">, và đóng băng quyết định trước.</w:t>
+        <w:t xml:space="preserve">: nếu nhìn FINAL TEST 2018 thấy "cắt đi, MAE đẹp</w:t>
+      </w:r>
+      <w:r>
+        <w:t xml:space="preserve"> </w:t>
+      </w:r>
+      <w:r>
+        <w:t xml:space="preserve">hơn" rồi mới quyết định cắt, thì kết luận 2018 mất ý nghĩa. Nhóm</w:t>
+      </w:r>
+      <w:r>
+        <w:t xml:space="preserve"> </w:t>
+      </w:r>
+      <w:r>
+        <w:rPr>
+          <w:b/>
+          <w:bCs/>
+        </w:rPr>
+        <w:t xml:space="preserve">tách quyết định khỏi đo</w:t>
+      </w:r>
+      <w:r>
+        <w:rPr>
+          <w:b/>
+          <w:bCs/>
+        </w:rPr>
+        <w:t xml:space="preserve"> </w:t>
+      </w:r>
+      <w:r>
+        <w:rPr>
+          <w:b/>
+          <w:bCs/>
+        </w:rPr>
+        <w:t xml:space="preserve">lường</w:t>
+      </w:r>
+      <w:r>
+        <w:t xml:space="preserve"> </w:t>
+      </w:r>
+      <w:r>
+        <w:t xml:space="preserve">và đóng băng quyết định trước.</w:t>
       </w:r>
     </w:p>
     <w:bookmarkStart w:id="100" w:name="X7148e7eb759061f1b2193c97c5a0ace545f72ad"/>
@@ -25391,7 +25370,7 @@
         <w:t xml:space="preserve"> </w:t>
       </w:r>
       <w:r>
-        <w:t xml:space="preserve">đã nhìn thấy kết quả 2018, và FINAL TEST không còn là tập đánh giá độc lập nữu. Chính</w:t>
+        <w:t xml:space="preserve">đã nhìn thấy kết quả 2018, và FINAL TEST không còn là tập đánh giá độc lập nữa. Chính</w:t>
       </w:r>
       <w:r>
         <w:t xml:space="preserve"> </w:t>
@@ -25412,6 +25391,21 @@
         <w:t xml:space="preserve"> </w:t>
       </w:r>
       <w:r>
+        <w:t xml:space="preserve">và</w:t>
+      </w:r>
+      <w:r>
+        <w:t xml:space="preserve"> </w:t>
+      </w:r>
+      <w:r>
+        <w:rPr>
+          <w:rStyle w:val="VerbatimChar"/>
+        </w:rPr>
+        <w:t xml:space="preserve">uncertainty_audit.py</w:t>
+      </w:r>
+      <w:r>
+        <w:t xml:space="preserve"> </w:t>
+      </w:r>
+      <w:r>
         <w:rPr>
           <w:b/>
           <w:bCs/>
@@ -25422,13 +25416,13 @@
         <w:t xml:space="preserve"> </w:t>
       </w:r>
       <w:r>
-        <w:t xml:space="preserve">nếu chưa có policy đã đóng băng hoặc nếu artifact tự</w:t>
-      </w:r>
-      <w:r>
-        <w:t xml:space="preserve"> </w:t>
-      </w:r>
-      <w:r>
-        <w:t xml:space="preserve">ghi</w:t>
+        <w:t xml:space="preserve">nếu chưa có policy đã đóng</w:t>
+      </w:r>
+      <w:r>
+        <w:t xml:space="preserve"> </w:t>
+      </w:r>
+      <w:r>
+        <w:t xml:space="preserve">băng, hoặc nếu artifact tự ghi</w:t>
       </w:r>
       <w:r>
         <w:t xml:space="preserve"> </w:t>
@@ -25455,7 +25449,7 @@
         <w:t xml:space="preserve">False</w:t>
       </w:r>
       <w:r>
-        <w:t xml:space="preserve">;</w:t>
+        <w:t xml:space="preserve">. Có test</w:t>
       </w:r>
       <w:r>
         <w:t xml:space="preserve"> </w:t>
@@ -25464,19 +25458,13 @@
         <w:rPr>
           <w:rStyle w:val="VerbatimChar"/>
         </w:rPr>
-        <w:t xml:space="preserve">uncertainty_audit.py</w:t>
-      </w:r>
-      <w:r>
-        <w:t xml:space="preserve"> </w:t>
-      </w:r>
-      <w:r>
-        <w:t xml:space="preserve">cũng từ chối chạy theo cùng</w:t>
-      </w:r>
-      <w:r>
-        <w:t xml:space="preserve"> </w:t>
-      </w:r>
-      <w:r>
-        <w:t xml:space="preserve">điều kiện. Ngoài ra có test</w:t>
+        <w:t xml:space="preserve">test_freeze_script_source_never_reads_final_test</w:t>
+      </w:r>
+      <w:r>
+        <w:t xml:space="preserve"> </w:t>
+      </w:r>
+      <w:r>
+        <w:t xml:space="preserve">kiểm tra ở mức mã nguồn rằng</w:t>
       </w:r>
       <w:r>
         <w:t xml:space="preserve"> </w:t>
@@ -25485,19 +25473,13 @@
         <w:rPr>
           <w:rStyle w:val="VerbatimChar"/>
         </w:rPr>
-        <w:t xml:space="preserve">test_freeze_script_source_never_reads_final_test</w:t>
-      </w:r>
-      <w:r>
-        <w:t xml:space="preserve"> </w:t>
-      </w:r>
-      <w:r>
-        <w:t xml:space="preserve">kiểm tra ở mức mã</w:t>
-      </w:r>
-      <w:r>
-        <w:t xml:space="preserve"> </w:t>
-      </w:r>
-      <w:r>
-        <w:t xml:space="preserve">nguồn rằng</w:t>
+        <w:t xml:space="preserve">build_policy()</w:t>
+      </w:r>
+      <w:r>
+        <w:t xml:space="preserve"> </w:t>
+      </w:r>
+      <w:r>
+        <w:t xml:space="preserve">chỉ gọi bằng chứng cho</w:t>
       </w:r>
       <w:r>
         <w:t xml:space="preserve"> </w:t>
@@ -25506,13 +25488,159 @@
         <w:rPr>
           <w:rStyle w:val="VerbatimChar"/>
         </w:rPr>
+        <w:t xml:space="preserve">train</w:t>
+      </w:r>
+      <w:r>
+        <w:t xml:space="preserve"> </w:t>
+      </w:r>
+      <w:r>
+        <w:t xml:space="preserve">và</w:t>
+      </w:r>
+      <w:r>
+        <w:t xml:space="preserve"> </w:t>
+      </w:r>
+      <w:r>
+        <w:rPr>
+          <w:rStyle w:val="VerbatimChar"/>
+        </w:rPr>
+        <w:t xml:space="preserve">validation</w:t>
+      </w:r>
+      <w:r>
+        <w:t xml:space="preserve">, và</w:t>
+      </w:r>
+      <w:r>
+        <w:t xml:space="preserve"> </w:t>
+      </w:r>
+      <w:r>
+        <w:rPr>
+          <w:rStyle w:val="VerbatimChar"/>
+        </w:rPr>
+        <w:t xml:space="preserve">test_pipeline_order_freezes_policy_before_final_test</w:t>
+      </w:r>
+      <w:r>
+        <w:t xml:space="preserve"> </w:t>
+      </w:r>
+      <w:r>
+        <w:t xml:space="preserve">kiểm tra mọi tài liệu bàn giao đều mô tả</w:t>
+      </w:r>
+      <w:r>
+        <w:t xml:space="preserve"> </w:t>
+      </w:r>
+      <w:r>
+        <w:t xml:space="preserve">đúng thứ tự này.</w:t>
+      </w:r>
+    </w:p>
+    <w:bookmarkEnd w:id="100"/>
+    <w:bookmarkStart w:id="101" w:name="X935b205844204b01a5e2a64e05c805379de1dc9"/>
+    <w:p>
+      <w:pPr>
+        <w:pStyle w:val="Heading3"/>
+      </w:pPr>
+      <w:r>
+        <w:t xml:space="preserve">12.5.2b Đóng băng phải chạy lại được (idempotent)</w:t>
+      </w:r>
+    </w:p>
+    <w:p>
+      <w:pPr>
+        <w:pStyle w:val="FirstParagraph"/>
+      </w:pPr>
+      <w:r>
+        <w:t xml:space="preserve">"Đóng băng" chỉ có ý nghĩa nếu quyết định được ghi</w:t>
+      </w:r>
+      <w:r>
+        <w:t xml:space="preserve"> </w:t>
+      </w:r>
+      <w:r>
+        <w:rPr>
+          <w:b/>
+          <w:bCs/>
+        </w:rPr>
+        <w:t xml:space="preserve">một lần</w:t>
+      </w:r>
+      <w:r>
+        <w:t xml:space="preserve">. Ban đầu script ghi</w:t>
+      </w:r>
+      <w:r>
+        <w:t xml:space="preserve"> </w:t>
+      </w:r>
+      <w:r>
+        <w:rPr>
+          <w:rStyle w:val="VerbatimChar"/>
+        </w:rPr>
+        <w:t xml:space="preserve">frozen_at_utc = datetime.now(...)</w:t>
+      </w:r>
+      <w:r>
+        <w:t xml:space="preserve"> </w:t>
+      </w:r>
+      <w:r>
+        <w:t xml:space="preserve">ở mỗi lần chạy, nên</w:t>
+      </w:r>
+      <w:r>
+        <w:t xml:space="preserve"> </w:t>
+      </w:r>
+      <w:r>
+        <w:rPr>
+          <w:rStyle w:val="VerbatimChar"/>
+        </w:rPr>
+        <w:t xml:space="preserve">serving_policy.json</w:t>
+      </w:r>
+      <w:r>
+        <w:t xml:space="preserve"> </w:t>
+      </w:r>
+      <w:r>
+        <w:rPr>
+          <w:b/>
+          <w:bCs/>
+        </w:rPr>
+        <w:t xml:space="preserve">đổi hash dù quyết</w:t>
+      </w:r>
+      <w:r>
+        <w:rPr>
+          <w:b/>
+          <w:bCs/>
+        </w:rPr>
+        <w:t xml:space="preserve"> </w:t>
+      </w:r>
+      <w:r>
+        <w:rPr>
+          <w:b/>
+          <w:bCs/>
+        </w:rPr>
+        <w:t xml:space="preserve">định không đổi</w:t>
+      </w:r>
+      <w:r>
+        <w:t xml:space="preserve">. Nay</w:t>
+      </w:r>
+      <w:r>
+        <w:t xml:space="preserve"> </w:t>
+      </w:r>
+      <w:r>
+        <w:rPr>
+          <w:rStyle w:val="VerbatimChar"/>
+        </w:rPr>
         <w:t xml:space="preserve">build_policy()</w:t>
       </w:r>
       <w:r>
         <w:t xml:space="preserve"> </w:t>
       </w:r>
       <w:r>
-        <w:t xml:space="preserve">chỉ gọi bằng chứng cho</w:t>
+        <w:t xml:space="preserve">trả về</w:t>
+      </w:r>
+      <w:r>
+        <w:t xml:space="preserve"> </w:t>
+      </w:r>
+      <w:r>
+        <w:rPr>
+          <w:b/>
+          <w:bCs/>
+        </w:rPr>
+        <w:t xml:space="preserve">nội dung</w:t>
+      </w:r>
+      <w:r>
+        <w:t xml:space="preserve"> </w:t>
+      </w:r>
+      <w:r>
+        <w:t xml:space="preserve">quyết định (trừ</w:t>
       </w:r>
       <w:r>
         <w:t xml:space="preserve"> </w:t>
@@ -25521,13 +25649,29 @@
         <w:rPr>
           <w:rStyle w:val="VerbatimChar"/>
         </w:rPr>
-        <w:t xml:space="preserve">train</w:t>
-      </w:r>
-      <w:r>
-        <w:t xml:space="preserve"> </w:t>
-      </w:r>
-      <w:r>
-        <w:t xml:space="preserve">và</w:t>
+        <w:t xml:space="preserve">frozen_at_utc</w:t>
+      </w:r>
+      <w:r>
+        <w:t xml:space="preserve">), nên kết</w:t>
+      </w:r>
+      <w:r>
+        <w:t xml:space="preserve"> </w:t>
+      </w:r>
+      <w:r>
+        <w:t xml:space="preserve">quả là hằng số: khớp thì</w:t>
+      </w:r>
+      <w:r>
+        <w:t xml:space="preserve"> </w:t>
+      </w:r>
+      <w:r>
+        <w:rPr>
+          <w:b/>
+          <w:bCs/>
+        </w:rPr>
+        <w:t xml:space="preserve">không ghi lại file</w:t>
+      </w:r>
+      <w:r>
+        <w:t xml:space="preserve">; lệch thì in diff và dừng (exit ≠ 0) trừ khi có</w:t>
       </w:r>
       <w:r>
         <w:t xml:space="preserve"> </w:t>
@@ -25536,10 +25680,10 @@
         <w:rPr>
           <w:rStyle w:val="VerbatimChar"/>
         </w:rPr>
-        <w:t xml:space="preserve">validation</w:t>
-      </w:r>
-      <w:r>
-        <w:t xml:space="preserve">, và</w:t>
+        <w:t xml:space="preserve">--force</w:t>
+      </w:r>
+      <w:r>
+        <w:t xml:space="preserve">.</w:t>
       </w:r>
       <w:r>
         <w:t xml:space="preserve"> </w:t>
@@ -25548,23 +25692,30 @@
         <w:rPr>
           <w:rStyle w:val="VerbatimChar"/>
         </w:rPr>
-        <w:t xml:space="preserve">tests/test_report.py::test_pipeline_order_freezes_policy_before_final_test</w:t>
-      </w:r>
-      <w:r>
-        <w:t xml:space="preserve"> </w:t>
-      </w:r>
-      <w:r>
-        <w:t xml:space="preserve">kiểm tra mọi tài liệu</w:t>
-      </w:r>
-      <w:r>
-        <w:t xml:space="preserve"> </w:t>
-      </w:r>
-      <w:r>
-        <w:t xml:space="preserve">bàn giao đều mô tả đúng thứ tự này.</w:t>
-      </w:r>
-    </w:p>
-    <w:bookmarkEnd w:id="100"/>
-    <w:bookmarkStart w:id="101" w:name="Xa25338e2e370f5c49d634bb298396c4463636c9"/>
+        <w:t xml:space="preserve">--check</w:t>
+      </w:r>
+      <w:r>
+        <w:t xml:space="preserve"> </w:t>
+      </w:r>
+      <w:r>
+        <w:t xml:space="preserve">chỉ tính lại rồi so sánh,</w:t>
+      </w:r>
+      <w:r>
+        <w:t xml:space="preserve"> </w:t>
+      </w:r>
+      <w:r>
+        <w:rPr>
+          <w:b/>
+          <w:bCs/>
+        </w:rPr>
+        <w:t xml:space="preserve">không ghi file nào</w:t>
+      </w:r>
+      <w:r>
+        <w:t xml:space="preserve">. Chi tiết ở README.</w:t>
+      </w:r>
+    </w:p>
+    <w:bookmarkEnd w:id="101"/>
+    <w:bookmarkStart w:id="102" w:name="Xa25338e2e370f5c49d634bb298396c4463636c9"/>
     <w:p>
       <w:pPr>
         <w:pStyle w:val="Heading3"/>
@@ -25898,8 +26049,8 @@
         <w:t xml:space="preserve">).</w:t>
       </w:r>
     </w:p>
-    <w:bookmarkEnd w:id="101"/>
-    <w:bookmarkStart w:id="102" w:name="X04f809ed0b6d9611c386aade382bd977f60b295"/>
+    <w:bookmarkEnd w:id="102"/>
+    <w:bookmarkStart w:id="103" w:name="X04f809ed0b6d9611c386aade382bd977f60b295"/>
     <w:p>
       <w:pPr>
         <w:pStyle w:val="Heading3"/>
@@ -26281,8 +26432,8 @@
         <w:t xml:space="preserve">0 là sửa sai lệch của mô hình, không phải xoá sự thật.</w:t>
       </w:r>
     </w:p>
-    <w:bookmarkEnd w:id="102"/>
-    <w:bookmarkStart w:id="103" w:name="Xa80cef9c7b1b19b333f7cba984fa946aa7f1dc7"/>
+    <w:bookmarkEnd w:id="103"/>
+    <w:bookmarkStart w:id="104" w:name="Xa80cef9c7b1b19b333f7cba984fa946aa7f1dc7"/>
     <w:p>
       <w:pPr>
         <w:pStyle w:val="Heading3"/>
@@ -26485,8 +26636,8 @@
         <w:t xml:space="preserve">liệu, nên không vi phạm nguyên tắc "không học gì từ tập test".</w:t>
       </w:r>
     </w:p>
-    <w:bookmarkEnd w:id="103"/>
-    <w:bookmarkStart w:id="104" w:name="X42a8e493e3a121879784cf864891ccb8cebcef1"/>
+    <w:bookmarkEnd w:id="104"/>
+    <w:bookmarkStart w:id="105" w:name="X42a8e493e3a121879784cf864891ccb8cebcef1"/>
     <w:p>
       <w:pPr>
         <w:pStyle w:val="Heading3"/>
@@ -26838,8 +26989,8 @@
         <w:t xml:space="preserve">§10.3: mô hình chưa học được việc lưu lượng đêm ngày lễ gần bằng 0.</w:t>
       </w:r>
     </w:p>
-    <w:bookmarkEnd w:id="104"/>
-    <w:bookmarkStart w:id="105" w:name="X1d5585f166bfbb1d17107ebfad4ef368322d3fb"/>
+    <w:bookmarkEnd w:id="105"/>
+    <w:bookmarkStart w:id="106" w:name="X1d5585f166bfbb1d17107ebfad4ef368322d3fb"/>
     <w:p>
       <w:pPr>
         <w:pStyle w:val="Heading3"/>
@@ -27004,9 +27155,9 @@
         <w:t xml:space="preserve">giá đã đóng băng để khớp API — làm vậy tức là dùng kết quả 2018 để điều chỉnh mô hình.</w:t>
       </w:r>
     </w:p>
-    <w:bookmarkEnd w:id="105"/>
     <w:bookmarkEnd w:id="106"/>
-    <w:bookmarkStart w:id="107" w:name="X6ee6a873b9edf02ee27088a80b10002775f74c9"/>
+    <w:bookmarkEnd w:id="107"/>
+    <w:bookmarkStart w:id="108" w:name="X6ee6a873b9edf02ee27088a80b10002775f74c9"/>
     <w:p>
       <w:pPr>
         <w:pStyle w:val="Heading2"/>
@@ -27234,9 +27385,9 @@
         </w:pict>
       </w:r>
     </w:p>
-    <w:bookmarkEnd w:id="107"/>
     <w:bookmarkEnd w:id="108"/>
-    <w:bookmarkStart w:id="111" w:name="X53cef0c72755ded06eccfa605ea778aef4fb51f"/>
+    <w:bookmarkEnd w:id="109"/>
+    <w:bookmarkStart w:id="112" w:name="X53cef0c72755ded06eccfa605ea778aef4fb51f"/>
     <w:p>
       <w:pPr>
         <w:pStyle w:val="Heading1"/>
@@ -27283,7 +27434,7 @@
           <w:b/>
           <w:bCs/>
         </w:rPr>
-        <w:t xml:space="preserve">→ 366 passed, 0 failed.</w:t>
+        <w:t xml:space="preserve">→ 385 passed, 0 failed.</w:t>
       </w:r>
     </w:p>
     <w:tbl>
@@ -27655,18 +27806,58 @@
               <w:pStyle w:val="Compact"/>
             </w:pPr>
             <w:r>
-              <w:t xml:space="preserve">27</w:t>
-            </w:r>
-          </w:p>
-        </w:tc>
-        <w:tc>
-          <w:tcPr/>
-          <w:p>
-            <w:pPr>
-              <w:pStyle w:val="Compact"/>
-            </w:pPr>
-            <w:r>
-              <w:t xml:space="preserve">Policy không test-informed, điều kiện D1–D3, phân biệt RAW MODEL vs DEPLOYED PREDICTOR</w:t>
+              <w:t xml:space="preserve">46</w:t>
+            </w:r>
+          </w:p>
+        </w:tc>
+        <w:tc>
+          <w:tcPr/>
+          <w:p>
+            <w:pPr>
+              <w:pStyle w:val="Compact"/>
+            </w:pPr>
+            <w:r>
+              <w:t xml:space="preserve">Policy không test-informed, điều kiện D1–D3, phân biệt RAW MODEL vs DEPLOYED PREDICTOR,</w:t>
+            </w:r>
+            <w:r>
+              <w:t xml:space="preserve"> </w:t>
+            </w:r>
+            <w:r>
+              <w:rPr>
+                <w:b/>
+                <w:bCs/>
+              </w:rPr>
+              <w:t xml:space="preserve">đóng băng lặp lại được</w:t>
+            </w:r>
+            <w:r>
+              <w:t xml:space="preserve"> </w:t>
+            </w:r>
+            <w:r>
+              <w:t xml:space="preserve">(</w:t>
+            </w:r>
+            <w:r>
+              <w:rPr>
+                <w:rStyle w:val="VerbatimChar"/>
+              </w:rPr>
+              <w:t xml:space="preserve">--check</w:t>
+            </w:r>
+            <w:r>
+              <w:t xml:space="preserve"> </w:t>
+            </w:r>
+            <w:r>
+              <w:t xml:space="preserve">/</w:t>
+            </w:r>
+            <w:r>
+              <w:t xml:space="preserve"> </w:t>
+            </w:r>
+            <w:r>
+              <w:rPr>
+                <w:rStyle w:val="VerbatimChar"/>
+              </w:rPr>
+              <w:t xml:space="preserve">--force</w:t>
+            </w:r>
+            <w:r>
+              <w:t xml:space="preserve">)</w:t>
             </w:r>
           </w:p>
         </w:tc>
@@ -27774,7 +27965,7 @@
                 <w:b/>
                 <w:bCs/>
               </w:rPr>
-              <w:t xml:space="preserve">366</w:t>
+              <w:t xml:space="preserve">385</w:t>
             </w:r>
           </w:p>
         </w:tc>
@@ -27855,7 +28046,7 @@
         <w:t xml:space="preserve">không thể lọt.</w:t>
       </w:r>
     </w:p>
-    <w:bookmarkStart w:id="109" w:name="Xc05d1c0eeaa74dc6908c302258e0d3c31e17ad4"/>
+    <w:bookmarkStart w:id="110" w:name="Xc05d1c0eeaa74dc6908c302258e0d3c31e17ad4"/>
     <w:p>
       <w:pPr>
         <w:pStyle w:val="Heading2"/>
@@ -28144,8 +28335,8 @@
         </w:tc>
       </w:tr>
     </w:tbl>
-    <w:bookmarkEnd w:id="109"/>
-    <w:bookmarkStart w:id="110" w:name="Xb91b3854d430ce914488ce4c1fb3ac9ac7890ec"/>
+    <w:bookmarkEnd w:id="110"/>
+    <w:bookmarkStart w:id="111" w:name="Xb91b3854d430ce914488ce4c1fb3ac9ac7890ec"/>
     <w:p>
       <w:pPr>
         <w:pStyle w:val="Heading2"/>
@@ -28207,9 +28398,9 @@
         </w:pict>
       </w:r>
     </w:p>
-    <w:bookmarkEnd w:id="110"/>
     <w:bookmarkEnd w:id="111"/>
-    <w:bookmarkStart w:id="122" w:name="Xdad156229c53f75b320b788077bd8a86ade1b22"/>
+    <w:bookmarkEnd w:id="112"/>
+    <w:bookmarkStart w:id="123" w:name="Xdad156229c53f75b320b788077bd8a86ade1b22"/>
     <w:p>
       <w:pPr>
         <w:pStyle w:val="Heading1"/>
@@ -28218,7 +28409,7 @@
         <w:t xml:space="preserve">14. Model Card</w:t>
       </w:r>
     </w:p>
-    <w:bookmarkStart w:id="112" w:name="Xe42ef70e1d4c8c57c8a7f436dad24f87fbf5d28"/>
+    <w:bookmarkStart w:id="113" w:name="Xe42ef70e1d4c8c57c8a7f436dad24f87fbf5d28"/>
     <w:p>
       <w:pPr>
         <w:pStyle w:val="Heading2"/>
@@ -28556,8 +28747,8 @@
         </w:tc>
       </w:tr>
     </w:tbl>
-    <w:bookmarkEnd w:id="112"/>
-    <w:bookmarkStart w:id="113" w:name="X7b06c12df664a7fc4092dbdbf73ce7ec8bc05e2"/>
+    <w:bookmarkEnd w:id="113"/>
+    <w:bookmarkStart w:id="114" w:name="X7b06c12df664a7fc4092dbdbf73ce7ec8bc05e2"/>
     <w:p>
       <w:pPr>
         <w:pStyle w:val="Heading2"/>
@@ -28766,8 +28957,8 @@
         </w:tc>
       </w:tr>
     </w:tbl>
-    <w:bookmarkEnd w:id="113"/>
-    <w:bookmarkStart w:id="114" w:name="X6adb888e2576849c3c8b6c0eac84dee616b3b4c"/>
+    <w:bookmarkEnd w:id="114"/>
+    <w:bookmarkStart w:id="115" w:name="X6adb888e2576849c3c8b6c0eac84dee616b3b4c"/>
     <w:p>
       <w:pPr>
         <w:pStyle w:val="Heading2"/>
@@ -28931,8 +29122,8 @@
         </w:tc>
       </w:tr>
     </w:tbl>
-    <w:bookmarkEnd w:id="114"/>
-    <w:bookmarkStart w:id="115" w:name="Xbdfb83c0cffde6186a83f10788f36ddbdee6b36"/>
+    <w:bookmarkEnd w:id="115"/>
+    <w:bookmarkStart w:id="116" w:name="Xbdfb83c0cffde6186a83f10788f36ddbdee6b36"/>
     <w:p>
       <w:pPr>
         <w:pStyle w:val="Heading2"/>
@@ -29096,8 +29287,8 @@
         <w:t xml:space="preserve">trưng lag (xem §11.6).</w:t>
       </w:r>
     </w:p>
-    <w:bookmarkEnd w:id="115"/>
-    <w:bookmarkStart w:id="116" w:name="Xe09053a4b15961d792bf4e2a1366cfe6b0be545"/>
+    <w:bookmarkEnd w:id="116"/>
+    <w:bookmarkStart w:id="117" w:name="Xe09053a4b15961d792bf4e2a1366cfe6b0be545"/>
     <w:p>
       <w:pPr>
         <w:pStyle w:val="Heading2"/>
@@ -29839,8 +30030,8 @@
         </w:tc>
       </w:tr>
     </w:tbl>
-    <w:bookmarkEnd w:id="116"/>
-    <w:bookmarkStart w:id="117" w:name="Xb4b017eff690ec81289855a6f366e3e2cd31006"/>
+    <w:bookmarkEnd w:id="117"/>
+    <w:bookmarkStart w:id="118" w:name="Xb4b017eff690ec81289855a6f366e3e2cd31006"/>
     <w:p>
       <w:pPr>
         <w:pStyle w:val="Heading2"/>
@@ -29885,8 +30076,8 @@
         <w:t xml:space="preserve">Minh hoạ giá trị của chia tập theo thời gian và đánh giá trung thực trên bài toán chuỗi thời gian thực tế.</w:t>
       </w:r>
     </w:p>
-    <w:bookmarkEnd w:id="117"/>
-    <w:bookmarkStart w:id="118" w:name="X080e680f55be20fb44d6215757e74b24bb06c53"/>
+    <w:bookmarkEnd w:id="118"/>
+    <w:bookmarkStart w:id="119" w:name="X080e680f55be20fb44d6215757e74b24bb06c53"/>
     <w:p>
       <w:pPr>
         <w:pStyle w:val="Heading2"/>
@@ -29950,8 +30141,8 @@
         <w:t xml:space="preserve">Dùng như số liệu thống kê chính thức của cơ quan quản lý giao thông.</w:t>
       </w:r>
     </w:p>
-    <w:bookmarkEnd w:id="118"/>
-    <w:bookmarkStart w:id="119" w:name="Xcd3ad135c6e1fbf77091284952a3eb031c97455"/>
+    <w:bookmarkEnd w:id="119"/>
+    <w:bookmarkStart w:id="120" w:name="Xcd3ad135c6e1fbf77091284952a3eb031c97455"/>
     <w:p>
       <w:pPr>
         <w:pStyle w:val="Heading2"/>
@@ -30585,8 +30776,8 @@
         <w:t xml:space="preserve">vì FINAL TEST đã bị xem — đổi bây giờ là test-informed model selection.</w:t>
       </w:r>
     </w:p>
-    <w:bookmarkEnd w:id="119"/>
-    <w:bookmarkStart w:id="120" w:name="X24911cc652e48ef06c72a054df9c3d8a7ddfad4"/>
+    <w:bookmarkEnd w:id="120"/>
+    <w:bookmarkStart w:id="121" w:name="X24911cc652e48ef06c72a054df9c3d8a7ddfad4"/>
     <w:p>
       <w:pPr>
         <w:pStyle w:val="Heading2"/>
@@ -30842,8 +31033,8 @@
         <w:t xml:space="preserve">và negative prediction thành limitation.</w:t>
       </w:r>
     </w:p>
-    <w:bookmarkEnd w:id="120"/>
-    <w:bookmarkStart w:id="121" w:name="X8878001a0a13f457750e2973035e19caa739d55"/>
+    <w:bookmarkEnd w:id="121"/>
+    <w:bookmarkStart w:id="122" w:name="X8878001a0a13f457750e2973035e19caa739d55"/>
     <w:p>
       <w:pPr>
         <w:pStyle w:val="Heading2"/>
@@ -30947,7 +31138,7 @@
         <w:t xml:space="preserve"> </w:t>
       </w:r>
       <w:r>
-        <w:t xml:space="preserve">— 366 test (</w:t>
+        <w:t xml:space="preserve">— 385 test (</w:t>
       </w:r>
       <w:r>
         <w:rPr>
@@ -31027,9 +31218,9 @@
         </w:pict>
       </w:r>
     </w:p>
-    <w:bookmarkEnd w:id="121"/>
     <w:bookmarkEnd w:id="122"/>
-    <w:bookmarkStart w:id="123" w:name="Xea1ab71867dca1be6a495e6ec8d8d7ee4bb7cc1"/>
+    <w:bookmarkEnd w:id="123"/>
+    <w:bookmarkStart w:id="124" w:name="Xea1ab71867dca1be6a495e6ec8d8d7ee4bb7cc1"/>
     <w:p>
       <w:pPr>
         <w:pStyle w:val="Heading1"/>
@@ -31202,8 +31393,8 @@
         </w:pict>
       </w:r>
     </w:p>
-    <w:bookmarkEnd w:id="123"/>
-    <w:bookmarkStart w:id="127" w:name="X70753ca4a9a8e0a75d9fba2cc15c756ce4fe62c"/>
+    <w:bookmarkEnd w:id="124"/>
+    <w:bookmarkStart w:id="128" w:name="X70753ca4a9a8e0a75d9fba2cc15c756ce4fe62c"/>
     <w:p>
       <w:pPr>
         <w:pStyle w:val="Heading1"/>
@@ -31212,7 +31403,7 @@
         <w:t xml:space="preserve">16. Kết luận và hướng mở rộng</w:t>
       </w:r>
     </w:p>
-    <w:bookmarkStart w:id="124" w:name="X19a6beb4c8deaa2207436d38469a6087410dc80"/>
+    <w:bookmarkStart w:id="125" w:name="X19a6beb4c8deaa2207436d38469a6087410dc80"/>
     <w:p>
       <w:pPr>
         <w:pStyle w:val="Heading2"/>
@@ -31442,11 +31633,11 @@
         <w:t xml:space="preserve"> </w:t>
       </w:r>
       <w:r>
-        <w:t xml:space="preserve">chỉ trích chỉ số tổng; web/API chạy được, chỉ nạp artifact, 366 test pass.</w:t>
-      </w:r>
-    </w:p>
-    <w:bookmarkEnd w:id="124"/>
-    <w:bookmarkStart w:id="125" w:name="X6a8575c6d25516dc9769921161d7c02f72178ff"/>
+        <w:t xml:space="preserve">chỉ trích chỉ số tổng; web/API chạy được, chỉ nạp artifact, 385 test pass.</w:t>
+      </w:r>
+    </w:p>
+    <w:bookmarkEnd w:id="125"/>
+    <w:bookmarkStart w:id="126" w:name="X6a8575c6d25516dc9769921161d7c02f72178ff"/>
     <w:p>
       <w:pPr>
         <w:pStyle w:val="Heading2"/>
@@ -31726,8 +31917,8 @@
         </w:tc>
       </w:tr>
     </w:tbl>
-    <w:bookmarkEnd w:id="125"/>
-    <w:bookmarkStart w:id="126" w:name="X72a909352003f6790a10db4790cb1ffb2143c7a"/>
+    <w:bookmarkEnd w:id="126"/>
+    <w:bookmarkStart w:id="127" w:name="X72a909352003f6790a10db4790cb1ffb2143c7a"/>
     <w:p>
       <w:pPr>
         <w:pStyle w:val="Heading2"/>
@@ -31897,9 +32088,9 @@
         </w:pict>
       </w:r>
     </w:p>
-    <w:bookmarkEnd w:id="126"/>
     <w:bookmarkEnd w:id="127"/>
-    <w:bookmarkStart w:id="136" w:name="Xb8e034bbfdc5269bc2b3f9ba7cba3dbc85ff006"/>
+    <w:bookmarkEnd w:id="128"/>
+    <w:bookmarkStart w:id="137" w:name="Xb8e034bbfdc5269bc2b3f9ba7cba3dbc85ff006"/>
     <w:p>
       <w:pPr>
         <w:pStyle w:val="Heading1"/>
@@ -31908,7 +32099,7 @@
         <w:t xml:space="preserve">17. Phụ lục</w:t>
       </w:r>
     </w:p>
-    <w:bookmarkStart w:id="128" w:name="Xf823874050472b5724f6496cde7e79002f5be2b"/>
+    <w:bookmarkStart w:id="129" w:name="Xf823874050472b5724f6496cde7e79002f5be2b"/>
     <w:p>
       <w:pPr>
         <w:pStyle w:val="Heading2"/>
@@ -32006,11 +32197,11 @@
         <w:rPr>
           <w:rStyle w:val="VerbatimChar"/>
         </w:rPr>
-        <w:t xml:space="preserve">tests/      366 test</w:t>
-      </w:r>
-    </w:p>
-    <w:bookmarkEnd w:id="128"/>
-    <w:bookmarkStart w:id="129" w:name="Xfde5bfb2a8525405898d752159e12ba1b561f47"/>
+        <w:t xml:space="preserve">tests/      385 test</w:t>
+      </w:r>
+    </w:p>
+    <w:bookmarkEnd w:id="129"/>
+    <w:bookmarkStart w:id="130" w:name="Xfde5bfb2a8525405898d752159e12ba1b561f47"/>
     <w:p>
       <w:pPr>
         <w:pStyle w:val="Heading2"/>
@@ -32311,207 +32502,148 @@
         <w:t xml:space="preserve">evaluate.py</w:t>
       </w:r>
       <w:r>
-        <w:rPr>
-          <w:b/>
-          <w:bCs/>
-        </w:rPr>
+        <w:t xml:space="preserve"> </w:t>
+      </w:r>
+      <w:r>
+        <w:t xml:space="preserve">— lý do đầy đủ ở §12.5.2;</w:t>
+      </w:r>
+      <w:r>
+        <w:t xml:space="preserve"> </w:t>
+      </w:r>
+      <w:r>
+        <w:t xml:space="preserve">hai script audit chỉ</w:t>
+      </w:r>
+      <w:r>
+        <w:t xml:space="preserve"> </w:t>
+      </w:r>
+      <w:r>
+        <w:rPr>
+          <w:b/>
+          <w:bCs/>
+        </w:rPr>
+        <w:t xml:space="preserve">đo</w:t>
+      </w:r>
+      <w:r>
+        <w:t xml:space="preserve"> </w:t>
+      </w:r>
+      <w:r>
+        <w:t xml:space="preserve">hậu quả</w:t>
+      </w:r>
+      <w:r>
+        <w:t xml:space="preserve"> </w:t>
+      </w:r>
+      <w:r>
+        <w:rPr>
+          <w:b/>
+          <w:bCs/>
+        </w:rPr>
+        <w:t xml:space="preserve">sau</w:t>
+      </w:r>
+      <w:r>
+        <w:t xml:space="preserve"> </w:t>
+      </w:r>
+      <w:r>
+        <w:t xml:space="preserve">khi policy đã đóng băng.</w:t>
+      </w:r>
+    </w:p>
+    <w:p>
+      <w:pPr>
+        <w:pStyle w:val="BlockText"/>
+      </w:pPr>
+      <w:r>
+        <w:rPr>
+          <w:b/>
+          <w:bCs/>
+        </w:rPr>
+        <w:t xml:space="preserve">Kiểm chứng trên máy sạch:</w:t>
+      </w:r>
+      <w:r>
+        <w:t xml:space="preserve"> </w:t>
+      </w:r>
+      <w:r>
+        <w:rPr>
+          <w:rStyle w:val="VerbatimChar"/>
+        </w:rPr>
+        <w:t xml:space="preserve">py src\freeze_serving_policy.py --check</w:t>
+      </w:r>
+      <w:r>
+        <w:t xml:space="preserve"> </w:t>
+      </w:r>
+      <w:r>
+        <w:t xml:space="preserve">— chỉ tính lại rồi so</w:t>
+      </w:r>
+      <w:r>
+        <w:t xml:space="preserve"> </w:t>
+      </w:r>
+      <w:r>
+        <w:t xml:space="preserve">nội dung,</w:t>
+      </w:r>
+      <w:r>
+        <w:t xml:space="preserve"> </w:t>
+      </w:r>
+      <w:r>
+        <w:rPr>
+          <w:b/>
+          <w:bCs/>
+        </w:rPr>
+        <w:t xml:space="preserve">không ghi file nào</w:t>
+      </w:r>
+      <w:r>
+        <w:t xml:space="preserve">; exit 0 = khớp, exit 1 = lệch kèm diff (§12.5.2b).</w:t>
+      </w:r>
+    </w:p>
+    <w:p>
+      <w:pPr>
+        <w:pStyle w:val="FirstParagraph"/>
+      </w:pPr>
+      <w:r>
+        <w:t xml:space="preserve">Nếu chỉ muốn cài theo khoảng version tương thích thay vì tái lập tuyệt đối, dùng</w:t>
+      </w:r>
+      <w:r>
+        <w:t xml:space="preserve"> </w:t>
+      </w:r>
+      <w:r>
+        <w:rPr>
+          <w:rStyle w:val="VerbatimChar"/>
+        </w:rPr>
+        <w:t xml:space="preserve">py -m pip install -r requirements.txt</w:t>
+      </w:r>
+      <w:r>
+        <w:t xml:space="preserve">. Phiên bản thật của môi trường đã sinh artifact</w:t>
+      </w:r>
+      <w:r>
+        <w:t xml:space="preserve"> </w:t>
+      </w:r>
+      <w:r>
+        <w:t xml:space="preserve">nằm trong</w:t>
+      </w:r>
+      <w:r>
+        <w:t xml:space="preserve"> </w:t>
+      </w:r>
+      <w:r>
+        <w:rPr>
+          <w:rStyle w:val="VerbatimChar"/>
+        </w:rPr>
+        <w:t xml:space="preserve">models/environment.json</w:t>
+      </w:r>
+      <w:r>
+        <w:t xml:space="preserve">. Seed cố định:</w:t>
+      </w:r>
+      <w:r>
+        <w:t xml:space="preserve"> </w:t>
+      </w:r>
+      <w:r>
+        <w:rPr>
+          <w:rStyle w:val="VerbatimChar"/>
+        </w:rPr>
+        <w:t xml:space="preserve">42</w:t>
+      </w:r>
+      <w:r>
         <w:t xml:space="preserve">.</w:t>
       </w:r>
-      <w:r>
-        <w:t xml:space="preserve"> </w:t>
-      </w:r>
-      <w:r>
-        <w:t xml:space="preserve">Chính sách hậu xử lý</w:t>
-      </w:r>
-      <w:r>
-        <w:t xml:space="preserve"> </w:t>
-      </w:r>
-      <w:r>
-        <w:rPr>
-          <w:rStyle w:val="VerbatimChar"/>
-        </w:rPr>
-        <w:t xml:space="preserve">max(0,·)</w:t>
-      </w:r>
-      <w:r>
-        <w:t xml:space="preserve"> </w:t>
-      </w:r>
-      <w:r>
-        <w:t xml:space="preserve">được chốt</w:t>
-      </w:r>
-      <w:r>
-        <w:t xml:space="preserve"> </w:t>
-      </w:r>
-      <w:r>
-        <w:rPr>
-          <w:b/>
-          <w:bCs/>
-        </w:rPr>
-        <w:t xml:space="preserve">chỉ từ TRAIN + VALIDATION</w:t>
-      </w:r>
-      <w:r>
-        <w:t xml:space="preserve">. Nếu chạy</w:t>
-      </w:r>
-      <w:r>
-        <w:t xml:space="preserve"> </w:t>
-      </w:r>
-      <w:r>
-        <w:rPr>
-          <w:rStyle w:val="VerbatimChar"/>
-        </w:rPr>
-        <w:t xml:space="preserve">evaluate.py</w:t>
-      </w:r>
-      <w:r>
-        <w:t xml:space="preserve"> </w:t>
-      </w:r>
-      <w:r>
-        <w:t xml:space="preserve">trước, ta đã nhìn thấy</w:t>
-      </w:r>
-      <w:r>
-        <w:t xml:space="preserve"> </w:t>
-      </w:r>
-      <w:r>
-        <w:t xml:space="preserve">kết quả 2018 trước khi quyết định có cắt âm hay không — tức</w:t>
-      </w:r>
-      <w:r>
-        <w:t xml:space="preserve"> </w:t>
-      </w:r>
-      <w:r>
-        <w:rPr>
-          <w:i/>
-          <w:iCs/>
-        </w:rPr>
-        <w:t xml:space="preserve">test-informed postprocessing</w:t>
-      </w:r>
-      <w:r>
-        <w:t xml:space="preserve">, làm</w:t>
-      </w:r>
-      <w:r>
-        <w:t xml:space="preserve"> </w:t>
-      </w:r>
-      <w:r>
-        <w:t xml:space="preserve">mất ý nghĩa của FINAL TEST.</w:t>
-      </w:r>
-      <w:r>
-        <w:t xml:space="preserve"> </w:t>
-      </w:r>
-      <w:r>
-        <w:rPr>
-          <w:rStyle w:val="VerbatimChar"/>
-        </w:rPr>
-        <w:t xml:space="preserve">postprocess_audit.py</w:t>
-      </w:r>
-      <w:r>
-        <w:t xml:space="preserve"> </w:t>
-      </w:r>
-      <w:r>
-        <w:t xml:space="preserve">và</w:t>
-      </w:r>
-      <w:r>
-        <w:t xml:space="preserve"> </w:t>
-      </w:r>
-      <w:r>
-        <w:rPr>
-          <w:rStyle w:val="VerbatimChar"/>
-        </w:rPr>
-        <w:t xml:space="preserve">uncertainty_audit.py</w:t>
-      </w:r>
-      <w:r>
-        <w:t xml:space="preserve"> </w:t>
-      </w:r>
-      <w:r>
-        <w:t xml:space="preserve">chỉ</w:t>
-      </w:r>
-      <w:r>
-        <w:t xml:space="preserve"> </w:t>
-      </w:r>
-      <w:r>
-        <w:rPr>
-          <w:b/>
-          <w:bCs/>
-        </w:rPr>
-        <w:t xml:space="preserve">đo</w:t>
-      </w:r>
-      <w:r>
-        <w:t xml:space="preserve"> </w:t>
-      </w:r>
-      <w:r>
-        <w:t xml:space="preserve">hậu quả</w:t>
-      </w:r>
-      <w:r>
-        <w:t xml:space="preserve"> </w:t>
-      </w:r>
-      <w:r>
-        <w:rPr>
-          <w:b/>
-          <w:bCs/>
-        </w:rPr>
-        <w:t xml:space="preserve">sau</w:t>
-      </w:r>
-      <w:r>
-        <w:t xml:space="preserve"> </w:t>
-      </w:r>
-      <w:r>
-        <w:t xml:space="preserve">khi policy đã đóng băng, và cả hai đều từ chối chạy nếu điều kiện tiên quyết chưa có</w:t>
-      </w:r>
-      <w:r>
-        <w:t xml:space="preserve"> </w:t>
-      </w:r>
-      <w:r>
-        <w:t xml:space="preserve">(chi tiết §12.5.1).</w:t>
-      </w:r>
-    </w:p>
-    <w:p>
-      <w:pPr>
-        <w:pStyle w:val="FirstParagraph"/>
-      </w:pPr>
-      <w:r>
-        <w:t xml:space="preserve">Nếu chỉ muốn cài theo khoảng version tương thích thay vì tái lập tuyệt đối, dùng</w:t>
-      </w:r>
-      <w:r>
-        <w:t xml:space="preserve"> </w:t>
-      </w:r>
-      <w:r>
-        <w:rPr>
-          <w:rStyle w:val="VerbatimChar"/>
-        </w:rPr>
-        <w:t xml:space="preserve">py -m pip install -r requirements.txt</w:t>
-      </w:r>
-      <w:r>
-        <w:t xml:space="preserve">. Phiên bản thật của môi trường đã sinh artifact</w:t>
-      </w:r>
-      <w:r>
-        <w:t xml:space="preserve"> </w:t>
-      </w:r>
-      <w:r>
-        <w:t xml:space="preserve">nằm trong</w:t>
-      </w:r>
-      <w:r>
-        <w:t xml:space="preserve"> </w:t>
-      </w:r>
-      <w:r>
-        <w:rPr>
-          <w:rStyle w:val="VerbatimChar"/>
-        </w:rPr>
-        <w:t xml:space="preserve">models/environment.json</w:t>
-      </w:r>
-      <w:r>
-        <w:t xml:space="preserve">. Seed cố định:</w:t>
-      </w:r>
-      <w:r>
-        <w:t xml:space="preserve"> </w:t>
-      </w:r>
-      <w:r>
-        <w:rPr>
-          <w:rStyle w:val="VerbatimChar"/>
-        </w:rPr>
-        <w:t xml:space="preserve">42</w:t>
-      </w:r>
-      <w:r>
-        <w:t xml:space="preserve">.</w:t>
-      </w:r>
-    </w:p>
-    <w:bookmarkEnd w:id="129"/>
-    <w:bookmarkStart w:id="130" w:name="Xf2f7485d70beffd103f971a7922053b05c3ecf6"/>
+    </w:p>
+    <w:bookmarkEnd w:id="130"/>
+    <w:bookmarkStart w:id="131" w:name="Xf2f7485d70beffd103f971a7922053b05c3ecf6"/>
     <w:p>
       <w:pPr>
         <w:pStyle w:val="Heading2"/>
@@ -32891,8 +33023,8 @@
         </w:tc>
       </w:tr>
     </w:tbl>
-    <w:bookmarkEnd w:id="130"/>
-    <w:bookmarkStart w:id="131" w:name="X879c20bd81f773563360b51d1c8c8dc0e01066d"/>
+    <w:bookmarkEnd w:id="131"/>
+    <w:bookmarkStart w:id="132" w:name="X879c20bd81f773563360b51d1c8c8dc0e01066d"/>
     <w:p>
       <w:pPr>
         <w:pStyle w:val="Heading2"/>
@@ -32997,7 +33129,7 @@
               <w:pStyle w:val="Compact"/>
             </w:pPr>
             <w:r>
-              <w:t xml:space="preserve">Brief, data README, data dictionary, kế hoạch baseline</w:t>
+              <w:t xml:space="preserve">Brief, data README, dictionary, kế hoạch baseline</w:t>
             </w:r>
           </w:p>
         </w:tc>
@@ -33224,7 +33356,7 @@
               <w:pStyle w:val="Compact"/>
             </w:pPr>
             <w:r>
-              <w:t xml:space="preserve">FastAPI + 3 màn hình + 366 test + tài liệu + bản phát hành</w:t>
+              <w:t xml:space="preserve">FastAPI + 3 màn hình + 385 test + tài liệu + bản phát hành</w:t>
             </w:r>
           </w:p>
         </w:tc>
@@ -33236,13 +33368,81 @@
             </w:pPr>
             <w:r>
               <w:t xml:space="preserve">Web/API chạy thật, không train-serving skew; bootstrap bất định + kiểm toán alpha</w:t>
+            </w:r>
+          </w:p>
+        </w:tc>
+      </w:tr>
+      <w:tr>
+        <w:tc>
+          <w:tcPr/>
+          <w:p>
+            <w:pPr>
+              <w:pStyle w:val="Compact"/>
+            </w:pPr>
+            <w:r>
+              <w:t xml:space="preserve">7</w:t>
+            </w:r>
+          </w:p>
+        </w:tc>
+        <w:tc>
+          <w:tcPr/>
+          <w:p>
+            <w:pPr>
+              <w:pStyle w:val="Compact"/>
+            </w:pPr>
+            <w:r>
+              <w:t xml:space="preserve">Đóng băng chạy lại được (</w:t>
+            </w:r>
+            <w:r>
+              <w:rPr>
+                <w:rStyle w:val="VerbatimChar"/>
+              </w:rPr>
+              <w:t xml:space="preserve">--check</w:t>
+            </w:r>
+            <w:r>
+              <w:t xml:space="preserve"> </w:t>
+            </w:r>
+            <w:r>
+              <w:t xml:space="preserve">/</w:t>
+            </w:r>
+            <w:r>
+              <w:t xml:space="preserve"> </w:t>
+            </w:r>
+            <w:r>
+              <w:rPr>
+                <w:rStyle w:val="VerbatimChar"/>
+              </w:rPr>
+              <w:t xml:space="preserve">--force</w:t>
+            </w:r>
+            <w:r>
+              <w:t xml:space="preserve">)</w:t>
+            </w:r>
+          </w:p>
+        </w:tc>
+        <w:tc>
+          <w:tcPr/>
+          <w:p>
+            <w:pPr>
+              <w:pStyle w:val="Compact"/>
+            </w:pPr>
+            <w:r>
+              <w:rPr>
+                <w:rStyle w:val="VerbatimChar"/>
+              </w:rPr>
+              <w:t xml:space="preserve">serving_policy.json</w:t>
+            </w:r>
+            <w:r>
+              <w:t xml:space="preserve"> </w:t>
+            </w:r>
+            <w:r>
+              <w:t xml:space="preserve">giữ nguyên hash khi chạy lại</w:t>
             </w:r>
           </w:p>
         </w:tc>
       </w:tr>
     </w:tbl>
-    <w:bookmarkEnd w:id="131"/>
-    <w:bookmarkStart w:id="132" w:name="Xce7bbfc5ef721651c4e0972c8d194748eea111a"/>
+    <w:bookmarkEnd w:id="132"/>
+    <w:bookmarkStart w:id="133" w:name="Xce7bbfc5ef721651c4e0972c8d194748eea111a"/>
     <w:p>
       <w:pPr>
         <w:pStyle w:val="Heading2"/>
@@ -33791,8 +33991,8 @@
         <w:t xml:space="preserve">đáp án, và 10 câu bổ sung).</w:t>
       </w:r>
     </w:p>
-    <w:bookmarkEnd w:id="132"/>
-    <w:bookmarkStart w:id="134" w:name="X662ca9157d20a2cc4af1bb6a47ef2df7bda09ac"/>
+    <w:bookmarkEnd w:id="133"/>
+    <w:bookmarkStart w:id="135" w:name="X662ca9157d20a2cc4af1bb6a47ef2df7bda09ac"/>
     <w:p>
       <w:pPr>
         <w:pStyle w:val="Heading2"/>
@@ -33805,11 +34005,11 @@
       <w:pPr>
         <w:pStyle w:val="Heading3"/>
       </w:pPr>
-      <w:bookmarkStart w:id="133" w:name="Xfadda7d3cc3c70c4b2c1a5cb5bb6bcf7e4a5e28"/>
+      <w:bookmarkStart w:id="134" w:name="Xfadda7d3cc3c70c4b2c1a5cb5bb6bcf7e4a5e28"/>
       <w:r>
         <w:t xml:space="preserve">⚠ CẦN NGƯỜI DÙNG ĐIỀN TRƯỚC KHI NỘP</w:t>
       </w:r>
-      <w:bookmarkEnd w:id="133"/>
+      <w:bookmarkEnd w:id="134"/>
     </w:p>
     <w:p>
       <w:pPr>
@@ -34102,8 +34302,8 @@
         <w:t xml:space="preserve">tạo commit giả cho người khác, không backdate commit.</w:t>
       </w:r>
     </w:p>
-    <w:bookmarkEnd w:id="134"/>
-    <w:bookmarkStart w:id="135" w:name="X3b7b8bb8a50e825a47a258ce08df0e6b8d32a9b"/>
+    <w:bookmarkEnd w:id="135"/>
+    <w:bookmarkStart w:id="136" w:name="X3b7b8bb8a50e825a47a258ce08df0e6b8d32a9b"/>
     <w:p>
       <w:pPr>
         <w:pStyle w:val="Heading2"/>
@@ -34333,8 +34533,8 @@
         <w:t xml:space="preserve">artifact, nên tài liệu không thể lệch số mà không bị test bắt.</w:t>
       </w:r>
     </w:p>
-    <w:bookmarkEnd w:id="135"/>
     <w:bookmarkEnd w:id="136"/>
+    <w:bookmarkEnd w:id="137"/>
     <w:sectPr>
       <w:footnotePr>
         <w:numRestart w:val="eachSect"/>

</xml_diff>

<commit_message>
Sửa trích dẫn dataset và đồng bộ quy trình tái lập
</commit_message>
<xml_diff>
--- a/release/final_report.docx
+++ b/release/final_report.docx
@@ -1997,7 +1997,7 @@
     </w:p>
     <w:bookmarkEnd w:id="16"/>
     <w:bookmarkEnd w:id="17"/>
-    <w:bookmarkStart w:id="27" w:name="X6cadc7b878f14af0cc9a0d53d26b847dbb18e4e"/>
+    <w:bookmarkStart w:id="28" w:name="X6cadc7b878f14af0cc9a0d53d26b847dbb18e4e"/>
     <w:p>
       <w:pPr>
         <w:pStyle w:val="Heading1"/>
@@ -2069,7 +2069,7 @@
         <w:t xml:space="preserve">.</w:t>
       </w:r>
     </w:p>
-    <w:bookmarkStart w:id="18" w:name="X66599bdd6173f966a601c722f6ccb3c25401a86"/>
+    <w:bookmarkStart w:id="19" w:name="X66599bdd6173f966a601c722f6ccb3c25401a86"/>
     <w:p>
       <w:pPr>
         <w:pStyle w:val="Heading2"/>
@@ -2119,7 +2119,7 @@
         <w:t xml:space="preserve">CC BY 4.0</w:t>
       </w:r>
       <w:r>
-        <w:t xml:space="preserve">. Trích dẫn bắt buộc: Hamed Tabatabaeyan, Meng Lu, et al. (2020).</w:t>
+        <w:t xml:space="preserve">.</w:t>
       </w:r>
     </w:p>
     <w:p>
@@ -2131,6 +2131,45 @@
         </w:numPr>
       </w:pPr>
       <w:r>
+        <w:rPr>
+          <w:b/>
+          <w:bCs/>
+        </w:rPr>
+        <w:t xml:space="preserve">Trích dẫn chuẩn (bắt buộc ghi nguồn):</w:t>
+      </w:r>
+      <w:r>
+        <w:t xml:space="preserve"> </w:t>
+      </w:r>
+      <w:r>
+        <w:t xml:space="preserve">Hogue, J. (2019). Metro Interstate Traffic Volume [Dataset].</w:t>
+      </w:r>
+      <w:r>
+        <w:t xml:space="preserve"> </w:t>
+      </w:r>
+      <w:r>
+        <w:t xml:space="preserve">UCI Machine Learning Repository.</w:t>
+      </w:r>
+      <w:r>
+        <w:t xml:space="preserve"> </w:t>
+      </w:r>
+      <w:hyperlink r:id="rId18">
+        <w:r>
+          <w:rPr>
+            <w:rStyle w:val="Hyperlink"/>
+          </w:rPr>
+          <w:t xml:space="preserve">https://doi.org/10.24432/C5X60B</w:t>
+        </w:r>
+      </w:hyperlink>
+    </w:p>
+    <w:p>
+      <w:pPr>
+        <w:pStyle w:val="Compact"/>
+        <w:numPr>
+          <w:ilvl w:val="0"/>
+          <w:numId w:val="1006"/>
+        </w:numPr>
+      </w:pPr>
+      <w:r>
         <w:t xml:space="preserve">Tải bằng</w:t>
       </w:r>
       <w:r>
@@ -2143,7 +2182,13 @@
         <w:t xml:space="preserve">py src\download_data.py</w:t>
       </w:r>
       <w:r>
-        <w:t xml:space="preserve">; SHA256 được ghi trong</w:t>
+        <w:t xml:space="preserve">; SHA256, tên tác giả, năm, DOI và giấy phép được</w:t>
+      </w:r>
+      <w:r>
+        <w:t xml:space="preserve"> </w:t>
+      </w:r>
+      <w:r>
+        <w:t xml:space="preserve">ghi ở</w:t>
       </w:r>
       <w:r>
         <w:t xml:space="preserve"> </w:t>
@@ -2158,11 +2203,27 @@
         <w:t xml:space="preserve"> </w:t>
       </w:r>
       <w:r>
-        <w:t xml:space="preserve">để xác thực.</w:t>
-      </w:r>
-    </w:p>
-    <w:bookmarkEnd w:id="18"/>
-    <w:bookmarkStart w:id="19" w:name="X62a97f439410dd7cfdbf5ded16f51e5047c8f7d"/>
+        <w:t xml:space="preserve">— hai tài liệu này dùng</w:t>
+      </w:r>
+      <w:r>
+        <w:t xml:space="preserve"> </w:t>
+      </w:r>
+      <w:r>
+        <w:rPr>
+          <w:b/>
+          <w:bCs/>
+        </w:rPr>
+        <w:t xml:space="preserve">cùng một</w:t>
+      </w:r>
+      <w:r>
+        <w:t xml:space="preserve"> </w:t>
+      </w:r>
+      <w:r>
+        <w:t xml:space="preserve">trích dẫn.</w:t>
+      </w:r>
+    </w:p>
+    <w:bookmarkEnd w:id="19"/>
+    <w:bookmarkStart w:id="20" w:name="X62a97f439410dd7cfdbf5ded16f51e5047c8f7d"/>
     <w:p>
       <w:pPr>
         <w:pStyle w:val="Heading2"/>
@@ -2442,8 +2503,8 @@
         <w:t xml:space="preserve">tạo ra quan sát giả; việc thiếu dữ liệu được phản ánh trong mục Hạn chế thay vì che giấu bằng thống kê học từ tập lớn.</w:t>
       </w:r>
     </w:p>
-    <w:bookmarkEnd w:id="19"/>
-    <w:bookmarkStart w:id="26" w:name="X742304c6484d901707beb244c94a87bac7815d2"/>
+    <w:bookmarkEnd w:id="20"/>
+    <w:bookmarkStart w:id="27" w:name="X742304c6484d901707beb244c94a87bac7815d2"/>
     <w:p>
       <w:pPr>
         <w:pStyle w:val="Heading2"/>
@@ -2452,7 +2513,7 @@
         <w:t xml:space="preserve">3.3 Ba bẫy dữ liệu đã được phát hiện và xử lý</w:t>
       </w:r>
     </w:p>
-    <w:bookmarkStart w:id="20" w:name="a-trùng-date_time--bẫy-lớn-nhất"/>
+    <w:bookmarkStart w:id="21" w:name="a-trùng-date_time--bẫy-lớn-nhất"/>
     <w:p>
       <w:pPr>
         <w:pStyle w:val="Heading3"/>
@@ -2836,8 +2897,8 @@
         <w:t xml:space="preserve">vì lấy một dòng.</w:t>
       </w:r>
     </w:p>
-    <w:bookmarkEnd w:id="20"/>
-    <w:bookmarkStart w:id="21" w:name="b-giá-trị-vô-lý"/>
+    <w:bookmarkEnd w:id="21"/>
+    <w:bookmarkStart w:id="22" w:name="b-giá-trị-vô-lý"/>
     <w:p>
       <w:pPr>
         <w:pStyle w:val="Heading3"/>
@@ -3061,8 +3122,8 @@
         <w:t xml:space="preserve">, fit trên TRAIN.</w:t>
       </w:r>
     </w:p>
-    <w:bookmarkEnd w:id="21"/>
-    <w:bookmarkStart w:id="25" w:name="c-cột-holiday-và-bẫy-keep_default_na"/>
+    <w:bookmarkEnd w:id="22"/>
+    <w:bookmarkStart w:id="26" w:name="c-cột-holiday-và-bẫy-keep_default_na"/>
     <w:p>
       <w:pPr>
         <w:pStyle w:val="Heading3"/>
@@ -3205,18 +3266,18 @@
           <wp:inline>
             <wp:extent cx="5334000" cy="3048000"/>
             <wp:effectExtent b="0" l="0" r="0" t="0"/>
-            <wp:docPr descr="Phân bố lưu lượng trên TRAIN" title="" id="23" name="Picture"/>
+            <wp:docPr descr="Phân bố lưu lượng trên TRAIN" title="" id="24" name="Picture"/>
             <a:graphic>
               <a:graphicData uri="http://schemas.openxmlformats.org/drawingml/2006/picture">
                 <pic:pic>
                   <pic:nvPicPr>
-                    <pic:cNvPr descr="reports/figures/eda_target_distribution.png" id="24" name="Picture"/>
+                    <pic:cNvPr descr="reports/figures/eda_target_distribution.png" id="25" name="Picture"/>
                     <pic:cNvPicPr>
                       <a:picLocks noChangeArrowheads="1" noChangeAspect="1"/>
                     </pic:cNvPicPr>
                   </pic:nvPicPr>
                   <pic:blipFill>
-                    <a:blip r:embed="rId22"/>
+                    <a:blip r:embed="rId23"/>
                     <a:stretch>
                       <a:fillRect/>
                     </a:stretch>
@@ -3564,10 +3625,10 @@
         </w:pict>
       </w:r>
     </w:p>
-    <w:bookmarkEnd w:id="25"/>
     <w:bookmarkEnd w:id="26"/>
     <w:bookmarkEnd w:id="27"/>
-    <w:bookmarkStart w:id="30" w:name="X0f57eb62ee98328e3c135c676f791ac8d970ca2"/>
+    <w:bookmarkEnd w:id="28"/>
+    <w:bookmarkStart w:id="31" w:name="X0f57eb62ee98328e3c135c676f791ac8d970ca2"/>
     <w:p>
       <w:pPr>
         <w:pStyle w:val="Heading1"/>
@@ -3576,7 +3637,7 @@
         <w:t xml:space="preserve">4. Tiền xử lý và chống rò rỉ</w:t>
       </w:r>
     </w:p>
-    <w:bookmarkStart w:id="28" w:name="X350a231fd7d0b7b1ef0711f09305a1961016400"/>
+    <w:bookmarkStart w:id="29" w:name="X350a231fd7d0b7b1ef0711f09305a1961016400"/>
     <w:p>
       <w:pPr>
         <w:pStyle w:val="Heading2"/>
@@ -3918,8 +3979,8 @@
         <w:t xml:space="preserve">.</w:t>
       </w:r>
     </w:p>
-    <w:bookmarkEnd w:id="28"/>
-    <w:bookmarkStart w:id="29" w:name="X15b522a39e931528a2f470318de0e4dc5c6642b"/>
+    <w:bookmarkEnd w:id="29"/>
+    <w:bookmarkStart w:id="30" w:name="X15b522a39e931528a2f470318de0e4dc5c6642b"/>
     <w:p>
       <w:pPr>
         <w:pStyle w:val="Heading2"/>
@@ -4125,9 +4186,9 @@
         </w:pict>
       </w:r>
     </w:p>
-    <w:bookmarkEnd w:id="29"/>
     <w:bookmarkEnd w:id="30"/>
-    <w:bookmarkStart w:id="31" w:name="X040c3415e61182ed1430a5bd3412bb89643345d"/>
+    <w:bookmarkEnd w:id="31"/>
+    <w:bookmarkStart w:id="32" w:name="X040c3415e61182ed1430a5bd3412bb89643345d"/>
     <w:p>
       <w:pPr>
         <w:pStyle w:val="Heading1"/>
@@ -4587,8 +4648,8 @@
         </w:pict>
       </w:r>
     </w:p>
-    <w:bookmarkEnd w:id="31"/>
-    <w:bookmarkStart w:id="44" w:name="Xdcb8a88d67f3ca482e225cbde2daf90e8fd4a0b"/>
+    <w:bookmarkEnd w:id="32"/>
+    <w:bookmarkStart w:id="45" w:name="Xdcb8a88d67f3ca482e225cbde2daf90e8fd4a0b"/>
     <w:p>
       <w:pPr>
         <w:pStyle w:val="Heading1"/>
@@ -4631,7 +4692,7 @@
         <w:t xml:space="preserve">.</w:t>
       </w:r>
     </w:p>
-    <w:bookmarkStart w:id="32" w:name="X47c26182b6d655f4e7c40ee8e47a8fdb6f760b3"/>
+    <w:bookmarkStart w:id="33" w:name="X47c26182b6d655f4e7c40ee8e47a8fdb6f760b3"/>
     <w:p>
       <w:pPr>
         <w:pStyle w:val="Heading2"/>
@@ -4822,8 +4883,8 @@
         </w:tc>
       </w:tr>
     </w:tbl>
-    <w:bookmarkEnd w:id="32"/>
-    <w:bookmarkStart w:id="36" w:name="X6137debb40ee4654d509eb419659aa14489ea79"/>
+    <w:bookmarkEnd w:id="33"/>
+    <w:bookmarkStart w:id="37" w:name="X6137debb40ee4654d509eb419659aa14489ea79"/>
     <w:p>
       <w:pPr>
         <w:pStyle w:val="Heading2"/>
@@ -4915,18 +4976,18 @@
           <wp:inline>
             <wp:extent cx="5334000" cy="2182090"/>
             <wp:effectExtent b="0" l="0" r="0" t="0"/>
-            <wp:docPr descr="Lưu lượng trung bình theo giờ và thứ trong tuần" title="" id="34" name="Picture"/>
+            <wp:docPr descr="Lưu lượng trung bình theo giờ và thứ trong tuần" title="" id="35" name="Picture"/>
             <a:graphic>
               <a:graphicData uri="http://schemas.openxmlformats.org/drawingml/2006/picture">
                 <pic:pic>
                   <pic:nvPicPr>
-                    <pic:cNvPr descr="reports/figures/eda_traffic_by_hour_dow.png" id="35" name="Picture"/>
+                    <pic:cNvPr descr="reports/figures/eda_traffic_by_hour_dow.png" id="36" name="Picture"/>
                     <pic:cNvPicPr>
                       <a:picLocks noChangeArrowheads="1" noChangeAspect="1"/>
                     </pic:cNvPicPr>
                   </pic:nvPicPr>
                   <pic:blipFill>
-                    <a:blip r:embed="rId33"/>
+                    <a:blip r:embed="rId34"/>
                     <a:stretch>
                       <a:fillRect/>
                     </a:stretch>
@@ -5046,8 +5107,8 @@
         <w:t xml:space="preserve">feature chính của mô hình.</w:t>
       </w:r>
     </w:p>
-    <w:bookmarkEnd w:id="36"/>
-    <w:bookmarkStart w:id="43" w:name="X8899836a7fa238518df691d9921fc81b03416a2"/>
+    <w:bookmarkEnd w:id="37"/>
+    <w:bookmarkStart w:id="44" w:name="X8899836a7fa238518df691d9921fc81b03416a2"/>
     <w:p>
       <w:pPr>
         <w:pStyle w:val="Heading2"/>
@@ -5112,18 +5173,18 @@
           <wp:inline>
             <wp:extent cx="5334000" cy="2182090"/>
             <wp:effectExtent b="0" l="0" r="0" t="0"/>
-            <wp:docPr descr="Lưu lượng trung bình theo tháng và năm" title="" id="38" name="Picture"/>
+            <wp:docPr descr="Lưu lượng trung bình theo tháng và năm" title="" id="39" name="Picture"/>
             <a:graphic>
               <a:graphicData uri="http://schemas.openxmlformats.org/drawingml/2006/picture">
                 <pic:pic>
                   <pic:nvPicPr>
-                    <pic:cNvPr descr="reports/figures/eda_traffic_by_month_year.png" id="39" name="Picture"/>
+                    <pic:cNvPr descr="reports/figures/eda_traffic_by_month_year.png" id="40" name="Picture"/>
                     <pic:cNvPicPr>
                       <a:picLocks noChangeArrowheads="1" noChangeAspect="1"/>
                     </pic:cNvPicPr>
                   </pic:nvPicPr>
                   <pic:blipFill>
-                    <a:blip r:embed="rId37"/>
+                    <a:blip r:embed="rId38"/>
                     <a:stretch>
                       <a:fillRect/>
                     </a:stretch>
@@ -5233,18 +5294,18 @@
           <wp:inline>
             <wp:extent cx="5334000" cy="2370666"/>
             <wp:effectExtent b="0" l="0" r="0" t="0"/>
-            <wp:docPr descr="Ảnh hưởng của ngày lễ" title="" id="41" name="Picture"/>
+            <wp:docPr descr="Ảnh hưởng của ngày lễ" title="" id="42" name="Picture"/>
             <a:graphic>
               <a:graphicData uri="http://schemas.openxmlformats.org/drawingml/2006/picture">
                 <pic:pic>
                   <pic:nvPicPr>
-                    <pic:cNvPr descr="reports/figures/eda_holiday_effect.png" id="42" name="Picture"/>
+                    <pic:cNvPr descr="reports/figures/eda_holiday_effect.png" id="43" name="Picture"/>
                     <pic:cNvPicPr>
                       <a:picLocks noChangeArrowheads="1" noChangeAspect="1"/>
                     </pic:cNvPicPr>
                   </pic:nvPicPr>
                   <pic:blipFill>
-                    <a:blip r:embed="rId40"/>
+                    <a:blip r:embed="rId41"/>
                     <a:stretch>
                       <a:fillRect/>
                     </a:stretch>
@@ -5312,9 +5373,9 @@
         </w:pict>
       </w:r>
     </w:p>
-    <w:bookmarkEnd w:id="43"/>
     <w:bookmarkEnd w:id="44"/>
-    <w:bookmarkStart w:id="49" w:name="Xeefac0b9ede42f41e3aed1395fee5b5dbd487a7"/>
+    <w:bookmarkEnd w:id="45"/>
+    <w:bookmarkStart w:id="50" w:name="Xeefac0b9ede42f41e3aed1395fee5b5dbd487a7"/>
     <w:p>
       <w:pPr>
         <w:pStyle w:val="Heading1"/>
@@ -5323,7 +5384,7 @@
         <w:t xml:space="preserve">7. Baseline và mô hình chính</w:t>
       </w:r>
     </w:p>
-    <w:bookmarkStart w:id="45" w:name="X7882e3d41e026fb8e062f9697a13a51cc3f100f"/>
+    <w:bookmarkStart w:id="46" w:name="X7882e3d41e026fb8e062f9697a13a51cc3f100f"/>
     <w:p>
       <w:pPr>
         <w:pStyle w:val="Heading2"/>
@@ -5499,8 +5560,8 @@
         <w:t xml:space="preserve">không dùng thời tiết. Nếu Ridge chỉ bằng hoặc thua baseline thì mô hình không có giá trị.</w:t>
       </w:r>
     </w:p>
-    <w:bookmarkEnd w:id="45"/>
-    <w:bookmarkStart w:id="48" w:name="Xb4b91e897c87dd445b94e06b6e7c3d8c16a402c"/>
+    <w:bookmarkEnd w:id="46"/>
+    <w:bookmarkStart w:id="49" w:name="Xb4b91e897c87dd445b94e06b6e7c3d8c16a402c"/>
     <w:p>
       <w:pPr>
         <w:pStyle w:val="Heading2"/>
@@ -5685,7 +5746,7 @@
         <w:t xml:space="preserve">nhanh, tránh vấn đề lập ma trận phân rã.</w:t>
       </w:r>
     </w:p>
-    <w:bookmarkStart w:id="46" w:name="X5cb079f2768850a8ec131062b3f4d3a171d0eaa"/>
+    <w:bookmarkStart w:id="47" w:name="X5cb079f2768850a8ec131062b3f4d3a171d0eaa"/>
     <w:p>
       <w:pPr>
         <w:pStyle w:val="Heading3"/>
@@ -6177,8 +6238,8 @@
         <w:t xml:space="preserve">: một giờ có thể vừa mưa vừa tuyết vừa giông.</w:t>
       </w:r>
     </w:p>
-    <w:bookmarkEnd w:id="46"/>
-    <w:bookmarkStart w:id="47" w:name="Xfe6edd855e9a66482b9ea4c8a4450f6263bb23a"/>
+    <w:bookmarkEnd w:id="47"/>
+    <w:bookmarkStart w:id="48" w:name="Xfe6edd855e9a66482b9ea4c8a4450f6263bb23a"/>
     <w:p>
       <w:pPr>
         <w:pStyle w:val="Heading3"/>
@@ -6485,10 +6546,10 @@
         </w:pict>
       </w:r>
     </w:p>
-    <w:bookmarkEnd w:id="47"/>
     <w:bookmarkEnd w:id="48"/>
     <w:bookmarkEnd w:id="49"/>
-    <w:bookmarkStart w:id="51" w:name="Xee589cf6e005c0de27b33356904ba431c85eef4"/>
+    <w:bookmarkEnd w:id="50"/>
+    <w:bookmarkStart w:id="52" w:name="Xee589cf6e005c0de27b33356904ba431c85eef4"/>
     <w:p>
       <w:pPr>
         <w:pStyle w:val="Heading1"/>
@@ -7277,7 +7338,7 @@
         <w:t xml:space="preserve">.</w:t>
       </w:r>
     </w:p>
-    <w:bookmarkStart w:id="50" w:name="X48cd222a7a93d8a4a7f7f3a96972560a29eda3a"/>
+    <w:bookmarkStart w:id="51" w:name="X48cd222a7a93d8a4a7f7f3a96972560a29eda3a"/>
     <w:p>
       <w:pPr>
         <w:pStyle w:val="Heading2"/>
@@ -8299,9 +8360,9 @@
         </w:pict>
       </w:r>
     </w:p>
-    <w:bookmarkEnd w:id="50"/>
     <w:bookmarkEnd w:id="51"/>
-    <w:bookmarkStart w:id="59" w:name="Xa2f856c4d34dd53d5a5d11ffc9ced6152f02024"/>
+    <w:bookmarkEnd w:id="52"/>
+    <w:bookmarkStart w:id="60" w:name="Xa2f856c4d34dd53d5a5d11ffc9ced6152f02024"/>
     <w:p>
       <w:pPr>
         <w:pStyle w:val="Heading1"/>
@@ -8310,7 +8371,7 @@
         <w:t xml:space="preserve">9. Kết quả FINAL TEST 2018</w:t>
       </w:r>
     </w:p>
-    <w:bookmarkStart w:id="52" w:name="X8d92ba6a49ae9811ada18266961ad244f54128d"/>
+    <w:bookmarkStart w:id="53" w:name="X8d92ba6a49ae9811ada18266961ad244f54128d"/>
     <w:p>
       <w:pPr>
         <w:pStyle w:val="Heading2"/>
@@ -8703,8 +8764,8 @@
         <w:t xml:space="preserve">sửa bảng này cho khớp API.</w:t>
       </w:r>
     </w:p>
-    <w:bookmarkEnd w:id="52"/>
-    <w:bookmarkStart w:id="53" w:name="X05cd332c5c92a1710c2c9f07ee20e9bd7fc09b7"/>
+    <w:bookmarkEnd w:id="53"/>
+    <w:bookmarkStart w:id="54" w:name="X05cd332c5c92a1710c2c9f07ee20e9bd7fc09b7"/>
     <w:p>
       <w:pPr>
         <w:pStyle w:val="Heading2"/>
@@ -8919,8 +8980,8 @@
         <w:t xml:space="preserve">.</w:t>
       </w:r>
     </w:p>
-    <w:bookmarkEnd w:id="53"/>
-    <w:bookmarkStart w:id="56" w:name="Xd8216ace319279ae66a1d5b5dcb48772a0f47ee"/>
+    <w:bookmarkEnd w:id="54"/>
+    <w:bookmarkStart w:id="57" w:name="Xd8216ace319279ae66a1d5b5dcb48772a0f47ee"/>
     <w:p>
       <w:pPr>
         <w:pStyle w:val="Heading2"/>
@@ -9363,7 +9424,7 @@
         <w:t xml:space="preserve">).</w:t>
       </w:r>
     </w:p>
-    <w:bookmarkStart w:id="54" w:name="Xb402587890eedd1c092841051657af547006693"/>
+    <w:bookmarkStart w:id="55" w:name="Xb402587890eedd1c092841051657af547006693"/>
     <w:p>
       <w:pPr>
         <w:pStyle w:val="Heading3"/>
@@ -10018,8 +10079,8 @@
         <w:t xml:space="preserve">bản đầy đủ nhất của dự án, nên đó là nơi Ridge có cơ hội thể hiện.</w:t>
       </w:r>
     </w:p>
-    <w:bookmarkEnd w:id="54"/>
-    <w:bookmarkStart w:id="55" w:name="X0d4f7b12f4e43aa057c794d34dc2576b6c88d72"/>
+    <w:bookmarkEnd w:id="55"/>
+    <w:bookmarkStart w:id="56" w:name="X0d4f7b12f4e43aa057c794d34dc2576b6c88d72"/>
     <w:p>
       <w:pPr>
         <w:pStyle w:val="Heading3"/>
@@ -10128,9 +10189,9 @@
         <w:t xml:space="preserve">"mô hình luôn hơn baseline" — số liệu 2012–2017 nói ngược lại ở 3/4 cửa sổ.</w:t>
       </w:r>
     </w:p>
-    <w:bookmarkEnd w:id="55"/>
     <w:bookmarkEnd w:id="56"/>
-    <w:bookmarkStart w:id="57" w:name="Xa1377e9200683c9e1a8db43232e3bd52d7a40ca"/>
+    <w:bookmarkEnd w:id="57"/>
+    <w:bookmarkStart w:id="58" w:name="Xa1377e9200683c9e1a8db43232e3bd52d7a40ca"/>
     <w:p>
       <w:pPr>
         <w:pStyle w:val="Heading2"/>
@@ -10395,8 +10456,8 @@
         <w:t xml:space="preserve">tiến bộ". Đây cũng là kết luận mà thí nghiệm rolling-origin (§11.4) nêu thẳng.</w:t>
       </w:r>
     </w:p>
-    <w:bookmarkEnd w:id="57"/>
-    <w:bookmarkStart w:id="58" w:name="X74cec6727d5e83e5105d52fb6c4814841a919e7"/>
+    <w:bookmarkEnd w:id="58"/>
+    <w:bookmarkStart w:id="59" w:name="X74cec6727d5e83e5105d52fb6c4814841a919e7"/>
     <w:p>
       <w:pPr>
         <w:pStyle w:val="Heading2"/>
@@ -10857,9 +10918,9 @@
         </w:pict>
       </w:r>
     </w:p>
-    <w:bookmarkEnd w:id="58"/>
     <w:bookmarkEnd w:id="59"/>
-    <w:bookmarkStart w:id="82" w:name="X3429ff74cfd53f246dafbf99973d70e8764b539"/>
+    <w:bookmarkEnd w:id="60"/>
+    <w:bookmarkStart w:id="83" w:name="X3429ff74cfd53f246dafbf99973d70e8764b539"/>
     <w:p>
       <w:pPr>
         <w:pStyle w:val="Heading1"/>
@@ -10953,7 +11014,7 @@
         <w:t xml:space="preserve">.</w:t>
       </w:r>
     </w:p>
-    <w:bookmarkStart w:id="63" w:name="Xd24b0c4569f974b375dcdf554f86e975518d692"/>
+    <w:bookmarkStart w:id="64" w:name="Xd24b0c4569f974b375dcdf554f86e975518d692"/>
     <w:p>
       <w:pPr>
         <w:pStyle w:val="Heading2"/>
@@ -11872,18 +11933,18 @@
           <wp:inline>
             <wp:extent cx="5334000" cy="1723292"/>
             <wp:effectExtent b="0" l="0" r="0" t="0"/>
-            <wp:docPr descr="MAE theo giờ và ngày trong tuần trên FINAL TEST 2018" title="" id="61" name="Picture"/>
+            <wp:docPr descr="MAE theo giờ và ngày trong tuần trên FINAL TEST 2018" title="" id="62" name="Picture"/>
             <a:graphic>
               <a:graphicData uri="http://schemas.openxmlformats.org/drawingml/2006/picture">
                 <pic:pic>
                   <pic:nvPicPr>
-                    <pic:cNvPr descr="reports/figures/final_mae_by_hour_dow.png" id="62" name="Picture"/>
+                    <pic:cNvPr descr="reports/figures/final_mae_by_hour_dow.png" id="63" name="Picture"/>
                     <pic:cNvPicPr>
                       <a:picLocks noChangeArrowheads="1" noChangeAspect="1"/>
                     </pic:cNvPicPr>
                   </pic:nvPicPr>
                   <pic:blipFill>
-                    <a:blip r:embed="rId60"/>
+                    <a:blip r:embed="rId61"/>
                     <a:stretch>
                       <a:fillRect/>
                     </a:stretch>
@@ -11944,8 +12005,8 @@
         <w:t xml:space="preserve">.</w:t>
       </w:r>
     </w:p>
-    <w:bookmarkEnd w:id="63"/>
-    <w:bookmarkStart w:id="64" w:name="X7493fec459b2bca1e50b3e4f52b8eb2e61c7f8d"/>
+    <w:bookmarkEnd w:id="64"/>
+    <w:bookmarkStart w:id="65" w:name="X7493fec459b2bca1e50b3e4f52b8eb2e61c7f8d"/>
     <w:p>
       <w:pPr>
         <w:pStyle w:val="Heading2"/>
@@ -12572,8 +12633,8 @@
         <w:t xml:space="preserve">cao nhất (3.772) nhưng MAE thấp (221,27), bias âm (−58,86).</w:t>
       </w:r>
     </w:p>
-    <w:bookmarkEnd w:id="64"/>
-    <w:bookmarkStart w:id="65" w:name="Xd9d828a049a3396dc97c4b217dbfab0b39a39b5"/>
+    <w:bookmarkEnd w:id="65"/>
+    <w:bookmarkStart w:id="66" w:name="Xd9d828a049a3396dc97c4b217dbfab0b39a39b5"/>
     <w:p>
       <w:pPr>
         <w:pStyle w:val="Heading2"/>
@@ -13058,8 +13119,8 @@
         <w:t xml:space="preserve">từng ngày lễ cho thấy các ngày lễ khác nhau gần gấp 3 lần (518,33 → 1.508,73) — xem §10.9.</w:t>
       </w:r>
     </w:p>
-    <w:bookmarkEnd w:id="65"/>
-    <w:bookmarkStart w:id="69" w:name="X7087a61464a32f6edabb261dff6c930f6a0150f"/>
+    <w:bookmarkEnd w:id="66"/>
+    <w:bookmarkStart w:id="70" w:name="X7087a61464a32f6edabb261dff6c930f6a0150f"/>
     <w:p>
       <w:pPr>
         <w:pStyle w:val="Heading2"/>
@@ -13895,18 +13956,18 @@
           <wp:inline>
             <wp:extent cx="5334000" cy="2400299"/>
             <wp:effectExtent b="0" l="0" r="0" t="0"/>
-            <wp:docPr descr="MAE theo nhóm thời tiết trên FINAL TEST 2018" title="" id="67" name="Picture"/>
+            <wp:docPr descr="MAE theo nhóm thời tiết trên FINAL TEST 2018" title="" id="68" name="Picture"/>
             <a:graphic>
               <a:graphicData uri="http://schemas.openxmlformats.org/drawingml/2006/picture">
                 <pic:pic>
                   <pic:nvPicPr>
-                    <pic:cNvPr descr="reports/figures/final_mae_by_weather.png" id="68" name="Picture"/>
+                    <pic:cNvPr descr="reports/figures/final_mae_by_weather.png" id="69" name="Picture"/>
                     <pic:cNvPicPr>
                       <a:picLocks noChangeArrowheads="1" noChangeAspect="1"/>
                     </pic:cNvPicPr>
                   </pic:nvPicPr>
                   <pic:blipFill>
-                    <a:blip r:embed="rId66"/>
+                    <a:blip r:embed="rId67"/>
                     <a:stretch>
                       <a:fillRect/>
                     </a:stretch>
@@ -13967,8 +14028,8 @@
         <w:t xml:space="preserve">.</w:t>
       </w:r>
     </w:p>
-    <w:bookmarkEnd w:id="69"/>
-    <w:bookmarkStart w:id="70" w:name="X096dd27fbed6591096621896bb7874bfbe03047"/>
+    <w:bookmarkEnd w:id="70"/>
+    <w:bookmarkStart w:id="71" w:name="X096dd27fbed6591096621896bb7874bfbe03047"/>
     <w:p>
       <w:pPr>
         <w:pStyle w:val="Heading2"/>
@@ -14491,8 +14552,8 @@
         <w:t xml:space="preserve">tuyết, nhiều xe không ra đường, nhưng mô hình chỉ có 1 giờ dữ liệu thời tiết để suy ra điều đó.</w:t>
       </w:r>
     </w:p>
-    <w:bookmarkEnd w:id="70"/>
-    <w:bookmarkStart w:id="76" w:name="Xd389e525fa1cc1ee53ff0b645e28eb1edc2693a"/>
+    <w:bookmarkEnd w:id="71"/>
+    <w:bookmarkStart w:id="77" w:name="Xd389e525fa1cc1ee53ff0b645e28eb1edc2693a"/>
     <w:p>
       <w:pPr>
         <w:pStyle w:val="Heading2"/>
@@ -14629,7 +14690,7 @@
         <w:t xml:space="preserve">).</w:t>
       </w:r>
     </w:p>
-    <w:bookmarkStart w:id="71" w:name="mô-tả-hiện-tượng"/>
+    <w:bookmarkStart w:id="72" w:name="mô-tả-hiện-tượng"/>
     <w:p>
       <w:pPr>
         <w:pStyle w:val="Heading3"/>
@@ -15039,8 +15100,8 @@
         <w:t xml:space="preserve">baseline 0,0807).</w:t>
       </w:r>
     </w:p>
-    <w:bookmarkEnd w:id="71"/>
-    <w:bookmarkStart w:id="72" w:name="X16b745190451eb326ef82f41a7f0013595cde80"/>
+    <w:bookmarkEnd w:id="72"/>
+    <w:bookmarkStart w:id="73" w:name="X16b745190451eb326ef82f41a7f0013595cde80"/>
     <w:p>
       <w:pPr>
         <w:pStyle w:val="Heading3"/>
@@ -15482,8 +15543,8 @@
         <w:t xml:space="preserve">baseline ở những giờ có lưu lượng lớn và biến động mạnh.</w:t>
       </w:r>
     </w:p>
-    <w:bookmarkEnd w:id="72"/>
-    <w:bookmarkStart w:id="73" w:name="giả-thuyết"/>
+    <w:bookmarkEnd w:id="73"/>
+    <w:bookmarkStart w:id="74" w:name="giả-thuyết"/>
     <w:p>
       <w:pPr>
         <w:pStyle w:val="Heading3"/>
@@ -15623,8 +15684,8 @@
         <w:t xml:space="preserve">Nhóm đã thử kiểm chứng nó bằng log-target.</w:t>
       </w:r>
     </w:p>
-    <w:bookmarkEnd w:id="73"/>
-    <w:bookmarkStart w:id="74" w:name="Xc9b2cd4c9c2bc23e3272a6cf9514d16ba657199"/>
+    <w:bookmarkEnd w:id="74"/>
+    <w:bookmarkStart w:id="75" w:name="Xc9b2cd4c9c2bc23e3272a6cf9514d16ba657199"/>
     <w:p>
       <w:pPr>
         <w:pStyle w:val="Heading3"/>
@@ -16120,8 +16181,8 @@
         <w:t xml:space="preserve">, không phải trên 2018 đã xem.</w:t>
       </w:r>
     </w:p>
-    <w:bookmarkEnd w:id="74"/>
-    <w:bookmarkStart w:id="75" w:name="hướng-phát-triển-chưa-thực-hiện"/>
+    <w:bookmarkEnd w:id="75"/>
+    <w:bookmarkStart w:id="76" w:name="hướng-phát-triển-chưa-thực-hiện"/>
     <w:p>
       <w:pPr>
         <w:pStyle w:val="Heading3"/>
@@ -16333,9 +16394,9 @@
         </w:tc>
       </w:tr>
     </w:tbl>
-    <w:bookmarkEnd w:id="75"/>
     <w:bookmarkEnd w:id="76"/>
-    <w:bookmarkStart w:id="80" w:name="X512c12e58189c09a775c16b1cfb17665649e362"/>
+    <w:bookmarkEnd w:id="77"/>
+    <w:bookmarkStart w:id="81" w:name="X512c12e58189c09a775c16b1cfb17665649e362"/>
     <w:p>
       <w:pPr>
         <w:pStyle w:val="Heading2"/>
@@ -16428,7 +16489,7 @@
         <w:t xml:space="preserve">(mục 4).</w:t>
       </w:r>
     </w:p>
-    <w:bookmarkStart w:id="77" w:name="Xbfd0658e556f5385f901ce2637375de50efe047"/>
+    <w:bookmarkStart w:id="78" w:name="Xbfd0658e556f5385f901ce2637375de50efe047"/>
     <w:p>
       <w:pPr>
         <w:pStyle w:val="Heading3"/>
@@ -16798,8 +16859,8 @@
         <w:t xml:space="preserve">.</w:t>
       </w:r>
     </w:p>
-    <w:bookmarkEnd w:id="77"/>
-    <w:bookmarkStart w:id="78" w:name="Xc06e3fa537e0637edb1a2333b6b50cbbdd83fd0"/>
+    <w:bookmarkEnd w:id="78"/>
+    <w:bookmarkStart w:id="79" w:name="Xc06e3fa537e0637edb1a2333b6b50cbbdd83fd0"/>
     <w:p>
       <w:pPr>
         <w:pStyle w:val="Heading3"/>
@@ -17430,8 +17491,8 @@
         <w:t xml:space="preserve">.</w:t>
       </w:r>
     </w:p>
-    <w:bookmarkEnd w:id="78"/>
-    <w:bookmarkStart w:id="79" w:name="c-phân-khúc-thời-tiết-không-có-mẫu"/>
+    <w:bookmarkEnd w:id="79"/>
+    <w:bookmarkStart w:id="80" w:name="c-phân-khúc-thời-tiết-không-có-mẫu"/>
     <w:p>
       <w:pPr>
         <w:pStyle w:val="Heading3"/>
@@ -17520,9 +17581,9 @@
         <w:t xml:space="preserve">(giống phân khúc Smoke 2 mẫu ở §10.4).</w:t>
       </w:r>
     </w:p>
-    <w:bookmarkEnd w:id="79"/>
     <w:bookmarkEnd w:id="80"/>
-    <w:bookmarkStart w:id="81" w:name="Xd5c47ffe09c8c88906cebfe55fcf9c12aae66b6"/>
+    <w:bookmarkEnd w:id="81"/>
+    <w:bookmarkStart w:id="82" w:name="Xd5c47ffe09c8c88906cebfe55fcf9c12aae66b6"/>
     <w:p>
       <w:pPr>
         <w:pStyle w:val="Heading2"/>
@@ -17781,9 +17842,9 @@
         </w:pict>
       </w:r>
     </w:p>
-    <w:bookmarkEnd w:id="81"/>
     <w:bookmarkEnd w:id="82"/>
-    <w:bookmarkStart w:id="95" w:name="X27c3a2a8eef02d2a7dfbcde44cbe585a3e0704c"/>
+    <w:bookmarkEnd w:id="83"/>
+    <w:bookmarkStart w:id="96" w:name="X27c3a2a8eef02d2a7dfbcde44cbe585a3e0704c"/>
     <w:p>
       <w:pPr>
         <w:pStyle w:val="Heading1"/>
@@ -17871,7 +17932,7 @@
         <w:t xml:space="preserve">.</w:t>
       </w:r>
     </w:p>
-    <w:bookmarkStart w:id="83" w:name="X583e70f65b92057a543fd89f08087d38d2c21b6"/>
+    <w:bookmarkStart w:id="84" w:name="X583e70f65b92057a543fd89f08087d38d2c21b6"/>
     <w:p>
       <w:pPr>
         <w:pStyle w:val="Heading2"/>
@@ -18901,8 +18962,8 @@
         <w:t xml:space="preserve">.</w:t>
       </w:r>
     </w:p>
-    <w:bookmarkEnd w:id="83"/>
-    <w:bookmarkStart w:id="84" w:name="Xf7c972d6d1f6bef144859aecd17481785413ab7"/>
+    <w:bookmarkEnd w:id="84"/>
+    <w:bookmarkStart w:id="85" w:name="Xf7c972d6d1f6bef144859aecd17481785413ab7"/>
     <w:p>
       <w:pPr>
         <w:pStyle w:val="Heading2"/>
@@ -19695,8 +19756,8 @@
         <w:t xml:space="preserve">lượng riêng của năm 2017, và việc có dữ liệu ở đúng các tháng của tập test.</w:t>
       </w:r>
     </w:p>
-    <w:bookmarkEnd w:id="84"/>
-    <w:bookmarkStart w:id="85" w:name="Xf9c7434cc68759990523be38a4f84a3768b34e1"/>
+    <w:bookmarkEnd w:id="85"/>
+    <w:bookmarkStart w:id="86" w:name="Xf9c7434cc68759990523be38a4f84a3768b34e1"/>
     <w:p>
       <w:pPr>
         <w:pStyle w:val="Heading2"/>
@@ -20536,8 +20597,8 @@
         <w:t xml:space="preserve">tháng hay tháng khác). Đó mới là lý do trung thực để giữ FINAL TEST 2018 nguyên vẹn.</w:t>
       </w:r>
     </w:p>
-    <w:bookmarkEnd w:id="85"/>
-    <w:bookmarkStart w:id="86" w:name="X9a8e9e291ef07c7d5a752041fdaccdc75d9c2ba"/>
+    <w:bookmarkEnd w:id="86"/>
+    <w:bookmarkStart w:id="87" w:name="X9a8e9e291ef07c7d5a752041fdaccdc75d9c2ba"/>
     <w:p>
       <w:pPr>
         <w:pStyle w:val="Heading2"/>
@@ -21044,8 +21105,8 @@
         <w:t xml:space="preserve">phân bố, xem §11.7).</w:t>
       </w:r>
     </w:p>
-    <w:bookmarkEnd w:id="86"/>
-    <w:bookmarkStart w:id="90" w:name="Xb1d6773e3cfef76744a1306cce8bada74921da9"/>
+    <w:bookmarkEnd w:id="87"/>
+    <w:bookmarkStart w:id="91" w:name="Xb1d6773e3cfef76744a1306cce8bada74921da9"/>
     <w:p>
       <w:pPr>
         <w:pStyle w:val="Heading2"/>
@@ -21095,7 +21156,7 @@
         <w:t xml:space="preserve">(mục 8). Chỉ dùng dữ liệu 2012–2017.</w:t>
       </w:r>
     </w:p>
-    <w:bookmarkStart w:id="87" w:name="X3326ed4ca178ff5015c3bc70db159eaa62891f9"/>
+    <w:bookmarkStart w:id="88" w:name="X3326ed4ca178ff5015c3bc70db159eaa62891f9"/>
     <w:p>
       <w:pPr>
         <w:pStyle w:val="Heading3"/>
@@ -21298,8 +21359,8 @@
         <w:t xml:space="preserve">loại dòng nào vì dữ liệu thiếu sẵn.</w:t>
       </w:r>
     </w:p>
-    <w:bookmarkEnd w:id="87"/>
-    <w:bookmarkStart w:id="88" w:name="Xf1b19125329c924ceda399f706abfbf2934f670"/>
+    <w:bookmarkEnd w:id="88"/>
+    <w:bookmarkStart w:id="89" w:name="Xf1b19125329c924ceda399f706abfbf2934f670"/>
     <w:p>
       <w:pPr>
         <w:pStyle w:val="Heading3"/>
@@ -21885,8 +21946,8 @@
         <w:t xml:space="preserve">, không phải bằng phỏng đoán.</w:t>
       </w:r>
     </w:p>
-    <w:bookmarkEnd w:id="88"/>
-    <w:bookmarkStart w:id="89" w:name="X97e0ead9a6b07d0d0c3e5c52228564aac245610"/>
+    <w:bookmarkEnd w:id="89"/>
+    <w:bookmarkStart w:id="90" w:name="X97e0ead9a6b07d0d0c3e5c52228564aac245610"/>
     <w:p>
       <w:pPr>
         <w:pStyle w:val="Heading3"/>
@@ -22125,9 +22186,9 @@
         <w:t xml:space="preserve">dựng lag và kiểm thử train-serving skew cho đặc trưng lag.</w:t>
       </w:r>
     </w:p>
-    <w:bookmarkEnd w:id="89"/>
     <w:bookmarkEnd w:id="90"/>
-    <w:bookmarkStart w:id="94" w:name="X93be6fd535388f0392fc4361a7cf52059407d93"/>
+    <w:bookmarkEnd w:id="91"/>
+    <w:bookmarkStart w:id="95" w:name="X93be6fd535388f0392fc4361a7cf52059407d93"/>
     <w:p>
       <w:pPr>
         <w:pStyle w:val="Heading2"/>
@@ -22639,18 +22700,18 @@
           <wp:inline>
             <wp:extent cx="5334000" cy="3000375"/>
             <wp:effectExtent b="0" l="0" r="0" t="0"/>
-            <wp:docPr descr="Phân bố thời tiết trên TRAIN" title="" id="92" name="Picture"/>
+            <wp:docPr descr="Phân bố thời tiết trên TRAIN" title="" id="93" name="Picture"/>
             <a:graphic>
               <a:graphicData uri="http://schemas.openxmlformats.org/drawingml/2006/picture">
                 <pic:pic>
                   <pic:nvPicPr>
-                    <pic:cNvPr descr="reports/figures/eda_weather_distribution.png" id="93" name="Picture"/>
+                    <pic:cNvPr descr="reports/figures/eda_weather_distribution.png" id="94" name="Picture"/>
                     <pic:cNvPicPr>
                       <a:picLocks noChangeArrowheads="1" noChangeAspect="1"/>
                     </pic:cNvPicPr>
                   </pic:nvPicPr>
                   <pic:blipFill>
-                    <a:blip r:embed="rId91"/>
+                    <a:blip r:embed="rId92"/>
                     <a:stretch>
                       <a:fillRect/>
                     </a:stretch>
@@ -22718,9 +22779,9 @@
         </w:pict>
       </w:r>
     </w:p>
-    <w:bookmarkEnd w:id="94"/>
     <w:bookmarkEnd w:id="95"/>
-    <w:bookmarkStart w:id="109" w:name="X923ed692b556b25f23fa302ee5f7131fde6843e"/>
+    <w:bookmarkEnd w:id="96"/>
+    <w:bookmarkStart w:id="110" w:name="X923ed692b556b25f23fa302ee5f7131fde6843e"/>
     <w:p>
       <w:pPr>
         <w:pStyle w:val="Heading1"/>
@@ -22729,7 +22790,7 @@
         <w:t xml:space="preserve">12. Ứng dụng Web / API</w:t>
       </w:r>
     </w:p>
-    <w:bookmarkStart w:id="96" w:name="X943c6d49ea1cb60779cce6b2246a254541edf05"/>
+    <w:bookmarkStart w:id="97" w:name="X943c6d49ea1cb60779cce6b2246a254541edf05"/>
     <w:p>
       <w:pPr>
         <w:pStyle w:val="Heading2"/>
@@ -23184,8 +23245,8 @@
         <w:t xml:space="preserve">.</w:t>
       </w:r>
     </w:p>
-    <w:bookmarkEnd w:id="96"/>
-    <w:bookmarkStart w:id="97" w:name="Xd178488c5929f6e5c733b8c3ecd99011f9450be"/>
+    <w:bookmarkEnd w:id="97"/>
+    <w:bookmarkStart w:id="98" w:name="Xd178488c5929f6e5c733b8c3ecd99011f9450be"/>
     <w:p>
       <w:pPr>
         <w:pStyle w:val="Heading2"/>
@@ -23691,8 +23752,8 @@
         <w:t xml:space="preserve">, chỉ dùng khi dự báo nằm ngoài bảng lịch.</w:t>
       </w:r>
     </w:p>
-    <w:bookmarkEnd w:id="97"/>
-    <w:bookmarkStart w:id="98" w:name="X28b26a22d9b425f4e3a09bbb7168bac56e4dcf4"/>
+    <w:bookmarkEnd w:id="98"/>
+    <w:bookmarkStart w:id="99" w:name="X28b26a22d9b425f4e3a09bbb7168bac56e4dcf4"/>
     <w:p>
       <w:pPr>
         <w:pStyle w:val="Heading2"/>
@@ -23958,8 +24019,8 @@
         <w:t xml:space="preserve">artifact để bảo đảm điều này không thoát.</w:t>
       </w:r>
     </w:p>
-    <w:bookmarkEnd w:id="98"/>
-    <w:bookmarkStart w:id="99" w:name="Xb00fda29d0b153002b2ed4fd02fb1a57d6baec7"/>
+    <w:bookmarkEnd w:id="99"/>
+    <w:bookmarkStart w:id="100" w:name="Xb00fda29d0b153002b2ed4fd02fb1a57d6baec7"/>
     <w:p>
       <w:pPr>
         <w:pStyle w:val="Heading2"/>
@@ -24634,8 +24695,8 @@
         <w:t xml:space="preserve">gửi liên tiếp 5 payload sai rồi xác nhận request hợp lệ vẫn trả 200.</w:t>
       </w:r>
     </w:p>
-    <w:bookmarkEnd w:id="99"/>
-    <w:bookmarkStart w:id="107" w:name="X229873d7c73bd506cfbc5de39da92f46e030625"/>
+    <w:bookmarkEnd w:id="100"/>
+    <w:bookmarkStart w:id="108" w:name="X229873d7c73bd506cfbc5de39da92f46e030625"/>
     <w:p>
       <w:pPr>
         <w:pStyle w:val="Heading2"/>
@@ -24723,7 +24784,7 @@
         <w:t xml:space="preserve">và đóng băng quyết định trước.</w:t>
       </w:r>
     </w:p>
-    <w:bookmarkStart w:id="100" w:name="X7148e7eb759061f1b2193c97c5a0ace545f72ad"/>
+    <w:bookmarkStart w:id="101" w:name="X7148e7eb759061f1b2193c97c5a0ace545f72ad"/>
     <w:p>
       <w:pPr>
         <w:pStyle w:val="Heading3"/>
@@ -25530,8 +25591,8 @@
         <w:t xml:space="preserve">đúng thứ tự này.</w:t>
       </w:r>
     </w:p>
-    <w:bookmarkEnd w:id="100"/>
-    <w:bookmarkStart w:id="101" w:name="X935b205844204b01a5e2a64e05c805379de1dc9"/>
+    <w:bookmarkEnd w:id="101"/>
+    <w:bookmarkStart w:id="102" w:name="X935b205844204b01a5e2a64e05c805379de1dc9"/>
     <w:p>
       <w:pPr>
         <w:pStyle w:val="Heading3"/>
@@ -25714,8 +25775,8 @@
         <w:t xml:space="preserve">. Chi tiết ở README.</w:t>
       </w:r>
     </w:p>
-    <w:bookmarkEnd w:id="101"/>
-    <w:bookmarkStart w:id="102" w:name="Xa25338e2e370f5c49d634bb298396c4463636c9"/>
+    <w:bookmarkEnd w:id="102"/>
+    <w:bookmarkStart w:id="103" w:name="Xa25338e2e370f5c49d634bb298396c4463636c9"/>
     <w:p>
       <w:pPr>
         <w:pStyle w:val="Heading3"/>
@@ -26049,8 +26110,8 @@
         <w:t xml:space="preserve">).</w:t>
       </w:r>
     </w:p>
-    <w:bookmarkEnd w:id="102"/>
-    <w:bookmarkStart w:id="103" w:name="X04f809ed0b6d9611c386aade382bd977f60b295"/>
+    <w:bookmarkEnd w:id="103"/>
+    <w:bookmarkStart w:id="104" w:name="X04f809ed0b6d9611c386aade382bd977f60b295"/>
     <w:p>
       <w:pPr>
         <w:pStyle w:val="Heading3"/>
@@ -26432,8 +26493,8 @@
         <w:t xml:space="preserve">0 là sửa sai lệch của mô hình, không phải xoá sự thật.</w:t>
       </w:r>
     </w:p>
-    <w:bookmarkEnd w:id="103"/>
-    <w:bookmarkStart w:id="104" w:name="Xa80cef9c7b1b19b333f7cba984fa946aa7f1dc7"/>
+    <w:bookmarkEnd w:id="104"/>
+    <w:bookmarkStart w:id="105" w:name="Xa80cef9c7b1b19b333f7cba984fa946aa7f1dc7"/>
     <w:p>
       <w:pPr>
         <w:pStyle w:val="Heading3"/>
@@ -26636,8 +26697,8 @@
         <w:t xml:space="preserve">liệu, nên không vi phạm nguyên tắc "không học gì từ tập test".</w:t>
       </w:r>
     </w:p>
-    <w:bookmarkEnd w:id="104"/>
-    <w:bookmarkStart w:id="105" w:name="X42a8e493e3a121879784cf864891ccb8cebcef1"/>
+    <w:bookmarkEnd w:id="105"/>
+    <w:bookmarkStart w:id="106" w:name="X42a8e493e3a121879784cf864891ccb8cebcef1"/>
     <w:p>
       <w:pPr>
         <w:pStyle w:val="Heading3"/>
@@ -26989,8 +27050,8 @@
         <w:t xml:space="preserve">§10.3: mô hình chưa học được việc lưu lượng đêm ngày lễ gần bằng 0.</w:t>
       </w:r>
     </w:p>
-    <w:bookmarkEnd w:id="105"/>
-    <w:bookmarkStart w:id="106" w:name="X1d5585f166bfbb1d17107ebfad4ef368322d3fb"/>
+    <w:bookmarkEnd w:id="106"/>
+    <w:bookmarkStart w:id="107" w:name="X1d5585f166bfbb1d17107ebfad4ef368322d3fb"/>
     <w:p>
       <w:pPr>
         <w:pStyle w:val="Heading3"/>
@@ -27155,9 +27216,9 @@
         <w:t xml:space="preserve">giá đã đóng băng để khớp API — làm vậy tức là dùng kết quả 2018 để điều chỉnh mô hình.</w:t>
       </w:r>
     </w:p>
-    <w:bookmarkEnd w:id="106"/>
     <w:bookmarkEnd w:id="107"/>
-    <w:bookmarkStart w:id="108" w:name="X6ee6a873b9edf02ee27088a80b10002775f74c9"/>
+    <w:bookmarkEnd w:id="108"/>
+    <w:bookmarkStart w:id="109" w:name="X6ee6a873b9edf02ee27088a80b10002775f74c9"/>
     <w:p>
       <w:pPr>
         <w:pStyle w:val="Heading2"/>
@@ -27385,9 +27446,9 @@
         </w:pict>
       </w:r>
     </w:p>
-    <w:bookmarkEnd w:id="108"/>
     <w:bookmarkEnd w:id="109"/>
-    <w:bookmarkStart w:id="112" w:name="X53cef0c72755ded06eccfa605ea778aef4fb51f"/>
+    <w:bookmarkEnd w:id="110"/>
+    <w:bookmarkStart w:id="113" w:name="X53cef0c72755ded06eccfa605ea778aef4fb51f"/>
     <w:p>
       <w:pPr>
         <w:pStyle w:val="Heading1"/>
@@ -28046,7 +28107,7 @@
         <w:t xml:space="preserve">không thể lọt.</w:t>
       </w:r>
     </w:p>
-    <w:bookmarkStart w:id="110" w:name="Xc05d1c0eeaa74dc6908c302258e0d3c31e17ad4"/>
+    <w:bookmarkStart w:id="111" w:name="Xc05d1c0eeaa74dc6908c302258e0d3c31e17ad4"/>
     <w:p>
       <w:pPr>
         <w:pStyle w:val="Heading2"/>
@@ -28335,8 +28396,8 @@
         </w:tc>
       </w:tr>
     </w:tbl>
-    <w:bookmarkEnd w:id="110"/>
-    <w:bookmarkStart w:id="111" w:name="Xb91b3854d430ce914488ce4c1fb3ac9ac7890ec"/>
+    <w:bookmarkEnd w:id="111"/>
+    <w:bookmarkStart w:id="112" w:name="Xb91b3854d430ce914488ce4c1fb3ac9ac7890ec"/>
     <w:p>
       <w:pPr>
         <w:pStyle w:val="Heading2"/>
@@ -28398,9 +28459,9 @@
         </w:pict>
       </w:r>
     </w:p>
-    <w:bookmarkEnd w:id="111"/>
     <w:bookmarkEnd w:id="112"/>
-    <w:bookmarkStart w:id="123" w:name="Xdad156229c53f75b320b788077bd8a86ade1b22"/>
+    <w:bookmarkEnd w:id="113"/>
+    <w:bookmarkStart w:id="124" w:name="Xdad156229c53f75b320b788077bd8a86ade1b22"/>
     <w:p>
       <w:pPr>
         <w:pStyle w:val="Heading1"/>
@@ -28409,7 +28470,7 @@
         <w:t xml:space="preserve">14. Model Card</w:t>
       </w:r>
     </w:p>
-    <w:bookmarkStart w:id="113" w:name="Xe42ef70e1d4c8c57c8a7f436dad24f87fbf5d28"/>
+    <w:bookmarkStart w:id="114" w:name="Xe42ef70e1d4c8c57c8a7f436dad24f87fbf5d28"/>
     <w:p>
       <w:pPr>
         <w:pStyle w:val="Heading2"/>
@@ -28747,8 +28808,8 @@
         </w:tc>
       </w:tr>
     </w:tbl>
-    <w:bookmarkEnd w:id="113"/>
-    <w:bookmarkStart w:id="114" w:name="X7b06c12df664a7fc4092dbdbf73ce7ec8bc05e2"/>
+    <w:bookmarkEnd w:id="114"/>
+    <w:bookmarkStart w:id="115" w:name="X7b06c12df664a7fc4092dbdbf73ce7ec8bc05e2"/>
     <w:p>
       <w:pPr>
         <w:pStyle w:val="Heading2"/>
@@ -28957,8 +29018,8 @@
         </w:tc>
       </w:tr>
     </w:tbl>
-    <w:bookmarkEnd w:id="114"/>
-    <w:bookmarkStart w:id="115" w:name="X6adb888e2576849c3c8b6c0eac84dee616b3b4c"/>
+    <w:bookmarkEnd w:id="115"/>
+    <w:bookmarkStart w:id="116" w:name="X6adb888e2576849c3c8b6c0eac84dee616b3b4c"/>
     <w:p>
       <w:pPr>
         <w:pStyle w:val="Heading2"/>
@@ -29122,8 +29183,8 @@
         </w:tc>
       </w:tr>
     </w:tbl>
-    <w:bookmarkEnd w:id="115"/>
-    <w:bookmarkStart w:id="116" w:name="Xbdfb83c0cffde6186a83f10788f36ddbdee6b36"/>
+    <w:bookmarkEnd w:id="116"/>
+    <w:bookmarkStart w:id="117" w:name="Xbdfb83c0cffde6186a83f10788f36ddbdee6b36"/>
     <w:p>
       <w:pPr>
         <w:pStyle w:val="Heading2"/>
@@ -29287,8 +29348,8 @@
         <w:t xml:space="preserve">trưng lag (xem §11.6).</w:t>
       </w:r>
     </w:p>
-    <w:bookmarkEnd w:id="116"/>
-    <w:bookmarkStart w:id="117" w:name="Xe09053a4b15961d792bf4e2a1366cfe6b0be545"/>
+    <w:bookmarkEnd w:id="117"/>
+    <w:bookmarkStart w:id="118" w:name="Xe09053a4b15961d792bf4e2a1366cfe6b0be545"/>
     <w:p>
       <w:pPr>
         <w:pStyle w:val="Heading2"/>
@@ -30030,8 +30091,8 @@
         </w:tc>
       </w:tr>
     </w:tbl>
-    <w:bookmarkEnd w:id="117"/>
-    <w:bookmarkStart w:id="118" w:name="Xb4b017eff690ec81289855a6f366e3e2cd31006"/>
+    <w:bookmarkEnd w:id="118"/>
+    <w:bookmarkStart w:id="119" w:name="Xb4b017eff690ec81289855a6f366e3e2cd31006"/>
     <w:p>
       <w:pPr>
         <w:pStyle w:val="Heading2"/>
@@ -30076,8 +30137,8 @@
         <w:t xml:space="preserve">Minh hoạ giá trị của chia tập theo thời gian và đánh giá trung thực trên bài toán chuỗi thời gian thực tế.</w:t>
       </w:r>
     </w:p>
-    <w:bookmarkEnd w:id="118"/>
-    <w:bookmarkStart w:id="119" w:name="X080e680f55be20fb44d6215757e74b24bb06c53"/>
+    <w:bookmarkEnd w:id="119"/>
+    <w:bookmarkStart w:id="120" w:name="X080e680f55be20fb44d6215757e74b24bb06c53"/>
     <w:p>
       <w:pPr>
         <w:pStyle w:val="Heading2"/>
@@ -30141,8 +30202,8 @@
         <w:t xml:space="preserve">Dùng như số liệu thống kê chính thức của cơ quan quản lý giao thông.</w:t>
       </w:r>
     </w:p>
-    <w:bookmarkEnd w:id="119"/>
-    <w:bookmarkStart w:id="120" w:name="Xcd3ad135c6e1fbf77091284952a3eb031c97455"/>
+    <w:bookmarkEnd w:id="120"/>
+    <w:bookmarkStart w:id="121" w:name="Xcd3ad135c6e1fbf77091284952a3eb031c97455"/>
     <w:p>
       <w:pPr>
         <w:pStyle w:val="Heading2"/>
@@ -30776,8 +30837,8 @@
         <w:t xml:space="preserve">vì FINAL TEST đã bị xem — đổi bây giờ là test-informed model selection.</w:t>
       </w:r>
     </w:p>
-    <w:bookmarkEnd w:id="120"/>
-    <w:bookmarkStart w:id="121" w:name="X24911cc652e48ef06c72a054df9c3d8a7ddfad4"/>
+    <w:bookmarkEnd w:id="121"/>
+    <w:bookmarkStart w:id="122" w:name="X24911cc652e48ef06c72a054df9c3d8a7ddfad4"/>
     <w:p>
       <w:pPr>
         <w:pStyle w:val="Heading2"/>
@@ -31033,8 +31094,8 @@
         <w:t xml:space="preserve">và negative prediction thành limitation.</w:t>
       </w:r>
     </w:p>
-    <w:bookmarkEnd w:id="121"/>
-    <w:bookmarkStart w:id="122" w:name="X8878001a0a13f457750e2973035e19caa739d55"/>
+    <w:bookmarkEnd w:id="122"/>
+    <w:bookmarkStart w:id="123" w:name="X8878001a0a13f457750e2973035e19caa739d55"/>
     <w:p>
       <w:pPr>
         <w:pStyle w:val="Heading2"/>
@@ -31218,9 +31279,9 @@
         </w:pict>
       </w:r>
     </w:p>
-    <w:bookmarkEnd w:id="122"/>
     <w:bookmarkEnd w:id="123"/>
-    <w:bookmarkStart w:id="124" w:name="Xea1ab71867dca1be6a495e6ec8d8d7ee4bb7cc1"/>
+    <w:bookmarkEnd w:id="124"/>
+    <w:bookmarkStart w:id="125" w:name="Xea1ab71867dca1be6a495e6ec8d8d7ee4bb7cc1"/>
     <w:p>
       <w:pPr>
         <w:pStyle w:val="Heading1"/>
@@ -31393,8 +31454,8 @@
         </w:pict>
       </w:r>
     </w:p>
-    <w:bookmarkEnd w:id="124"/>
-    <w:bookmarkStart w:id="128" w:name="X70753ca4a9a8e0a75d9fba2cc15c756ce4fe62c"/>
+    <w:bookmarkEnd w:id="125"/>
+    <w:bookmarkStart w:id="129" w:name="X70753ca4a9a8e0a75d9fba2cc15c756ce4fe62c"/>
     <w:p>
       <w:pPr>
         <w:pStyle w:val="Heading1"/>
@@ -31403,7 +31464,7 @@
         <w:t xml:space="preserve">16. Kết luận và hướng mở rộng</w:t>
       </w:r>
     </w:p>
-    <w:bookmarkStart w:id="125" w:name="X19a6beb4c8deaa2207436d38469a6087410dc80"/>
+    <w:bookmarkStart w:id="126" w:name="X19a6beb4c8deaa2207436d38469a6087410dc80"/>
     <w:p>
       <w:pPr>
         <w:pStyle w:val="Heading2"/>
@@ -31636,8 +31697,8 @@
         <w:t xml:space="preserve">chỉ trích chỉ số tổng; web/API chạy được, chỉ nạp artifact, 385 test pass.</w:t>
       </w:r>
     </w:p>
-    <w:bookmarkEnd w:id="125"/>
-    <w:bookmarkStart w:id="126" w:name="X6a8575c6d25516dc9769921161d7c02f72178ff"/>
+    <w:bookmarkEnd w:id="126"/>
+    <w:bookmarkStart w:id="127" w:name="X6a8575c6d25516dc9769921161d7c02f72178ff"/>
     <w:p>
       <w:pPr>
         <w:pStyle w:val="Heading2"/>
@@ -31917,8 +31978,8 @@
         </w:tc>
       </w:tr>
     </w:tbl>
-    <w:bookmarkEnd w:id="126"/>
-    <w:bookmarkStart w:id="127" w:name="X72a909352003f6790a10db4790cb1ffb2143c7a"/>
+    <w:bookmarkEnd w:id="127"/>
+    <w:bookmarkStart w:id="128" w:name="X72a909352003f6790a10db4790cb1ffb2143c7a"/>
     <w:p>
       <w:pPr>
         <w:pStyle w:val="Heading2"/>
@@ -32088,9 +32149,9 @@
         </w:pict>
       </w:r>
     </w:p>
-    <w:bookmarkEnd w:id="127"/>
     <w:bookmarkEnd w:id="128"/>
-    <w:bookmarkStart w:id="137" w:name="Xb8e034bbfdc5269bc2b3f9ba7cba3dbc85ff006"/>
+    <w:bookmarkEnd w:id="129"/>
+    <w:bookmarkStart w:id="138" w:name="Xb8e034bbfdc5269bc2b3f9ba7cba3dbc85ff006"/>
     <w:p>
       <w:pPr>
         <w:pStyle w:val="Heading1"/>
@@ -32099,7 +32160,7 @@
         <w:t xml:space="preserve">17. Phụ lục</w:t>
       </w:r>
     </w:p>
-    <w:bookmarkStart w:id="129" w:name="Xf823874050472b5724f6496cde7e79002f5be2b"/>
+    <w:bookmarkStart w:id="130" w:name="Xf823874050472b5724f6496cde7e79002f5be2b"/>
     <w:p>
       <w:pPr>
         <w:pStyle w:val="Heading2"/>
@@ -32200,8 +32261,8 @@
         <w:t xml:space="preserve">tests/      385 test</w:t>
       </w:r>
     </w:p>
-    <w:bookmarkEnd w:id="129"/>
-    <w:bookmarkStart w:id="130" w:name="Xfde5bfb2a8525405898d752159e12ba1b561f47"/>
+    <w:bookmarkEnd w:id="130"/>
+    <w:bookmarkStart w:id="131" w:name="Xfde5bfb2a8525405898d752159e12ba1b561f47"/>
     <w:p>
       <w:pPr>
         <w:pStyle w:val="Heading2"/>
@@ -32642,8 +32703,8 @@
         <w:t xml:space="preserve">.</w:t>
       </w:r>
     </w:p>
-    <w:bookmarkEnd w:id="130"/>
-    <w:bookmarkStart w:id="131" w:name="Xf2f7485d70beffd103f971a7922053b05c3ecf6"/>
+    <w:bookmarkEnd w:id="131"/>
+    <w:bookmarkStart w:id="132" w:name="Xf2f7485d70beffd103f971a7922053b05c3ecf6"/>
     <w:p>
       <w:pPr>
         <w:pStyle w:val="Heading2"/>
@@ -33023,8 +33084,8 @@
         </w:tc>
       </w:tr>
     </w:tbl>
-    <w:bookmarkEnd w:id="131"/>
-    <w:bookmarkStart w:id="132" w:name="X879c20bd81f773563360b51d1c8c8dc0e01066d"/>
+    <w:bookmarkEnd w:id="132"/>
+    <w:bookmarkStart w:id="133" w:name="X879c20bd81f773563360b51d1c8c8dc0e01066d"/>
     <w:p>
       <w:pPr>
         <w:pStyle w:val="Heading2"/>
@@ -33441,8 +33502,8 @@
         </w:tc>
       </w:tr>
     </w:tbl>
-    <w:bookmarkEnd w:id="132"/>
-    <w:bookmarkStart w:id="133" w:name="Xce7bbfc5ef721651c4e0972c8d194748eea111a"/>
+    <w:bookmarkEnd w:id="133"/>
+    <w:bookmarkStart w:id="134" w:name="Xce7bbfc5ef721651c4e0972c8d194748eea111a"/>
     <w:p>
       <w:pPr>
         <w:pStyle w:val="Heading2"/>
@@ -33991,8 +34052,8 @@
         <w:t xml:space="preserve">đáp án, và 10 câu bổ sung).</w:t>
       </w:r>
     </w:p>
-    <w:bookmarkEnd w:id="133"/>
-    <w:bookmarkStart w:id="135" w:name="X662ca9157d20a2cc4af1bb6a47ef2df7bda09ac"/>
+    <w:bookmarkEnd w:id="134"/>
+    <w:bookmarkStart w:id="136" w:name="X662ca9157d20a2cc4af1bb6a47ef2df7bda09ac"/>
     <w:p>
       <w:pPr>
         <w:pStyle w:val="Heading2"/>
@@ -34005,11 +34066,11 @@
       <w:pPr>
         <w:pStyle w:val="Heading3"/>
       </w:pPr>
-      <w:bookmarkStart w:id="134" w:name="Xfadda7d3cc3c70c4b2c1a5cb5bb6bcf7e4a5e28"/>
+      <w:bookmarkStart w:id="135" w:name="Xfadda7d3cc3c70c4b2c1a5cb5bb6bcf7e4a5e28"/>
       <w:r>
         <w:t xml:space="preserve">⚠ CẦN NGƯỜI DÙNG ĐIỀN TRƯỚC KHI NỘP</w:t>
       </w:r>
-      <w:bookmarkEnd w:id="134"/>
+      <w:bookmarkEnd w:id="135"/>
     </w:p>
     <w:p>
       <w:pPr>
@@ -34302,8 +34363,8 @@
         <w:t xml:space="preserve">tạo commit giả cho người khác, không backdate commit.</w:t>
       </w:r>
     </w:p>
-    <w:bookmarkEnd w:id="135"/>
-    <w:bookmarkStart w:id="136" w:name="X3b7b8bb8a50e825a47a258ce08df0e6b8d32a9b"/>
+    <w:bookmarkEnd w:id="136"/>
+    <w:bookmarkStart w:id="137" w:name="X3b7b8bb8a50e825a47a258ce08df0e6b8d32a9b"/>
     <w:p>
       <w:pPr>
         <w:pStyle w:val="Heading2"/>
@@ -34533,8 +34594,8 @@
         <w:t xml:space="preserve">artifact, nên tài liệu không thể lệch số mà không bị test bắt.</w:t>
       </w:r>
     </w:p>
-    <w:bookmarkEnd w:id="136"/>
     <w:bookmarkEnd w:id="137"/>
+    <w:bookmarkEnd w:id="138"/>
     <w:sectPr>
       <w:footnotePr>
         <w:numRestart w:val="eachSect"/>

</xml_diff>

<commit_message>
GĐ4: dựng lại bản phát hành + CI chạy trên máy khác
- release/final_report.pdf: 25 trang A4 (giữ trong giới hạn <= 25).
- release/final_report.docx, release/slides.pptx: 11 slide (1 bìa + 10 nội dung).
  Sinh lại từ reports/final_report.md và docs/slides-outline.md bằng
  py src\export_docs.py all. release/ bị .gitignore nên thêm bằng git add -f.
- .github/workflows/ci.yml: chạy trên ubuntu-latest, Python 3.12.
  * job clean-clone: pip install -r requirements.txt rồi pytest -q (chưa có dữ
    liệu), yêu cầu 0 failed / 0 error (skip được).
  * job full-pipeline: tải UCI rồi chạy đúng thứ tự README (download_data, data,
    eda, train, experiments, freeze_serving_policy --check, evaluate,
    postprocess_audit, uncertainty_audit) rồi pytest -q.
  Không dùng continue-on-error.
</commit_message>
<xml_diff>
--- a/release/final_report.docx
+++ b/release/final_report.docx
@@ -286,7 +286,7 @@
               <w:pStyle w:val="Compact"/>
             </w:pPr>
             <w:r>
-              <w:t xml:space="preserve">Đã chạy thật: 385 test pass, 0 fail; server</w:t>
+              <w:t xml:space="preserve">Đã chạy thật: 392 test pass, 0 fail; server</w:t>
             </w:r>
             <w:r>
               <w:t xml:space="preserve"> </w:t>
@@ -10912,6 +10912,178 @@
       </w:r>
     </w:p>
     <w:p>
+      <w:pPr>
+        <w:pStyle w:val="BlockText"/>
+      </w:pPr>
+      <w:r>
+        <w:rPr>
+          <w:b/>
+          <w:bCs/>
+        </w:rPr>
+        <w:t xml:space="preserve">Thứ tự thực tế (nói thẳng).</w:t>
+      </w:r>
+      <w:r>
+        <w:t xml:space="preserve"> </w:t>
+      </w:r>
+      <w:r>
+        <w:t xml:space="preserve">Thứ tự lệnh</w:t>
+      </w:r>
+      <w:r>
+        <w:t xml:space="preserve"> </w:t>
+      </w:r>
+      <w:r>
+        <w:rPr>
+          <w:rStyle w:val="VerbatimChar"/>
+        </w:rPr>
+        <w:t xml:space="preserve">train → experiments → freeze_serving_policy → evaluate</w:t>
+      </w:r>
+      <w:r>
+        <w:t xml:space="preserve"> </w:t>
+      </w:r>
+      <w:r>
+        <w:t xml:space="preserve">ở §17.2 là thứ tự</w:t>
+      </w:r>
+      <w:r>
+        <w:t xml:space="preserve"> </w:t>
+      </w:r>
+      <w:r>
+        <w:rPr>
+          <w:b/>
+          <w:bCs/>
+        </w:rPr>
+        <w:t xml:space="preserve">tái lập</w:t>
+      </w:r>
+      <w:r>
+        <w:t xml:space="preserve">, không phải nhật ký thời gian thật. Trong thực tế, FINAL</w:t>
+      </w:r>
+      <w:r>
+        <w:t xml:space="preserve"> </w:t>
+      </w:r>
+      <w:r>
+        <w:t xml:space="preserve">TEST 2018 đã được mở</w:t>
+      </w:r>
+      <w:r>
+        <w:t xml:space="preserve"> </w:t>
+      </w:r>
+      <w:r>
+        <w:rPr>
+          <w:b/>
+          <w:bCs/>
+        </w:rPr>
+        <w:t xml:space="preserve">một lần</w:t>
+      </w:r>
+      <w:r>
+        <w:t xml:space="preserve"> </w:t>
+      </w:r>
+      <w:r>
+        <w:t xml:space="preserve">trước các phân tích hậu nghiệm — giờ đêm, log-target, độ nhạy</w:t>
+      </w:r>
+      <w:r>
+        <w:t xml:space="preserve"> </w:t>
+      </w:r>
+      <w:r>
+        <w:rPr>
+          <w:rStyle w:val="VerbatimChar"/>
+        </w:rPr>
+        <w:t xml:space="preserve">alpha</w:t>
+      </w:r>
+      <w:r>
+        <w:t xml:space="preserve">, lag (</w:t>
+      </w:r>
+      <w:r>
+        <w:rPr>
+          <w:rStyle w:val="VerbatimChar"/>
+        </w:rPr>
+        <w:t xml:space="preserve">docs/project-log.md</w:t>
+      </w:r>
+      <w:r>
+        <w:t xml:space="preserve"> </w:t>
+      </w:r>
+      <w:r>
+        <w:t xml:space="preserve">và</w:t>
+      </w:r>
+      <w:r>
+        <w:t xml:space="preserve"> </w:t>
+      </w:r>
+      <w:r>
+        <w:rPr>
+          <w:rStyle w:val="VerbatimChar"/>
+        </w:rPr>
+        <w:t xml:space="preserve">reports/figures/experiments_report.md</w:t>
+      </w:r>
+      <w:r>
+        <w:t xml:space="preserve"> </w:t>
+      </w:r>
+      <w:r>
+        <w:t xml:space="preserve">ghi rõ các phân tích</w:t>
+      </w:r>
+      <w:r>
+        <w:t xml:space="preserve"> </w:t>
+      </w:r>
+      <w:r>
+        <w:t xml:space="preserve">này là "khám phá hậu nghiệm"). Các phân tích đó</w:t>
+      </w:r>
+      <w:r>
+        <w:t xml:space="preserve"> </w:t>
+      </w:r>
+      <w:r>
+        <w:rPr>
+          <w:b/>
+          <w:bCs/>
+        </w:rPr>
+        <w:t xml:space="preserve">không</w:t>
+      </w:r>
+      <w:r>
+        <w:t xml:space="preserve"> </w:t>
+      </w:r>
+      <w:r>
+        <w:t xml:space="preserve">làm thay đổi mô hình đã đóng băng, không</w:t>
+      </w:r>
+      <w:r>
+        <w:t xml:space="preserve"> </w:t>
+      </w:r>
+      <w:r>
+        <w:t xml:space="preserve">đổi</w:t>
+      </w:r>
+      <w:r>
+        <w:t xml:space="preserve"> </w:t>
+      </w:r>
+      <w:r>
+        <w:rPr>
+          <w:rStyle w:val="VerbatimChar"/>
+        </w:rPr>
+        <w:t xml:space="preserve">alpha</w:t>
+      </w:r>
+      <w:r>
+        <w:t xml:space="preserve">, không đổi đặc trưng và không đổi serving policy. Điều bảo đảm được — và là điều có ý</w:t>
+      </w:r>
+      <w:r>
+        <w:t xml:space="preserve"> </w:t>
+      </w:r>
+      <w:r>
+        <w:t xml:space="preserve">nghĩa học thuật — là</w:t>
+      </w:r>
+      <w:r>
+        <w:t xml:space="preserve"> </w:t>
+      </w:r>
+      <w:r>
+        <w:rPr>
+          <w:b/>
+          <w:bCs/>
+        </w:rPr>
+        <w:t xml:space="preserve">không có vòng lặp tối ưu nào đi qua 2018</w:t>
+      </w:r>
+      <w:r>
+        <w:t xml:space="preserve">: mọi lựa chọn vẫn chỉ dựa trên</w:t>
+      </w:r>
+      <w:r>
+        <w:t xml:space="preserve"> </w:t>
+      </w:r>
+      <w:r>
+        <w:t xml:space="preserve">TRAIN + VALIDATION 2012–2017.</w:t>
+      </w:r>
+    </w:p>
+    <w:p>
       <w:r>
         <w:pict>
           <v:rect style="width:0;height:1.5pt" o:hralign="center" o:hrstd="t" o:hr="t"/>
@@ -17844,7 +18016,7 @@
     </w:p>
     <w:bookmarkEnd w:id="82"/>
     <w:bookmarkEnd w:id="83"/>
-    <w:bookmarkStart w:id="96" w:name="X27c3a2a8eef02d2a7dfbcde44cbe585a3e0704c"/>
+    <w:bookmarkStart w:id="97" w:name="X27c3a2a8eef02d2a7dfbcde44cbe585a3e0704c"/>
     <w:p>
       <w:pPr>
         <w:pStyle w:val="Heading1"/>
@@ -17932,7 +18104,645 @@
         <w:t xml:space="preserve">.</w:t>
       </w:r>
     </w:p>
-    <w:bookmarkStart w:id="84" w:name="X583e70f65b92057a543fd89f08087d38d2c21b6"/>
+    <w:bookmarkStart w:id="84" w:name="X3b384ceef3ed17cb23d66312929609012448aae"/>
+    <w:p>
+      <w:pPr>
+        <w:pStyle w:val="Heading2"/>
+      </w:pPr>
+      <w:r>
+        <w:t xml:space="preserve">Bảng đối chiếu: 4 thí nghiệm BẮT BUỘC của đề ↔ mục báo cáo ↔ artifact / hình</w:t>
+      </w:r>
+    </w:p>
+    <w:tbl>
+      <w:tblPr>
+        <w:tblStyle w:val="Table"/>
+        <w:tblW w:type="auto" w:w="0"/>
+        <w:tblLook w:firstRow="1" w:lastRow="0" w:firstColumn="0" w:lastColumn="0" w:noHBand="0" w:noVBand="0" w:val="0020"/>
+      </w:tblPr>
+      <w:tblGrid>
+        <w:gridCol w:w="1584"/>
+        <w:gridCol w:w="1584"/>
+        <w:gridCol w:w="1584"/>
+        <w:gridCol w:w="1584"/>
+        <w:gridCol w:w="1584"/>
+      </w:tblGrid>
+      <w:tr>
+        <w:trPr>
+          <w:tblHeader w:val="on"/>
+        </w:trPr>
+        <w:tc>
+          <w:tcPr/>
+          <w:p>
+            <w:pPr>
+              <w:pStyle w:val="Compact"/>
+            </w:pPr>
+            <w:r>
+              <w:t xml:space="preserve">#</w:t>
+            </w:r>
+          </w:p>
+        </w:tc>
+        <w:tc>
+          <w:tcPr/>
+          <w:p>
+            <w:pPr>
+              <w:pStyle w:val="Compact"/>
+            </w:pPr>
+            <w:r>
+              <w:t xml:space="preserve">Thí nghiệm bắt buộc của đề</w:t>
+            </w:r>
+          </w:p>
+        </w:tc>
+        <w:tc>
+          <w:tcPr/>
+          <w:p>
+            <w:pPr>
+              <w:pStyle w:val="Compact"/>
+            </w:pPr>
+            <w:r>
+              <w:t xml:space="preserve">Mục trong báo cáo</w:t>
+            </w:r>
+          </w:p>
+        </w:tc>
+        <w:tc>
+          <w:tcPr/>
+          <w:p>
+            <w:pPr>
+              <w:pStyle w:val="Compact"/>
+            </w:pPr>
+            <w:r>
+              <w:t xml:space="preserve">Khoá JSON / file artifact</w:t>
+            </w:r>
+          </w:p>
+        </w:tc>
+        <w:tc>
+          <w:tcPr/>
+          <w:p>
+            <w:pPr>
+              <w:pStyle w:val="Compact"/>
+            </w:pPr>
+            <w:r>
+              <w:t xml:space="preserve">Hình</w:t>
+            </w:r>
+          </w:p>
+        </w:tc>
+      </w:tr>
+      <w:tr>
+        <w:tc>
+          <w:tcPr/>
+          <w:p>
+            <w:pPr>
+              <w:pStyle w:val="Compact"/>
+            </w:pPr>
+            <w:r>
+              <w:t xml:space="preserve">1</w:t>
+            </w:r>
+          </w:p>
+        </w:tc>
+        <w:tc>
+          <w:tcPr/>
+          <w:p>
+            <w:pPr>
+              <w:pStyle w:val="Compact"/>
+            </w:pPr>
+            <w:r>
+              <w:rPr>
+                <w:b/>
+                <w:bCs/>
+              </w:rPr>
+              <w:t xml:space="preserve">Random split và time split</w:t>
+            </w:r>
+          </w:p>
+        </w:tc>
+        <w:tc>
+          <w:tcPr/>
+          <w:p>
+            <w:pPr>
+              <w:pStyle w:val="Compact"/>
+            </w:pPr>
+            <w:r>
+              <w:t xml:space="preserve">§11.1 (Thí nghiệm 1), §11.2 (1b), §11.3 (1c)</w:t>
+            </w:r>
+          </w:p>
+        </w:tc>
+        <w:tc>
+          <w:tcPr/>
+          <w:p>
+            <w:pPr>
+              <w:pStyle w:val="Compact"/>
+            </w:pPr>
+            <w:r>
+              <w:rPr>
+                <w:rStyle w:val="VerbatimChar"/>
+              </w:rPr>
+              <w:t xml:space="preserve">reports/figures/experiments_results.json</w:t>
+            </w:r>
+            <w:r>
+              <w:t xml:space="preserve"> </w:t>
+            </w:r>
+            <w:r>
+              <w:t xml:space="preserve">→</w:t>
+            </w:r>
+            <w:r>
+              <w:t xml:space="preserve"> </w:t>
+            </w:r>
+            <w:r>
+              <w:rPr>
+                <w:rStyle w:val="VerbatimChar"/>
+              </w:rPr>
+              <w:t xml:space="preserve">experiment_1_random_vs_time_split</w:t>
+            </w:r>
+            <w:r>
+              <w:t xml:space="preserve">,</w:t>
+            </w:r>
+            <w:r>
+              <w:t xml:space="preserve"> </w:t>
+            </w:r>
+            <w:r>
+              <w:rPr>
+                <w:rStyle w:val="VerbatimChar"/>
+              </w:rPr>
+              <w:t xml:space="preserve">experiment_1b_leakage_controlled</w:t>
+            </w:r>
+            <w:r>
+              <w:t xml:space="preserve">,</w:t>
+            </w:r>
+            <w:r>
+              <w:t xml:space="preserve"> </w:t>
+            </w:r>
+            <w:r>
+              <w:rPr>
+                <w:rStyle w:val="VerbatimChar"/>
+              </w:rPr>
+              <w:t xml:space="preserve">experiment_1c_block_neighbour</w:t>
+            </w:r>
+          </w:p>
+        </w:tc>
+        <w:tc>
+          <w:tcPr/>
+          <w:p>
+            <w:pPr>
+              <w:pStyle w:val="Compact"/>
+            </w:pPr>
+            <w:r>
+              <w:rPr>
+                <w:rStyle w:val="VerbatimChar"/>
+              </w:rPr>
+              <w:t xml:space="preserve">eda_traffic_by_month_year.png</w:t>
+            </w:r>
+          </w:p>
+        </w:tc>
+      </w:tr>
+      <w:tr>
+        <w:tc>
+          <w:tcPr/>
+          <w:p>
+            <w:pPr>
+              <w:pStyle w:val="Compact"/>
+            </w:pPr>
+            <w:r>
+              <w:t xml:space="preserve">2</w:t>
+            </w:r>
+          </w:p>
+        </w:tc>
+        <w:tc>
+          <w:tcPr/>
+          <w:p>
+            <w:pPr>
+              <w:pStyle w:val="Compact"/>
+            </w:pPr>
+            <w:r>
+              <w:rPr>
+                <w:b/>
+                <w:bCs/>
+              </w:rPr>
+              <w:t xml:space="preserve">Baseline và mô hình</w:t>
+            </w:r>
+          </w:p>
+        </w:tc>
+        <w:tc>
+          <w:tcPr/>
+          <w:p>
+            <w:pPr>
+              <w:pStyle w:val="Compact"/>
+            </w:pPr>
+            <w:r>
+              <w:t xml:space="preserve">§7.1 (baseline), §7.2 (Ridge), §9.1 (kết quả FINAL TEST)</w:t>
+            </w:r>
+          </w:p>
+        </w:tc>
+        <w:tc>
+          <w:tcPr/>
+          <w:p>
+            <w:pPr>
+              <w:pStyle w:val="Compact"/>
+            </w:pPr>
+            <w:r>
+              <w:rPr>
+                <w:rStyle w:val="VerbatimChar"/>
+              </w:rPr>
+              <w:t xml:space="preserve">reports/figures/evaluation_results.json</w:t>
+            </w:r>
+            <w:r>
+              <w:t xml:space="preserve"> </w:t>
+            </w:r>
+            <w:r>
+              <w:t xml:space="preserve">→</w:t>
+            </w:r>
+            <w:r>
+              <w:t xml:space="preserve"> </w:t>
+            </w:r>
+            <w:r>
+              <w:rPr>
+                <w:rStyle w:val="VerbatimChar"/>
+              </w:rPr>
+              <w:t xml:space="preserve">final_test.baseline</w:t>
+            </w:r>
+            <w:r>
+              <w:t xml:space="preserve">,</w:t>
+            </w:r>
+            <w:r>
+              <w:t xml:space="preserve"> </w:t>
+            </w:r>
+            <w:r>
+              <w:rPr>
+                <w:rStyle w:val="VerbatimChar"/>
+              </w:rPr>
+              <w:t xml:space="preserve">final_test.ridge</w:t>
+            </w:r>
+            <w:r>
+              <w:t xml:space="preserve">;</w:t>
+            </w:r>
+            <w:r>
+              <w:t xml:space="preserve"> </w:t>
+            </w:r>
+            <w:r>
+              <w:rPr>
+                <w:rStyle w:val="VerbatimChar"/>
+              </w:rPr>
+              <w:t xml:space="preserve">models/model_metadata.json</w:t>
+            </w:r>
+          </w:p>
+        </w:tc>
+        <w:tc>
+          <w:tcPr/>
+          <w:p>
+            <w:pPr>
+              <w:pStyle w:val="Compact"/>
+            </w:pPr>
+            <w:r>
+              <w:rPr>
+                <w:rStyle w:val="VerbatimChar"/>
+              </w:rPr>
+              <w:t xml:space="preserve">final_mae_by_hour_dow.png</w:t>
+            </w:r>
+          </w:p>
+        </w:tc>
+      </w:tr>
+      <w:tr>
+        <w:tc>
+          <w:tcPr/>
+          <w:p>
+            <w:pPr>
+              <w:pStyle w:val="Compact"/>
+            </w:pPr>
+            <w:r>
+              <w:t xml:space="preserve">3</w:t>
+            </w:r>
+          </w:p>
+        </w:tc>
+        <w:tc>
+          <w:tcPr/>
+          <w:p>
+            <w:pPr>
+              <w:pStyle w:val="Compact"/>
+            </w:pPr>
+            <w:r>
+              <w:rPr>
+                <w:b/>
+                <w:bCs/>
+              </w:rPr>
+              <w:t xml:space="preserve">Drift theo năm / mùa (rolling-origin, PSI)</w:t>
+            </w:r>
+          </w:p>
+        </w:tc>
+        <w:tc>
+          <w:tcPr/>
+          <w:p>
+            <w:pPr>
+              <w:pStyle w:val="Compact"/>
+            </w:pPr>
+            <w:r>
+              <w:t xml:space="preserve">§11.4 (Thí nghiệm 3 — rolling-origin), §11.7 (Thí nghiệm 3b — PSI)</w:t>
+            </w:r>
+          </w:p>
+        </w:tc>
+        <w:tc>
+          <w:tcPr/>
+          <w:p>
+            <w:pPr>
+              <w:pStyle w:val="Compact"/>
+            </w:pPr>
+            <w:r>
+              <w:rPr>
+                <w:rStyle w:val="VerbatimChar"/>
+              </w:rPr>
+              <w:t xml:space="preserve">reports/figures/experiments_results.json</w:t>
+            </w:r>
+            <w:r>
+              <w:t xml:space="preserve"> </w:t>
+            </w:r>
+            <w:r>
+              <w:t xml:space="preserve">→</w:t>
+            </w:r>
+            <w:r>
+              <w:t xml:space="preserve"> </w:t>
+            </w:r>
+            <w:r>
+              <w:rPr>
+                <w:rStyle w:val="VerbatimChar"/>
+              </w:rPr>
+              <w:t xml:space="preserve">experiment_3_rolling_origin</w:t>
+            </w:r>
+            <w:r>
+              <w:t xml:space="preserve">,</w:t>
+            </w:r>
+            <w:r>
+              <w:t xml:space="preserve"> </w:t>
+            </w:r>
+            <w:r>
+              <w:rPr>
+                <w:rStyle w:val="VerbatimChar"/>
+              </w:rPr>
+              <w:t xml:space="preserve">experiment_3b_covariate_drift</w:t>
+            </w:r>
+          </w:p>
+        </w:tc>
+        <w:tc>
+          <w:tcPr/>
+          <w:p>
+            <w:pPr>
+              <w:pStyle w:val="Compact"/>
+            </w:pPr>
+            <w:r>
+              <w:t xml:space="preserve">— (bảng số; hình</w:t>
+            </w:r>
+            <w:r>
+              <w:t xml:space="preserve"> </w:t>
+            </w:r>
+            <w:r>
+              <w:rPr>
+                <w:rStyle w:val="VerbatimChar"/>
+              </w:rPr>
+              <w:t xml:space="preserve">eda_weather_distribution.png</w:t>
+            </w:r>
+            <w:r>
+              <w:t xml:space="preserve"> </w:t>
+            </w:r>
+            <w:r>
+              <w:t xml:space="preserve">minh hoạ phân bố)</w:t>
+            </w:r>
+          </w:p>
+        </w:tc>
+      </w:tr>
+      <w:tr>
+        <w:tc>
+          <w:tcPr/>
+          <w:p>
+            <w:pPr>
+              <w:pStyle w:val="Compact"/>
+            </w:pPr>
+            <w:r>
+              <w:t xml:space="preserve">4</w:t>
+            </w:r>
+          </w:p>
+        </w:tc>
+        <w:tc>
+          <w:tcPr/>
+          <w:p>
+            <w:pPr>
+              <w:pStyle w:val="Compact"/>
+            </w:pPr>
+            <w:r>
+              <w:rPr>
+                <w:b/>
+                <w:bCs/>
+              </w:rPr>
+              <w:t xml:space="preserve">Phân tích lỗi ngày lễ và thời tiết cực đoan</w:t>
+            </w:r>
+          </w:p>
+        </w:tc>
+        <w:tc>
+          <w:tcPr/>
+          <w:p>
+            <w:pPr>
+              <w:pStyle w:val="Compact"/>
+            </w:pPr>
+            <w:r>
+              <w:t xml:space="preserve">§10.3 (ngày lễ), §10.4 (thời tiết), §10.5 (thời tiết cực đoan)</w:t>
+            </w:r>
+          </w:p>
+        </w:tc>
+        <w:tc>
+          <w:tcPr/>
+          <w:p>
+            <w:pPr>
+              <w:pStyle w:val="Compact"/>
+            </w:pPr>
+            <w:r>
+              <w:rPr>
+                <w:rStyle w:val="VerbatimChar"/>
+              </w:rPr>
+              <w:t xml:space="preserve">reports/figures/evaluation_results.json</w:t>
+            </w:r>
+            <w:r>
+              <w:t xml:space="preserve"> </w:t>
+            </w:r>
+            <w:r>
+              <w:t xml:space="preserve">→</w:t>
+            </w:r>
+            <w:r>
+              <w:t xml:space="preserve"> </w:t>
+            </w:r>
+            <w:r>
+              <w:rPr>
+                <w:rStyle w:val="VerbatimChar"/>
+              </w:rPr>
+              <w:t xml:space="preserve">error_analysis.holiday</w:t>
+            </w:r>
+            <w:r>
+              <w:t xml:space="preserve">,</w:t>
+            </w:r>
+            <w:r>
+              <w:t xml:space="preserve"> </w:t>
+            </w:r>
+            <w:r>
+              <w:rPr>
+                <w:rStyle w:val="VerbatimChar"/>
+              </w:rPr>
+              <w:t xml:space="preserve">error_analysis.weather_main</w:t>
+            </w:r>
+            <w:r>
+              <w:t xml:space="preserve">,</w:t>
+            </w:r>
+            <w:r>
+              <w:t xml:space="preserve"> </w:t>
+            </w:r>
+            <w:r>
+              <w:rPr>
+                <w:rStyle w:val="VerbatimChar"/>
+              </w:rPr>
+              <w:t xml:space="preserve">error_analysis.extreme_weather</w:t>
+            </w:r>
+          </w:p>
+        </w:tc>
+        <w:tc>
+          <w:tcPr/>
+          <w:p>
+            <w:pPr>
+              <w:pStyle w:val="Compact"/>
+            </w:pPr>
+            <w:r>
+              <w:rPr>
+                <w:rStyle w:val="VerbatimChar"/>
+              </w:rPr>
+              <w:t xml:space="preserve">final_mae_by_weather.png</w:t>
+            </w:r>
+          </w:p>
+        </w:tc>
+      </w:tr>
+    </w:tbl>
+    <w:p>
+      <w:pPr>
+        <w:pStyle w:val="BlockText"/>
+      </w:pPr>
+      <w:r>
+        <w:t xml:space="preserve">⚠️</w:t>
+      </w:r>
+      <w:r>
+        <w:t xml:space="preserve"> </w:t>
+      </w:r>
+      <w:r>
+        <w:rPr>
+          <w:b/>
+          <w:bCs/>
+        </w:rPr>
+        <w:t xml:space="preserve">Đừng nhầm "Thí nghiệm 4" giữa hai tài liệu.</w:t>
+      </w:r>
+      <w:r>
+        <w:t xml:space="preserve"> </w:t>
+      </w:r>
+      <w:r>
+        <w:t xml:space="preserve">"Thí nghiệm 4" trong</w:t>
+      </w:r>
+      <w:r>
+        <w:t xml:space="preserve"> </w:t>
+      </w:r>
+      <w:r>
+        <w:rPr>
+          <w:rStyle w:val="VerbatimChar"/>
+        </w:rPr>
+        <w:t xml:space="preserve">reports/figures/experiments_report.md</w:t>
+      </w:r>
+      <w:r>
+        <w:t xml:space="preserve"> </w:t>
+      </w:r>
+      <w:r>
+        <w:t xml:space="preserve">là</w:t>
+      </w:r>
+      <w:r>
+        <w:t xml:space="preserve"> </w:t>
+      </w:r>
+      <w:r>
+        <w:rPr>
+          <w:b/>
+          <w:bCs/>
+        </w:rPr>
+        <w:t xml:space="preserve">kiểm tra giả thuyết giờ đêm</w:t>
+      </w:r>
+      <w:r>
+        <w:t xml:space="preserve"> </w:t>
+      </w:r>
+      <w:r>
+        <w:t xml:space="preserve">(tương ứng §10.7 của</w:t>
+      </w:r>
+      <w:r>
+        <w:t xml:space="preserve"> </w:t>
+      </w:r>
+      <w:r>
+        <w:t xml:space="preserve">báo cáo này) —</w:t>
+      </w:r>
+      <w:r>
+        <w:t xml:space="preserve"> </w:t>
+      </w:r>
+      <w:r>
+        <w:rPr>
+          <w:b/>
+          <w:bCs/>
+        </w:rPr>
+        <w:t xml:space="preserve">KHÁC</w:t>
+      </w:r>
+      <w:r>
+        <w:t xml:space="preserve"> </w:t>
+      </w:r>
+      <w:r>
+        <w:t xml:space="preserve">với</w:t>
+      </w:r>
+      <w:r>
+        <w:t xml:space="preserve"> </w:t>
+      </w:r>
+      <w:r>
+        <w:rPr>
+          <w:b/>
+          <w:bCs/>
+        </w:rPr>
+        <w:t xml:space="preserve">thí nghiệm 4 bắt buộc của đề</w:t>
+      </w:r>
+      <w:r>
+        <w:t xml:space="preserve"> </w:t>
+      </w:r>
+      <w:r>
+        <w:t xml:space="preserve">ở bảng trên (phân tích lỗi ngày lễ +</w:t>
+      </w:r>
+      <w:r>
+        <w:t xml:space="preserve"> </w:t>
+      </w:r>
+      <w:r>
+        <w:t xml:space="preserve">thời tiết cực đoan). Số hiệu "Thí nghiệm 1–8" trong</w:t>
+      </w:r>
+      <w:r>
+        <w:t xml:space="preserve"> </w:t>
+      </w:r>
+      <w:r>
+        <w:rPr>
+          <w:rStyle w:val="VerbatimChar"/>
+        </w:rPr>
+        <w:t xml:space="preserve">experiments_report.md</w:t>
+      </w:r>
+      <w:r>
+        <w:t xml:space="preserve"> </w:t>
+      </w:r>
+      <w:r>
+        <w:t xml:space="preserve">là đánh số</w:t>
+      </w:r>
+      <w:r>
+        <w:t xml:space="preserve"> </w:t>
+      </w:r>
+      <w:r>
+        <w:rPr>
+          <w:b/>
+          <w:bCs/>
+        </w:rPr>
+        <w:t xml:space="preserve">nội bộ</w:t>
+      </w:r>
+      <w:r>
+        <w:t xml:space="preserve"> </w:t>
+      </w:r>
+      <w:r>
+        <w:t xml:space="preserve">của giai đoạn phát triển 2012–2017, không trùng với cách đánh số 4 thí nghiệm bắt buộc của đề.</w:t>
+      </w:r>
+    </w:p>
+    <w:bookmarkEnd w:id="84"/>
+    <w:bookmarkStart w:id="85" w:name="X583e70f65b92057a543fd89f08087d38d2c21b6"/>
     <w:p>
       <w:pPr>
         <w:pStyle w:val="Heading2"/>
@@ -18962,8 +19772,8 @@
         <w:t xml:space="preserve">.</w:t>
       </w:r>
     </w:p>
-    <w:bookmarkEnd w:id="84"/>
-    <w:bookmarkStart w:id="85" w:name="Xf7c972d6d1f6bef144859aecd17481785413ab7"/>
+    <w:bookmarkEnd w:id="85"/>
+    <w:bookmarkStart w:id="86" w:name="Xf7c972d6d1f6bef144859aecd17481785413ab7"/>
     <w:p>
       <w:pPr>
         <w:pStyle w:val="Heading2"/>
@@ -19756,8 +20566,8 @@
         <w:t xml:space="preserve">lượng riêng của năm 2017, và việc có dữ liệu ở đúng các tháng của tập test.</w:t>
       </w:r>
     </w:p>
-    <w:bookmarkEnd w:id="85"/>
-    <w:bookmarkStart w:id="86" w:name="Xf9c7434cc68759990523be38a4f84a3768b34e1"/>
+    <w:bookmarkEnd w:id="86"/>
+    <w:bookmarkStart w:id="87" w:name="Xf9c7434cc68759990523be38a4f84a3768b34e1"/>
     <w:p>
       <w:pPr>
         <w:pStyle w:val="Heading2"/>
@@ -20597,8 +21407,8 @@
         <w:t xml:space="preserve">tháng hay tháng khác). Đó mới là lý do trung thực để giữ FINAL TEST 2018 nguyên vẹn.</w:t>
       </w:r>
     </w:p>
-    <w:bookmarkEnd w:id="86"/>
-    <w:bookmarkStart w:id="87" w:name="X9a8e9e291ef07c7d5a752041fdaccdc75d9c2ba"/>
+    <w:bookmarkEnd w:id="87"/>
+    <w:bookmarkStart w:id="88" w:name="X9a8e9e291ef07c7d5a752041fdaccdc75d9c2ba"/>
     <w:p>
       <w:pPr>
         <w:pStyle w:val="Heading2"/>
@@ -21105,8 +21915,8 @@
         <w:t xml:space="preserve">phân bố, xem §11.7).</w:t>
       </w:r>
     </w:p>
-    <w:bookmarkEnd w:id="87"/>
-    <w:bookmarkStart w:id="91" w:name="Xb1d6773e3cfef76744a1306cce8bada74921da9"/>
+    <w:bookmarkEnd w:id="88"/>
+    <w:bookmarkStart w:id="92" w:name="Xb1d6773e3cfef76744a1306cce8bada74921da9"/>
     <w:p>
       <w:pPr>
         <w:pStyle w:val="Heading2"/>
@@ -21156,7 +21966,7 @@
         <w:t xml:space="preserve">(mục 8). Chỉ dùng dữ liệu 2012–2017.</w:t>
       </w:r>
     </w:p>
-    <w:bookmarkStart w:id="88" w:name="X3326ed4ca178ff5015c3bc70db159eaa62891f9"/>
+    <w:bookmarkStart w:id="89" w:name="X3326ed4ca178ff5015c3bc70db159eaa62891f9"/>
     <w:p>
       <w:pPr>
         <w:pStyle w:val="Heading3"/>
@@ -21359,8 +22169,8 @@
         <w:t xml:space="preserve">loại dòng nào vì dữ liệu thiếu sẵn.</w:t>
       </w:r>
     </w:p>
-    <w:bookmarkEnd w:id="88"/>
-    <w:bookmarkStart w:id="89" w:name="Xf1b19125329c924ceda399f706abfbf2934f670"/>
+    <w:bookmarkEnd w:id="89"/>
+    <w:bookmarkStart w:id="90" w:name="Xf1b19125329c924ceda399f706abfbf2934f670"/>
     <w:p>
       <w:pPr>
         <w:pStyle w:val="Heading3"/>
@@ -21946,8 +22756,8 @@
         <w:t xml:space="preserve">, không phải bằng phỏng đoán.</w:t>
       </w:r>
     </w:p>
-    <w:bookmarkEnd w:id="89"/>
-    <w:bookmarkStart w:id="90" w:name="X97e0ead9a6b07d0d0c3e5c52228564aac245610"/>
+    <w:bookmarkEnd w:id="90"/>
+    <w:bookmarkStart w:id="91" w:name="X97e0ead9a6b07d0d0c3e5c52228564aac245610"/>
     <w:p>
       <w:pPr>
         <w:pStyle w:val="Heading3"/>
@@ -22186,9 +22996,9 @@
         <w:t xml:space="preserve">dựng lag và kiểm thử train-serving skew cho đặc trưng lag.</w:t>
       </w:r>
     </w:p>
-    <w:bookmarkEnd w:id="90"/>
     <w:bookmarkEnd w:id="91"/>
-    <w:bookmarkStart w:id="95" w:name="X93be6fd535388f0392fc4361a7cf52059407d93"/>
+    <w:bookmarkEnd w:id="92"/>
+    <w:bookmarkStart w:id="96" w:name="X93be6fd535388f0392fc4361a7cf52059407d93"/>
     <w:p>
       <w:pPr>
         <w:pStyle w:val="Heading2"/>
@@ -22700,18 +23510,18 @@
           <wp:inline>
             <wp:extent cx="5334000" cy="3000375"/>
             <wp:effectExtent b="0" l="0" r="0" t="0"/>
-            <wp:docPr descr="Phân bố thời tiết trên TRAIN" title="" id="93" name="Picture"/>
+            <wp:docPr descr="Phân bố thời tiết trên TRAIN" title="" id="94" name="Picture"/>
             <a:graphic>
               <a:graphicData uri="http://schemas.openxmlformats.org/drawingml/2006/picture">
                 <pic:pic>
                   <pic:nvPicPr>
-                    <pic:cNvPr descr="reports/figures/eda_weather_distribution.png" id="94" name="Picture"/>
+                    <pic:cNvPr descr="reports/figures/eda_weather_distribution.png" id="95" name="Picture"/>
                     <pic:cNvPicPr>
                       <a:picLocks noChangeArrowheads="1" noChangeAspect="1"/>
                     </pic:cNvPicPr>
                   </pic:nvPicPr>
                   <pic:blipFill>
-                    <a:blip r:embed="rId92"/>
+                    <a:blip r:embed="rId93"/>
                     <a:stretch>
                       <a:fillRect/>
                     </a:stretch>
@@ -22779,9 +23589,9 @@
         </w:pict>
       </w:r>
     </w:p>
-    <w:bookmarkEnd w:id="95"/>
     <w:bookmarkEnd w:id="96"/>
-    <w:bookmarkStart w:id="110" w:name="X923ed692b556b25f23fa302ee5f7131fde6843e"/>
+    <w:bookmarkEnd w:id="97"/>
+    <w:bookmarkStart w:id="111" w:name="X923ed692b556b25f23fa302ee5f7131fde6843e"/>
     <w:p>
       <w:pPr>
         <w:pStyle w:val="Heading1"/>
@@ -22790,7 +23600,7 @@
         <w:t xml:space="preserve">12. Ứng dụng Web / API</w:t>
       </w:r>
     </w:p>
-    <w:bookmarkStart w:id="97" w:name="X943c6d49ea1cb60779cce6b2246a254541edf05"/>
+    <w:bookmarkStart w:id="98" w:name="X943c6d49ea1cb60779cce6b2246a254541edf05"/>
     <w:p>
       <w:pPr>
         <w:pStyle w:val="Heading2"/>
@@ -23245,8 +24055,8 @@
         <w:t xml:space="preserve">.</w:t>
       </w:r>
     </w:p>
-    <w:bookmarkEnd w:id="97"/>
-    <w:bookmarkStart w:id="98" w:name="Xd178488c5929f6e5c733b8c3ecd99011f9450be"/>
+    <w:bookmarkEnd w:id="98"/>
+    <w:bookmarkStart w:id="99" w:name="Xd178488c5929f6e5c733b8c3ecd99011f9450be"/>
     <w:p>
       <w:pPr>
         <w:pStyle w:val="Heading2"/>
@@ -23752,8 +24562,8 @@
         <w:t xml:space="preserve">, chỉ dùng khi dự báo nằm ngoài bảng lịch.</w:t>
       </w:r>
     </w:p>
-    <w:bookmarkEnd w:id="98"/>
-    <w:bookmarkStart w:id="99" w:name="X28b26a22d9b425f4e3a09bbb7168bac56e4dcf4"/>
+    <w:bookmarkEnd w:id="99"/>
+    <w:bookmarkStart w:id="100" w:name="X28b26a22d9b425f4e3a09bbb7168bac56e4dcf4"/>
     <w:p>
       <w:pPr>
         <w:pStyle w:val="Heading2"/>
@@ -24019,8 +24829,8 @@
         <w:t xml:space="preserve">artifact để bảo đảm điều này không thoát.</w:t>
       </w:r>
     </w:p>
-    <w:bookmarkEnd w:id="99"/>
-    <w:bookmarkStart w:id="100" w:name="Xb00fda29d0b153002b2ed4fd02fb1a57d6baec7"/>
+    <w:bookmarkEnd w:id="100"/>
+    <w:bookmarkStart w:id="101" w:name="Xb00fda29d0b153002b2ed4fd02fb1a57d6baec7"/>
     <w:p>
       <w:pPr>
         <w:pStyle w:val="Heading2"/>
@@ -24695,8 +25505,8 @@
         <w:t xml:space="preserve">gửi liên tiếp 5 payload sai rồi xác nhận request hợp lệ vẫn trả 200.</w:t>
       </w:r>
     </w:p>
-    <w:bookmarkEnd w:id="100"/>
-    <w:bookmarkStart w:id="108" w:name="X229873d7c73bd506cfbc5de39da92f46e030625"/>
+    <w:bookmarkEnd w:id="101"/>
+    <w:bookmarkStart w:id="109" w:name="X229873d7c73bd506cfbc5de39da92f46e030625"/>
     <w:p>
       <w:pPr>
         <w:pStyle w:val="Heading2"/>
@@ -24784,7 +25594,7 @@
         <w:t xml:space="preserve">và đóng băng quyết định trước.</w:t>
       </w:r>
     </w:p>
-    <w:bookmarkStart w:id="101" w:name="X7148e7eb759061f1b2193c97c5a0ace545f72ad"/>
+    <w:bookmarkStart w:id="102" w:name="X7148e7eb759061f1b2193c97c5a0ace545f72ad"/>
     <w:p>
       <w:pPr>
         <w:pStyle w:val="Heading3"/>
@@ -25591,8 +26401,8 @@
         <w:t xml:space="preserve">đúng thứ tự này.</w:t>
       </w:r>
     </w:p>
-    <w:bookmarkEnd w:id="101"/>
-    <w:bookmarkStart w:id="102" w:name="X935b205844204b01a5e2a64e05c805379de1dc9"/>
+    <w:bookmarkEnd w:id="102"/>
+    <w:bookmarkStart w:id="103" w:name="X935b205844204b01a5e2a64e05c805379de1dc9"/>
     <w:p>
       <w:pPr>
         <w:pStyle w:val="Heading3"/>
@@ -25775,8 +26585,8 @@
         <w:t xml:space="preserve">. Chi tiết ở README.</w:t>
       </w:r>
     </w:p>
-    <w:bookmarkEnd w:id="102"/>
-    <w:bookmarkStart w:id="103" w:name="Xa25338e2e370f5c49d634bb298396c4463636c9"/>
+    <w:bookmarkEnd w:id="103"/>
+    <w:bookmarkStart w:id="104" w:name="Xa25338e2e370f5c49d634bb298396c4463636c9"/>
     <w:p>
       <w:pPr>
         <w:pStyle w:val="Heading3"/>
@@ -26110,8 +26920,8 @@
         <w:t xml:space="preserve">).</w:t>
       </w:r>
     </w:p>
-    <w:bookmarkEnd w:id="103"/>
-    <w:bookmarkStart w:id="104" w:name="X04f809ed0b6d9611c386aade382bd977f60b295"/>
+    <w:bookmarkEnd w:id="104"/>
+    <w:bookmarkStart w:id="105" w:name="X04f809ed0b6d9611c386aade382bd977f60b295"/>
     <w:p>
       <w:pPr>
         <w:pStyle w:val="Heading3"/>
@@ -26493,8 +27303,8 @@
         <w:t xml:space="preserve">0 là sửa sai lệch của mô hình, không phải xoá sự thật.</w:t>
       </w:r>
     </w:p>
-    <w:bookmarkEnd w:id="104"/>
-    <w:bookmarkStart w:id="105" w:name="Xa80cef9c7b1b19b333f7cba984fa946aa7f1dc7"/>
+    <w:bookmarkEnd w:id="105"/>
+    <w:bookmarkStart w:id="106" w:name="Xa80cef9c7b1b19b333f7cba984fa946aa7f1dc7"/>
     <w:p>
       <w:pPr>
         <w:pStyle w:val="Heading3"/>
@@ -26697,8 +27507,8 @@
         <w:t xml:space="preserve">liệu, nên không vi phạm nguyên tắc "không học gì từ tập test".</w:t>
       </w:r>
     </w:p>
-    <w:bookmarkEnd w:id="105"/>
-    <w:bookmarkStart w:id="106" w:name="X42a8e493e3a121879784cf864891ccb8cebcef1"/>
+    <w:bookmarkEnd w:id="106"/>
+    <w:bookmarkStart w:id="107" w:name="X42a8e493e3a121879784cf864891ccb8cebcef1"/>
     <w:p>
       <w:pPr>
         <w:pStyle w:val="Heading3"/>
@@ -27050,8 +27860,8 @@
         <w:t xml:space="preserve">§10.3: mô hình chưa học được việc lưu lượng đêm ngày lễ gần bằng 0.</w:t>
       </w:r>
     </w:p>
-    <w:bookmarkEnd w:id="106"/>
-    <w:bookmarkStart w:id="107" w:name="X1d5585f166bfbb1d17107ebfad4ef368322d3fb"/>
+    <w:bookmarkEnd w:id="107"/>
+    <w:bookmarkStart w:id="108" w:name="X1d5585f166bfbb1d17107ebfad4ef368322d3fb"/>
     <w:p>
       <w:pPr>
         <w:pStyle w:val="Heading3"/>
@@ -27216,9 +28026,9 @@
         <w:t xml:space="preserve">giá đã đóng băng để khớp API — làm vậy tức là dùng kết quả 2018 để điều chỉnh mô hình.</w:t>
       </w:r>
     </w:p>
-    <w:bookmarkEnd w:id="107"/>
     <w:bookmarkEnd w:id="108"/>
-    <w:bookmarkStart w:id="109" w:name="X6ee6a873b9edf02ee27088a80b10002775f74c9"/>
+    <w:bookmarkEnd w:id="109"/>
+    <w:bookmarkStart w:id="110" w:name="X6ee6a873b9edf02ee27088a80b10002775f74c9"/>
     <w:p>
       <w:pPr>
         <w:pStyle w:val="Heading2"/>
@@ -27446,9 +28256,9 @@
         </w:pict>
       </w:r>
     </w:p>
-    <w:bookmarkEnd w:id="109"/>
     <w:bookmarkEnd w:id="110"/>
-    <w:bookmarkStart w:id="113" w:name="X53cef0c72755ded06eccfa605ea778aef4fb51f"/>
+    <w:bookmarkEnd w:id="111"/>
+    <w:bookmarkStart w:id="114" w:name="X53cef0c72755ded06eccfa605ea778aef4fb51f"/>
     <w:p>
       <w:pPr>
         <w:pStyle w:val="Heading1"/>
@@ -27495,7 +28305,7 @@
           <w:b/>
           <w:bCs/>
         </w:rPr>
-        <w:t xml:space="preserve">→ 385 passed, 0 failed.</w:t>
+        <w:t xml:space="preserve">→ 392 passed, 0 failed.</w:t>
       </w:r>
     </w:p>
     <w:tbl>
@@ -27817,7 +28627,7 @@
               <w:pStyle w:val="Compact"/>
             </w:pPr>
             <w:r>
-              <w:t xml:space="preserve">81</w:t>
+              <w:t xml:space="preserve">85</w:t>
             </w:r>
           </w:p>
         </w:tc>
@@ -27840,7 +28650,7 @@
               <w:t xml:space="preserve">/health</w:t>
             </w:r>
             <w:r>
-              <w:t xml:space="preserve">, dự báo hợp lệ, 12 ca validation sai, web route 200, dashboard lấy số từ artifact</w:t>
+              <w:t xml:space="preserve">, dự báo hợp lệ, 12 ca validation sai, cảnh báo khi thiếu mưa/tuyết, web route 200, dashboard lấy số từ artifact</w:t>
             </w:r>
           </w:p>
         </w:tc>
@@ -27867,7 +28677,7 @@
               <w:pStyle w:val="Compact"/>
             </w:pPr>
             <w:r>
-              <w:t xml:space="preserve">46</w:t>
+              <w:t xml:space="preserve">49</w:t>
             </w:r>
           </w:p>
         </w:tc>
@@ -27918,7 +28728,16 @@
               <w:t xml:space="preserve">--force</w:t>
             </w:r>
             <w:r>
-              <w:t xml:space="preserve">)</w:t>
+              <w:t xml:space="preserve">), dung sai float theo khối</w:t>
+            </w:r>
+            <w:r>
+              <w:t xml:space="preserve"> </w:t>
+            </w:r>
+            <w:r>
+              <w:rPr>
+                <w:rStyle w:val="VerbatimChar"/>
+              </w:rPr>
+              <w:t xml:space="preserve">evidence</w:t>
             </w:r>
           </w:p>
         </w:tc>
@@ -28026,7 +28845,7 @@
                 <w:b/>
                 <w:bCs/>
               </w:rPr>
-              <w:t xml:space="preserve">385</w:t>
+              <w:t xml:space="preserve">392</w:t>
             </w:r>
           </w:p>
         </w:tc>
@@ -28107,7 +28926,7 @@
         <w:t xml:space="preserve">không thể lọt.</w:t>
       </w:r>
     </w:p>
-    <w:bookmarkStart w:id="111" w:name="Xc05d1c0eeaa74dc6908c302258e0d3c31e17ad4"/>
+    <w:bookmarkStart w:id="112" w:name="Xc05d1c0eeaa74dc6908c302258e0d3c31e17ad4"/>
     <w:p>
       <w:pPr>
         <w:pStyle w:val="Heading2"/>
@@ -28396,8 +29215,8 @@
         </w:tc>
       </w:tr>
     </w:tbl>
-    <w:bookmarkEnd w:id="111"/>
-    <w:bookmarkStart w:id="112" w:name="Xb91b3854d430ce914488ce4c1fb3ac9ac7890ec"/>
+    <w:bookmarkEnd w:id="112"/>
+    <w:bookmarkStart w:id="113" w:name="Xb91b3854d430ce914488ce4c1fb3ac9ac7890ec"/>
     <w:p>
       <w:pPr>
         <w:pStyle w:val="Heading2"/>
@@ -28459,9 +29278,9 @@
         </w:pict>
       </w:r>
     </w:p>
-    <w:bookmarkEnd w:id="112"/>
     <w:bookmarkEnd w:id="113"/>
-    <w:bookmarkStart w:id="124" w:name="Xdad156229c53f75b320b788077bd8a86ade1b22"/>
+    <w:bookmarkEnd w:id="114"/>
+    <w:bookmarkStart w:id="125" w:name="Xdad156229c53f75b320b788077bd8a86ade1b22"/>
     <w:p>
       <w:pPr>
         <w:pStyle w:val="Heading1"/>
@@ -28470,7 +29289,7 @@
         <w:t xml:space="preserve">14. Model Card</w:t>
       </w:r>
     </w:p>
-    <w:bookmarkStart w:id="114" w:name="Xe42ef70e1d4c8c57c8a7f436dad24f87fbf5d28"/>
+    <w:bookmarkStart w:id="115" w:name="Xe42ef70e1d4c8c57c8a7f436dad24f87fbf5d28"/>
     <w:p>
       <w:pPr>
         <w:pStyle w:val="Heading2"/>
@@ -28808,8 +29627,8 @@
         </w:tc>
       </w:tr>
     </w:tbl>
-    <w:bookmarkEnd w:id="114"/>
-    <w:bookmarkStart w:id="115" w:name="X7b06c12df664a7fc4092dbdbf73ce7ec8bc05e2"/>
+    <w:bookmarkEnd w:id="115"/>
+    <w:bookmarkStart w:id="116" w:name="X7b06c12df664a7fc4092dbdbf73ce7ec8bc05e2"/>
     <w:p>
       <w:pPr>
         <w:pStyle w:val="Heading2"/>
@@ -29018,8 +29837,8 @@
         </w:tc>
       </w:tr>
     </w:tbl>
-    <w:bookmarkEnd w:id="115"/>
-    <w:bookmarkStart w:id="116" w:name="X6adb888e2576849c3c8b6c0eac84dee616b3b4c"/>
+    <w:bookmarkEnd w:id="116"/>
+    <w:bookmarkStart w:id="117" w:name="X6adb888e2576849c3c8b6c0eac84dee616b3b4c"/>
     <w:p>
       <w:pPr>
         <w:pStyle w:val="Heading2"/>
@@ -29183,8 +30002,8 @@
         </w:tc>
       </w:tr>
     </w:tbl>
-    <w:bookmarkEnd w:id="116"/>
-    <w:bookmarkStart w:id="117" w:name="Xbdfb83c0cffde6186a83f10788f36ddbdee6b36"/>
+    <w:bookmarkEnd w:id="117"/>
+    <w:bookmarkStart w:id="118" w:name="Xbdfb83c0cffde6186a83f10788f36ddbdee6b36"/>
     <w:p>
       <w:pPr>
         <w:pStyle w:val="Heading2"/>
@@ -29348,8 +30167,8 @@
         <w:t xml:space="preserve">trưng lag (xem §11.6).</w:t>
       </w:r>
     </w:p>
-    <w:bookmarkEnd w:id="117"/>
-    <w:bookmarkStart w:id="118" w:name="Xe09053a4b15961d792bf4e2a1366cfe6b0be545"/>
+    <w:bookmarkEnd w:id="118"/>
+    <w:bookmarkStart w:id="119" w:name="Xe09053a4b15961d792bf4e2a1366cfe6b0be545"/>
     <w:p>
       <w:pPr>
         <w:pStyle w:val="Heading2"/>
@@ -30091,8 +30910,8 @@
         </w:tc>
       </w:tr>
     </w:tbl>
-    <w:bookmarkEnd w:id="118"/>
-    <w:bookmarkStart w:id="119" w:name="Xb4b017eff690ec81289855a6f366e3e2cd31006"/>
+    <w:bookmarkEnd w:id="119"/>
+    <w:bookmarkStart w:id="120" w:name="Xb4b017eff690ec81289855a6f366e3e2cd31006"/>
     <w:p>
       <w:pPr>
         <w:pStyle w:val="Heading2"/>
@@ -30137,8 +30956,8 @@
         <w:t xml:space="preserve">Minh hoạ giá trị của chia tập theo thời gian và đánh giá trung thực trên bài toán chuỗi thời gian thực tế.</w:t>
       </w:r>
     </w:p>
-    <w:bookmarkEnd w:id="119"/>
-    <w:bookmarkStart w:id="120" w:name="X080e680f55be20fb44d6215757e74b24bb06c53"/>
+    <w:bookmarkEnd w:id="120"/>
+    <w:bookmarkStart w:id="121" w:name="X080e680f55be20fb44d6215757e74b24bb06c53"/>
     <w:p>
       <w:pPr>
         <w:pStyle w:val="Heading2"/>
@@ -30202,8 +31021,8 @@
         <w:t xml:space="preserve">Dùng như số liệu thống kê chính thức của cơ quan quản lý giao thông.</w:t>
       </w:r>
     </w:p>
-    <w:bookmarkEnd w:id="120"/>
-    <w:bookmarkStart w:id="121" w:name="Xcd3ad135c6e1fbf77091284952a3eb031c97455"/>
+    <w:bookmarkEnd w:id="121"/>
+    <w:bookmarkStart w:id="122" w:name="Xcd3ad135c6e1fbf77091284952a3eb031c97455"/>
     <w:p>
       <w:pPr>
         <w:pStyle w:val="Heading2"/>
@@ -30571,35 +31390,101 @@
         </w:numPr>
       </w:pPr>
       <w:r>
-        <w:t xml:space="preserve">Ở</w:t>
-      </w:r>
-      <w:r>
-        <w:t xml:space="preserve"> </w:t>
-      </w:r>
-      <w:r>
-        <w:rPr>
-          <w:b/>
-          <w:bCs/>
-        </w:rPr>
-        <w:t xml:space="preserve">giờ đêm</w:t>
-      </w:r>
-      <w:r>
-        <w:t xml:space="preserve"> </w:t>
-      </w:r>
-      <w:r>
-        <w:t xml:space="preserve">(00:00–04:00, 22:00–23:00) baseline lại tốt hơn Ridge (ví dụ 03:00: baseline</w:t>
-      </w:r>
-      <w:r>
-        <w:t xml:space="preserve"> </w:t>
-      </w:r>
-      <w:r>
-        <w:t xml:space="preserve">31,14 so với Ridge 142,14) → Ridge không phải lựa chọn tối ưu cho mọi khung giờ. Chi tiết ở</w:t>
-      </w:r>
-      <w:r>
-        <w:t xml:space="preserve"> </w:t>
-      </w:r>
-      <w:r>
-        <w:t xml:space="preserve">§10.7.</w:t>
+        <w:rPr>
+          <w:b/>
+          <w:bCs/>
+        </w:rPr>
+        <w:t xml:space="preserve">Đầu vào thời tiết là thời tiết QUAN SÁT tại đúng giờ đó</w:t>
+      </w:r>
+      <w:r>
+        <w:t xml:space="preserve">, không phải thời tiết dự báo. Khi</w:t>
+      </w:r>
+      <w:r>
+        <w:t xml:space="preserve"> </w:t>
+      </w:r>
+      <w:r>
+        <w:t xml:space="preserve">triển khai dự báo thật cho tương lai, phải dùng</w:t>
+      </w:r>
+      <w:r>
+        <w:t xml:space="preserve"> </w:t>
+      </w:r>
+      <w:r>
+        <w:rPr>
+          <w:b/>
+          <w:bCs/>
+        </w:rPr>
+        <w:t xml:space="preserve">thời tiết dự báo</w:t>
+      </w:r>
+      <w:r>
+        <w:t xml:space="preserve">, và</w:t>
+      </w:r>
+      <w:r>
+        <w:t xml:space="preserve"> </w:t>
+      </w:r>
+      <w:r>
+        <w:rPr>
+          <w:b/>
+          <w:bCs/>
+        </w:rPr>
+        <w:t xml:space="preserve">sai số dự báo thời</w:t>
+      </w:r>
+      <w:r>
+        <w:rPr>
+          <w:b/>
+          <w:bCs/>
+        </w:rPr>
+        <w:t xml:space="preserve"> </w:t>
+      </w:r>
+      <w:r>
+        <w:rPr>
+          <w:b/>
+          <w:bCs/>
+        </w:rPr>
+        <w:t xml:space="preserve">tiết sẽ cộng thêm vào sai số của mô hình</w:t>
+      </w:r>
+      <w:r>
+        <w:t xml:space="preserve"> </w:t>
+      </w:r>
+      <w:r>
+        <w:t xml:space="preserve">này. Mô hình</w:t>
+      </w:r>
+      <w:r>
+        <w:t xml:space="preserve"> </w:t>
+      </w:r>
+      <w:r>
+        <w:rPr>
+          <w:b/>
+          <w:bCs/>
+        </w:rPr>
+        <w:t xml:space="preserve">chưa</w:t>
+      </w:r>
+      <w:r>
+        <w:t xml:space="preserve"> </w:t>
+      </w:r>
+      <w:r>
+        <w:t xml:space="preserve">được đánh giá với thời tiết dự</w:t>
+      </w:r>
+      <w:r>
+        <w:t xml:space="preserve"> </w:t>
+      </w:r>
+      <w:r>
+        <w:t xml:space="preserve">báo, nên mọi số liệu MAE/RMSE ở trên là</w:t>
+      </w:r>
+      <w:r>
+        <w:t xml:space="preserve"> </w:t>
+      </w:r>
+      <w:r>
+        <w:rPr>
+          <w:b/>
+          <w:bCs/>
+        </w:rPr>
+        <w:t xml:space="preserve">cận dưới</w:t>
+      </w:r>
+      <w:r>
+        <w:t xml:space="preserve"> </w:t>
+      </w:r>
+      <w:r>
+        <w:t xml:space="preserve">của sai số trong điều kiện vận hành thật.</w:t>
       </w:r>
     </w:p>
     <w:p>
@@ -30611,72 +31496,35 @@
         </w:numPr>
       </w:pPr>
       <w:r>
-        <w:rPr>
-          <w:b/>
-          <w:bCs/>
-        </w:rPr>
-        <w:t xml:space="preserve">Dự báo thô âm</w:t>
-      </w:r>
-      <w:r>
-        <w:t xml:space="preserve"> </w:t>
-      </w:r>
-      <w:r>
-        <w:t xml:space="preserve">ở 34/6.533 dòng của FINAL TEST (đều giờ 0–4 ban đêm, 32/34 là ngày lễ, thấp</w:t>
-      </w:r>
-      <w:r>
-        <w:t xml:space="preserve"> </w:t>
-      </w:r>
-      <w:r>
-        <w:t xml:space="preserve">nhất −911,35). API chặn về 0 theo policy</w:t>
-      </w:r>
-      <w:r>
-        <w:t xml:space="preserve"> </w:t>
-      </w:r>
-      <w:r>
-        <w:rPr>
-          <w:rStyle w:val="VerbatimChar"/>
-        </w:rPr>
-        <w:t xml:space="preserve">max(0, ·)</w:t>
-      </w:r>
-      <w:r>
-        <w:t xml:space="preserve"> </w:t>
-      </w:r>
-      <w:r>
-        <w:t xml:space="preserve">và báo cờ</w:t>
-      </w:r>
-      <w:r>
-        <w:t xml:space="preserve"> </w:t>
-      </w:r>
-      <w:r>
-        <w:rPr>
-          <w:rStyle w:val="VerbatimChar"/>
-        </w:rPr>
-        <w:t xml:space="preserve">clipped_to_zero</w:t>
-      </w:r>
-      <w:r>
-        <w:t xml:space="preserve">; số liệu ở</w:t>
-      </w:r>
-      <w:r>
-        <w:t xml:space="preserve"> </w:t>
-      </w:r>
-      <w:r>
-        <w:t xml:space="preserve">§14.5 tính trên dự báo</w:t>
-      </w:r>
-      <w:r>
-        <w:t xml:space="preserve"> </w:t>
-      </w:r>
-      <w:r>
-        <w:rPr>
-          <w:b/>
-          <w:bCs/>
-        </w:rPr>
-        <w:t xml:space="preserve">thô</w:t>
-      </w:r>
-      <w:r>
-        <w:t xml:space="preserve"> </w:t>
-      </w:r>
-      <w:r>
-        <w:t xml:space="preserve">(MAE 259,73), sau khi chặn là 257,54.</w:t>
+        <w:t xml:space="preserve">Ở</w:t>
+      </w:r>
+      <w:r>
+        <w:t xml:space="preserve"> </w:t>
+      </w:r>
+      <w:r>
+        <w:rPr>
+          <w:b/>
+          <w:bCs/>
+        </w:rPr>
+        <w:t xml:space="preserve">giờ đêm</w:t>
+      </w:r>
+      <w:r>
+        <w:t xml:space="preserve"> </w:t>
+      </w:r>
+      <w:r>
+        <w:t xml:space="preserve">(00:00–04:00, 22:00–23:00) baseline lại tốt hơn Ridge (ví dụ 03:00: baseline</w:t>
+      </w:r>
+      <w:r>
+        <w:t xml:space="preserve"> </w:t>
+      </w:r>
+      <w:r>
+        <w:t xml:space="preserve">31,14 so với Ridge 142,14) → Ridge không phải lựa chọn tối ưu cho mọi khung giờ. Chi tiết ở</w:t>
+      </w:r>
+      <w:r>
+        <w:t xml:space="preserve"> </w:t>
+      </w:r>
+      <w:r>
+        <w:t xml:space="preserve">§10.7.</w:t>
       </w:r>
     </w:p>
     <w:p>
@@ -30692,47 +31540,68 @@
           <w:b/>
           <w:bCs/>
         </w:rPr>
-        <w:t xml:space="preserve">Hiệu ưu thế so với baseline không nhất quán theo thời gian.</w:t>
-      </w:r>
-      <w:r>
-        <w:t xml:space="preserve"> </w:t>
-      </w:r>
-      <w:r>
-        <w:t xml:space="preserve">Trên 2018 Ridge thắng</w:t>
-      </w:r>
-      <w:r>
-        <w:t xml:space="preserve"> </w:t>
-      </w:r>
-      <w:r>
-        <w:t xml:space="preserve">13,16 MAE (CI 95 % [+3,80; +22,00]); trên 3/4 cửa sổ dev 2012–2017 Ridge</w:t>
-      </w:r>
-      <w:r>
-        <w:t xml:space="preserve"> </w:t>
-      </w:r>
-      <w:r>
-        <w:rPr>
-          <w:b/>
-          <w:bCs/>
-        </w:rPr>
-        <w:t xml:space="preserve">thua</w:t>
-      </w:r>
-      <w:r>
-        <w:t xml:space="preserve"> </w:t>
-      </w:r>
-      <w:r>
-        <w:t xml:space="preserve">baseline</w:t>
-      </w:r>
-      <w:r>
-        <w:t xml:space="preserve"> </w:t>
-      </w:r>
-      <w:r>
-        <w:t xml:space="preserve">với khoảng tin cậy nằm hẳn về phía baseline (§9.3). Mô hình chỉ đáng tin hơn khi tập</w:t>
-      </w:r>
-      <w:r>
-        <w:t xml:space="preserve"> </w:t>
-      </w:r>
-      <w:r>
-        <w:t xml:space="preserve">huấn luyện đủ dày.</w:t>
+        <w:t xml:space="preserve">Dự báo thô âm</w:t>
+      </w:r>
+      <w:r>
+        <w:t xml:space="preserve"> </w:t>
+      </w:r>
+      <w:r>
+        <w:t xml:space="preserve">ở 34/6.533 dòng của FINAL TEST (đều giờ 0–4 ban đêm, 32/34 là ngày lễ, thấp</w:t>
+      </w:r>
+      <w:r>
+        <w:t xml:space="preserve"> </w:t>
+      </w:r>
+      <w:r>
+        <w:t xml:space="preserve">nhất −911,35). API chặn về 0 theo policy</w:t>
+      </w:r>
+      <w:r>
+        <w:t xml:space="preserve"> </w:t>
+      </w:r>
+      <w:r>
+        <w:rPr>
+          <w:rStyle w:val="VerbatimChar"/>
+        </w:rPr>
+        <w:t xml:space="preserve">max(0, ·)</w:t>
+      </w:r>
+      <w:r>
+        <w:t xml:space="preserve"> </w:t>
+      </w:r>
+      <w:r>
+        <w:t xml:space="preserve">và báo cờ</w:t>
+      </w:r>
+      <w:r>
+        <w:t xml:space="preserve"> </w:t>
+      </w:r>
+      <w:r>
+        <w:rPr>
+          <w:rStyle w:val="VerbatimChar"/>
+        </w:rPr>
+        <w:t xml:space="preserve">clipped_to_zero</w:t>
+      </w:r>
+      <w:r>
+        <w:t xml:space="preserve">; số liệu ở</w:t>
+      </w:r>
+      <w:r>
+        <w:t xml:space="preserve"> </w:t>
+      </w:r>
+      <w:r>
+        <w:t xml:space="preserve">§14.5 tính trên dự báo</w:t>
+      </w:r>
+      <w:r>
+        <w:t xml:space="preserve"> </w:t>
+      </w:r>
+      <w:r>
+        <w:rPr>
+          <w:b/>
+          <w:bCs/>
+        </w:rPr>
+        <w:t xml:space="preserve">thô</w:t>
+      </w:r>
+      <w:r>
+        <w:t xml:space="preserve"> </w:t>
+      </w:r>
+      <w:r>
+        <w:t xml:space="preserve">(MAE 259,73), sau khi chặn là 257,54.</w:t>
       </w:r>
     </w:p>
     <w:p>
@@ -30748,6 +31617,62 @@
           <w:b/>
           <w:bCs/>
         </w:rPr>
+        <w:t xml:space="preserve">Hiệu ưu thế so với baseline không nhất quán theo thời gian.</w:t>
+      </w:r>
+      <w:r>
+        <w:t xml:space="preserve"> </w:t>
+      </w:r>
+      <w:r>
+        <w:t xml:space="preserve">Trên 2018 Ridge thắng</w:t>
+      </w:r>
+      <w:r>
+        <w:t xml:space="preserve"> </w:t>
+      </w:r>
+      <w:r>
+        <w:t xml:space="preserve">13,16 MAE (CI 95 % [+3,80; +22,00]); trên 3/4 cửa sổ dev 2012–2017 Ridge</w:t>
+      </w:r>
+      <w:r>
+        <w:t xml:space="preserve"> </w:t>
+      </w:r>
+      <w:r>
+        <w:rPr>
+          <w:b/>
+          <w:bCs/>
+        </w:rPr>
+        <w:t xml:space="preserve">thua</w:t>
+      </w:r>
+      <w:r>
+        <w:t xml:space="preserve"> </w:t>
+      </w:r>
+      <w:r>
+        <w:t xml:space="preserve">baseline</w:t>
+      </w:r>
+      <w:r>
+        <w:t xml:space="preserve"> </w:t>
+      </w:r>
+      <w:r>
+        <w:t xml:space="preserve">với khoảng tin cậy nằm hẳn về phía baseline (§9.3). Mô hình chỉ đáng tin hơn khi tập</w:t>
+      </w:r>
+      <w:r>
+        <w:t xml:space="preserve"> </w:t>
+      </w:r>
+      <w:r>
+        <w:t xml:space="preserve">huấn luyện đủ dày.</w:t>
+      </w:r>
+    </w:p>
+    <w:p>
+      <w:pPr>
+        <w:pStyle w:val="Compact"/>
+        <w:numPr>
+          <w:ilvl w:val="0"/>
+          <w:numId w:val="1024"/>
+        </w:numPr>
+      </w:pPr>
+      <w:r>
+        <w:rPr>
+          <w:b/>
+          <w:bCs/>
+        </w:rPr>
         <w:t xml:space="preserve">Hiệu chuẩn L2 gần như không có tác dụng.</w:t>
       </w:r>
       <w:r>
@@ -30837,8 +31762,8 @@
         <w:t xml:space="preserve">vì FINAL TEST đã bị xem — đổi bây giờ là test-informed model selection.</w:t>
       </w:r>
     </w:p>
-    <w:bookmarkEnd w:id="121"/>
-    <w:bookmarkStart w:id="122" w:name="X24911cc652e48ef06c72a054df9c3d8a7ddfad4"/>
+    <w:bookmarkEnd w:id="122"/>
+    <w:bookmarkStart w:id="123" w:name="X24911cc652e48ef06c72a054df9c3d8a7ddfad4"/>
     <w:p>
       <w:pPr>
         <w:pStyle w:val="Heading2"/>
@@ -31094,8 +32019,8 @@
         <w:t xml:space="preserve">và negative prediction thành limitation.</w:t>
       </w:r>
     </w:p>
-    <w:bookmarkEnd w:id="122"/>
-    <w:bookmarkStart w:id="123" w:name="X8878001a0a13f457750e2973035e19caa739d55"/>
+    <w:bookmarkEnd w:id="123"/>
+    <w:bookmarkStart w:id="124" w:name="X8878001a0a13f457750e2973035e19caa739d55"/>
     <w:p>
       <w:pPr>
         <w:pStyle w:val="Heading2"/>
@@ -31199,7 +32124,7 @@
         <w:t xml:space="preserve"> </w:t>
       </w:r>
       <w:r>
-        <w:t xml:space="preserve">— 385 test (</w:t>
+        <w:t xml:space="preserve">— 392 test (</w:t>
       </w:r>
       <w:r>
         <w:rPr>
@@ -31279,9 +32204,9 @@
         </w:pict>
       </w:r>
     </w:p>
-    <w:bookmarkEnd w:id="123"/>
     <w:bookmarkEnd w:id="124"/>
-    <w:bookmarkStart w:id="125" w:name="Xea1ab71867dca1be6a495e6ec8d8d7ee4bb7cc1"/>
+    <w:bookmarkEnd w:id="125"/>
+    <w:bookmarkStart w:id="126" w:name="Xea1ab71867dca1be6a495e6ec8d8d7ee4bb7cc1"/>
     <w:p>
       <w:pPr>
         <w:pStyle w:val="Heading1"/>
@@ -31295,7 +32220,7 @@
         <w:pStyle w:val="FirstParagraph"/>
       </w:pPr>
       <w:r>
-        <w:t xml:space="preserve">Danh sách đầy đủ 12 hạn chế nằm ở</w:t>
+        <w:t xml:space="preserve">Danh sách đầy đủ 13 hạn chế nằm ở</w:t>
       </w:r>
       <w:r>
         <w:t xml:space="preserve"> </w:t>
@@ -31444,7 +32369,51 @@
         <w:t xml:space="preserve"> </w:t>
       </w:r>
       <w:r>
-        <w:t xml:space="preserve">— không dùng cho mục đích safety-critical.</w:t>
+        <w:t xml:space="preserve">— không dùng cho mục đích safety-critical. Ngoài ra, vì đầu vào</w:t>
+      </w:r>
+      <w:r>
+        <w:t xml:space="preserve"> </w:t>
+      </w:r>
+      <w:r>
+        <w:t xml:space="preserve">là</w:t>
+      </w:r>
+      <w:r>
+        <w:t xml:space="preserve"> </w:t>
+      </w:r>
+      <w:r>
+        <w:rPr>
+          <w:b/>
+          <w:bCs/>
+        </w:rPr>
+        <w:t xml:space="preserve">thời tiết quan sát</w:t>
+      </w:r>
+      <w:r>
+        <w:t xml:space="preserve"> </w:t>
+      </w:r>
+      <w:r>
+        <w:t xml:space="preserve">(không phải thời tiết dự báo), sai số thời tiết dự báo sẽ</w:t>
+      </w:r>
+      <w:r>
+        <w:t xml:space="preserve"> </w:t>
+      </w:r>
+      <w:r>
+        <w:rPr>
+          <w:b/>
+          <w:bCs/>
+        </w:rPr>
+        <w:t xml:space="preserve">cộng thêm</w:t>
+      </w:r>
+      <w:r>
+        <w:t xml:space="preserve"> </w:t>
+      </w:r>
+      <w:r>
+        <w:t xml:space="preserve">vào</w:t>
+      </w:r>
+      <w:r>
+        <w:t xml:space="preserve"> </w:t>
+      </w:r>
+      <w:r>
+        <w:t xml:space="preserve">sai số mô hình khi vận hành thật (§14.8, hạn chế 9).</w:t>
       </w:r>
     </w:p>
     <w:p>
@@ -31454,8 +32423,8 @@
         </w:pict>
       </w:r>
     </w:p>
-    <w:bookmarkEnd w:id="125"/>
-    <w:bookmarkStart w:id="129" w:name="X70753ca4a9a8e0a75d9fba2cc15c756ce4fe62c"/>
+    <w:bookmarkEnd w:id="126"/>
+    <w:bookmarkStart w:id="130" w:name="X70753ca4a9a8e0a75d9fba2cc15c756ce4fe62c"/>
     <w:p>
       <w:pPr>
         <w:pStyle w:val="Heading1"/>
@@ -31464,7 +32433,7 @@
         <w:t xml:space="preserve">16. Kết luận và hướng mở rộng</w:t>
       </w:r>
     </w:p>
-    <w:bookmarkStart w:id="126" w:name="X19a6beb4c8deaa2207436d38469a6087410dc80"/>
+    <w:bookmarkStart w:id="127" w:name="X19a6beb4c8deaa2207436d38469a6087410dc80"/>
     <w:p>
       <w:pPr>
         <w:pStyle w:val="Heading2"/>
@@ -31694,11 +32663,11 @@
         <w:t xml:space="preserve"> </w:t>
       </w:r>
       <w:r>
-        <w:t xml:space="preserve">chỉ trích chỉ số tổng; web/API chạy được, chỉ nạp artifact, 385 test pass.</w:t>
-      </w:r>
-    </w:p>
-    <w:bookmarkEnd w:id="126"/>
-    <w:bookmarkStart w:id="127" w:name="X6a8575c6d25516dc9769921161d7c02f72178ff"/>
+        <w:t xml:space="preserve">chỉ trích chỉ số tổng; web/API chạy được, chỉ nạp artifact, 392 test pass.</w:t>
+      </w:r>
+    </w:p>
+    <w:bookmarkEnd w:id="127"/>
+    <w:bookmarkStart w:id="128" w:name="X6a8575c6d25516dc9769921161d7c02f72178ff"/>
     <w:p>
       <w:pPr>
         <w:pStyle w:val="Heading2"/>
@@ -31978,8 +32947,8 @@
         </w:tc>
       </w:tr>
     </w:tbl>
-    <w:bookmarkEnd w:id="127"/>
-    <w:bookmarkStart w:id="128" w:name="X72a909352003f6790a10db4790cb1ffb2143c7a"/>
+    <w:bookmarkEnd w:id="128"/>
+    <w:bookmarkStart w:id="129" w:name="X72a909352003f6790a10db4790cb1ffb2143c7a"/>
     <w:p>
       <w:pPr>
         <w:pStyle w:val="Heading2"/>
@@ -32149,9 +33118,9 @@
         </w:pict>
       </w:r>
     </w:p>
-    <w:bookmarkEnd w:id="128"/>
     <w:bookmarkEnd w:id="129"/>
-    <w:bookmarkStart w:id="138" w:name="Xb8e034bbfdc5269bc2b3f9ba7cba3dbc85ff006"/>
+    <w:bookmarkEnd w:id="130"/>
+    <w:bookmarkStart w:id="139" w:name="Xb8e034bbfdc5269bc2b3f9ba7cba3dbc85ff006"/>
     <w:p>
       <w:pPr>
         <w:pStyle w:val="Heading1"/>
@@ -32160,7 +33129,7 @@
         <w:t xml:space="preserve">17. Phụ lục</w:t>
       </w:r>
     </w:p>
-    <w:bookmarkStart w:id="130" w:name="Xf823874050472b5724f6496cde7e79002f5be2b"/>
+    <w:bookmarkStart w:id="131" w:name="Xf823874050472b5724f6496cde7e79002f5be2b"/>
     <w:p>
       <w:pPr>
         <w:pStyle w:val="Heading2"/>
@@ -32258,11 +33227,11 @@
         <w:rPr>
           <w:rStyle w:val="VerbatimChar"/>
         </w:rPr>
-        <w:t xml:space="preserve">tests/      385 test</w:t>
-      </w:r>
-    </w:p>
-    <w:bookmarkEnd w:id="130"/>
-    <w:bookmarkStart w:id="131" w:name="Xfde5bfb2a8525405898d752159e12ba1b561f47"/>
+        <w:t xml:space="preserve">tests/      392 test</w:t>
+      </w:r>
+    </w:p>
+    <w:bookmarkEnd w:id="131"/>
+    <w:bookmarkStart w:id="132" w:name="Xfde5bfb2a8525405898d752159e12ba1b561f47"/>
     <w:p>
       <w:pPr>
         <w:pStyle w:val="Heading2"/>
@@ -32703,8 +33672,8 @@
         <w:t xml:space="preserve">.</w:t>
       </w:r>
     </w:p>
-    <w:bookmarkEnd w:id="131"/>
-    <w:bookmarkStart w:id="132" w:name="Xf2f7485d70beffd103f971a7922053b05c3ecf6"/>
+    <w:bookmarkEnd w:id="132"/>
+    <w:bookmarkStart w:id="133" w:name="Xf2f7485d70beffd103f971a7922053b05c3ecf6"/>
     <w:p>
       <w:pPr>
         <w:pStyle w:val="Heading2"/>
@@ -33084,8 +34053,8 @@
         </w:tc>
       </w:tr>
     </w:tbl>
-    <w:bookmarkEnd w:id="132"/>
-    <w:bookmarkStart w:id="133" w:name="X879c20bd81f773563360b51d1c8c8dc0e01066d"/>
+    <w:bookmarkEnd w:id="133"/>
+    <w:bookmarkStart w:id="134" w:name="X879c20bd81f773563360b51d1c8c8dc0e01066d"/>
     <w:p>
       <w:pPr>
         <w:pStyle w:val="Heading2"/>
@@ -33417,7 +34386,7 @@
               <w:pStyle w:val="Compact"/>
             </w:pPr>
             <w:r>
-              <w:t xml:space="preserve">FastAPI + 3 màn hình + 385 test + tài liệu + bản phát hành</w:t>
+              <w:t xml:space="preserve">FastAPI + 3 màn hình + 392 test + tài liệu + bản phát hành</w:t>
             </w:r>
           </w:p>
         </w:tc>
@@ -33502,8 +34471,8 @@
         </w:tc>
       </w:tr>
     </w:tbl>
-    <w:bookmarkEnd w:id="133"/>
-    <w:bookmarkStart w:id="134" w:name="Xce7bbfc5ef721651c4e0972c8d194748eea111a"/>
+    <w:bookmarkEnd w:id="134"/>
+    <w:bookmarkStart w:id="135" w:name="Xce7bbfc5ef721651c4e0972c8d194748eea111a"/>
     <w:p>
       <w:pPr>
         <w:pStyle w:val="Heading2"/>
@@ -33910,7 +34879,7 @@
               <w:pStyle w:val="Compact"/>
             </w:pPr>
             <w:r>
-              <w:t xml:space="preserve">12 slide, 4 ảnh thật</w:t>
+              <w:t xml:space="preserve">11 slide, 4 ảnh thật</w:t>
             </w:r>
           </w:p>
         </w:tc>
@@ -34052,8 +35021,8 @@
         <w:t xml:space="preserve">đáp án, và 10 câu bổ sung).</w:t>
       </w:r>
     </w:p>
-    <w:bookmarkEnd w:id="134"/>
-    <w:bookmarkStart w:id="136" w:name="X662ca9157d20a2cc4af1bb6a47ef2df7bda09ac"/>
+    <w:bookmarkEnd w:id="135"/>
+    <w:bookmarkStart w:id="137" w:name="X662ca9157d20a2cc4af1bb6a47ef2df7bda09ac"/>
     <w:p>
       <w:pPr>
         <w:pStyle w:val="Heading2"/>
@@ -34066,11 +35035,11 @@
       <w:pPr>
         <w:pStyle w:val="Heading3"/>
       </w:pPr>
-      <w:bookmarkStart w:id="135" w:name="Xfadda7d3cc3c70c4b2c1a5cb5bb6bcf7e4a5e28"/>
+      <w:bookmarkStart w:id="136" w:name="Xfadda7d3cc3c70c4b2c1a5cb5bb6bcf7e4a5e28"/>
       <w:r>
         <w:t xml:space="preserve">⚠ CẦN NGƯỜI DÙNG ĐIỀN TRƯỚC KHI NỘP</w:t>
       </w:r>
-      <w:bookmarkEnd w:id="135"/>
+      <w:bookmarkEnd w:id="136"/>
     </w:p>
     <w:p>
       <w:pPr>
@@ -34363,8 +35332,8 @@
         <w:t xml:space="preserve">tạo commit giả cho người khác, không backdate commit.</w:t>
       </w:r>
     </w:p>
-    <w:bookmarkEnd w:id="136"/>
-    <w:bookmarkStart w:id="137" w:name="X3b7b8bb8a50e825a47a258ce08df0e6b8d32a9b"/>
+    <w:bookmarkEnd w:id="137"/>
+    <w:bookmarkStart w:id="138" w:name="X3b7b8bb8a50e825a47a258ce08df0e6b8d32a9b"/>
     <w:p>
       <w:pPr>
         <w:pStyle w:val="Heading2"/>
@@ -34594,8 +35563,8 @@
         <w:t xml:space="preserve">artifact, nên tài liệu không thể lệch số mà không bị test bắt.</w:t>
       </w:r>
     </w:p>
-    <w:bookmarkEnd w:id="137"/>
     <w:bookmarkEnd w:id="138"/>
+    <w:bookmarkEnd w:id="139"/>
     <w:sectPr>
       <w:footnotePr>
         <w:numRestart w:val="eachSect"/>

</xml_diff>